<commit_message>
Round-1 review revision applied (bootstrap inference, Pearson Forbes-Rigobon, portfolio CIs, surrogates); vendor proofreading and stop-slop skills
Co-Authored-By: Claude Opus 5.5 <noreply@anthropic.com>
Claude-Session: https://claude.ai/code/session_01Qq7x1vqifuGojcDRAnNitB
</commit_message>
<xml_diff>
--- a/Python for Algorithmic Trading/NCKH/Bài stock toán/submission/final_APFM/Co_movement_manuscript_APFM_final.docx
+++ b/Python for Algorithmic Trading/NCKH/Bài stock toán/submission/final_APFM/Co_movement_manuscript_APFM_final.docx
@@ -53,7 +53,7 @@
           <w:sz w:val="24"/>
           <w:szCs w:val="24"/>
         </w:rPr>
-        <w:t xml:space="preserve">Asset allocators in emerging Southeast Asian markets frequently treat large-cap and broad-market indices as separate diversification instruments, even in nested architectures where large-cap stocks dominate the broader market. Standard risk models thereby conflate mechanical constituent overlap with genuine economic co-movement. Utilizing Detrended Cross-Correlation Analysis (DCCA) and its multifractal extension on 30-minute, 1-hour, 4-hour and daily data from the Ho Chi Minh City Stock Exchange (2014–2025), this study illustrates that near-perfect correlations among nested indices (0.975–0.980) primarily reflect shared capitalization rather than cross-tier interdependence. Purging constituent overlap with a capitalization-weighted mid-cap proxy lowers the correlation with large caps by 0.086–0.096. Furthermore, at intraday frequencies this co-movement tends to strengthen over longer holding horizons as microstructure frictions resolve and information diffuses throughout the market. Raw cross-tier correlation rises from 0.63 to 0.93 in high-volatility regimes, but Forbes–Rigobon volatility conditioning shows that the rise is explained by volatility expansion, indicating interdependence rather than contagion. Consequently, static models overstate mid-cap portfolio variance by up to 15.6% during calm market regimes and understate it during turbulent regimes. These research findings highlight the imperative for independent mid-cap benchmarks and volatility-regime-sensitive risk budgeting across the capital markets of the Association of Southeast Asian Nations (ASEAN).</w:t>
+        <w:t xml:space="preserve">Asset allocators in emerging Southeast Asian markets frequently treat large-cap and broad-market indices as separate diversification instruments, even in nested architectures where large-cap stocks dominate the broader market. Standard risk models thereby conflate mechanical constituent overlap with genuine economic co-movement. Utilizing Detrended Cross-Correlation Analysis (DCCA) and its multifractal extension on 30-minute, 1-hour, 4-hour and daily data from the Ho Chi Minh City Stock Exchange (2014–2025), this study illustrates that shared capitalization inflates the near-perfect correlations among nested indices (0.975–0.980). Purging constituent overlap with a capitalization-weighted mid-cap proxy lowers the correlation with large caps by 0.086–0.096, with block-bootstrap intervals that exclude zero at every frequency, although the purged correlation remains high (about 0.88). Correlations involving the broad market rise with the horizon at the 30-minute and 1-hour frequencies, whereas the purged mid-cap correlation shows no significant horizon dependence. Raw cross-tier correlation rises from 0.73 to 0.93 in high-volatility regimes, but after Forbes–Rigobon volatility conditioning there is no evidence of a structural increase, consistent with interdependence rather than contagion. Consequently, a static correlation overstates in-sample mid-cap portfolio variance by 2.2–9.4% in calm regimes and understates it by about 2% in turbulent regimes. These findings support independent mid-cap benchmarks and volatility-regime-sensitive risk budgeting in Vietnam, and they motivate tests in other markets of the Association of Southeast Asian Nations (ASEAN) with nested index architectures.</w:t>
       </w:r>
     </w:p>
     <w:p>
@@ -137,7 +137,7 @@
         <w:rPr>
           <w:rFonts w:hint="cs"/>
         </w:rPr>
-        <w:t xml:space="preserve">Portfolio managers and institutional asset allocators in emerging equity markets frequently construct multi-capitalization portfolios under the assumption that large-cap and mid-cap stock indices serve as independent diversification instruments. In empirical practice, risk models, asset allocation algorithms, and regulatory stress-testing frameworks routinely parameterize cross-asset dependence using a single static Pearson correlation coefficient estimated from daily closing prices </w:t>
+        <w:t xml:space="preserve">Portfolio managers and institutional asset allocators in emerging equity markets frequently construct multi-capitalization portfolios under the assumption that large-cap and mid-cap stock indices serve as independent diversification instruments. Many risk models, asset allocation algorithms and stress-testing frameworks parameterize cross-asset dependence using a single static Pearson correlation coefficient estimated from daily closing prices </w:t>
       </w:r>
       <w:r>
         <w:rPr>
@@ -201,8 +201,14 @@
     </w:p>
     <w:p>
       <w:pPr>
-        <w:jc w:val="both"/>
-      </w:pPr>
+        <w:jc w:val="center"/>
+      </w:pPr>
+      <w:r>
+        <w:t xml:space="preserve">VN30 ⊂ VN100 ⊂ VNINDEX.</w:t>
+      </w:r>
+      <w:r>
+        <w:t xml:space="preserve"> (1)</w:t>
+      </w:r>
     </w:p>
     <w:p>
       <w:pPr>
@@ -317,7 +323,7 @@
         <w:rPr>
           <w:rFonts w:hint="cs"/>
         </w:rPr>
-        <w:t xml:space="preserve">. Building on Detrended Fluctuation Analysis </w:t>
+        <w:t xml:space="preserve">. Building on Detrended Fluctuation Analysis (Peng et al. 1994) and its multifractal generalization (Kantelhardt et al. 2002)</w:t>
       </w:r>
       <w:r>
         <w:rPr>
@@ -341,7 +347,7 @@
         <w:rPr>
           <w:rFonts w:hint="cs"/>
         </w:rPr>
-        <w:t>(Kantelhardt et al. 2002)</w:t>
+        <w:t xml:space="preserve"/>
       </w:r>
       <w:r>
         <w:rPr>
@@ -535,13 +541,13 @@
         <w:t>enuine economic transmission coexist</w:t>
       </w:r>
       <w:r>
-        <w:t>, remain</w:t>
-      </w:r>
-      <w:r>
-        <w:t xml:space="preserve"> an unaddressed </w:t>
-      </w:r>
-      <w:r>
-        <w:t xml:space="preserve">empirical issue.</w:t>
+        <w:t xml:space="preserve">, remain comparatively underexplored.</w:t>
+      </w:r>
+      <w:r>
+        <w:t xml:space="preserve"/>
+      </w:r>
+      <w:r>
+        <w:t xml:space="preserve"/>
       </w:r>
     </w:p>
     <w:p>
@@ -644,7 +650,7 @@
         <w:rPr>
           <w:rFonts w:hint="cs"/>
         </w:rPr>
-        <w:t xml:space="preserve"> (2002) showed that unadjusted sample correlations increase mechanically with market volatility, so that an observed correlation surge may reflect volatility expansion rather than a structural change in cross-market linkages. At intraday intervals, this dynamic intersects with the Epps (1979) effect, where non-synchronous transactions and quote delays depress short-horizon correlations. In parallel, gradual information diffusion models </w:t>
+        <w:t xml:space="preserve"> (2002) showed that unadjusted sample correlations increase mechanically with market volatility, so that an observed correlation surge may reflect volatility expansion rather than a structural change in cross-market linkages. At intraday intervals, this dynamic intersects with the Epps (1979) effect, where non-synchronous transactions and quote delays depress short-horizon correlations. In parallel, gradual information diffusion (Hong and Stein 1999) implies that news is incorporated into prices with a delay, so co-movement between securities that are repriced at different speeds can rise with the horizon.</w:t>
       </w:r>
       <w:r>
         <w:rPr>
@@ -668,7 +674,7 @@
         <w:rPr>
           <w:rFonts w:hint="cs"/>
         </w:rPr>
-        <w:t>(Hong and Stein 1999)</w:t>
+        <w:t xml:space="preserve"/>
       </w:r>
       <w:r>
         <w:rPr>
@@ -680,19 +686,19 @@
         <w:rPr>
           <w:rFonts w:hint="cs"/>
         </w:rPr>
-        <w:t xml:space="preserve"> suggest that market-wide news shocks are incorporated rapidly into liquid large</w:t>
+        <w:t xml:space="preserve"/>
       </w:r>
       <w:r>
         <w:rPr>
           <w:lang w:val="vi-VN"/>
         </w:rPr>
-        <w:t xml:space="preserve"> </w:t>
-      </w:r>
-      <w:r>
-        <w:rPr>
-          <w:rFonts w:hint="cs"/>
-        </w:rPr>
-        <w:t xml:space="preserve">caps before diffusing into less liquid mid-caps. Recent empirical evidence from Vietnam confirms that retail dominance and liquidity constraints generate delayed price adjustments and nonlinear volatility spillovers </w:t>
+        <w:t xml:space="preserve"/>
+      </w:r>
+      <w:r>
+        <w:rPr>
+          <w:rFonts w:hint="cs"/>
+        </w:rPr>
+        <w:t xml:space="preserve"> Recent evidence from Vietnam points to delayed price adjustment under retail-heavy participation (Tran and Tran 2025) and to nonlinear dependence on regional markets (Le et al. 2025).</w:t>
       </w:r>
       <w:r>
         <w:rPr>
@@ -716,16 +722,16 @@
         <w:rPr>
           <w:rFonts w:hint="cs"/>
         </w:rPr>
-        <w:t>(</w:t>
-      </w:r>
-      <w:r>
-        <w:t>Le et al. 2025; Tran and Tran 2025</w:t>
-      </w:r>
-      <w:r>
-        <w:rPr>
-          <w:rFonts w:hint="cs"/>
-        </w:rPr>
-        <w:t>)</w:t>
+        <w:t xml:space="preserve"/>
+      </w:r>
+      <w:r>
+        <w:t xml:space="preserve"/>
+      </w:r>
+      <w:r>
+        <w:rPr>
+          <w:rFonts w:hint="cs"/>
+        </w:rPr>
+        <w:t xml:space="preserve"/>
       </w:r>
       <w:r>
         <w:rPr>
@@ -737,7 +743,7 @@
         <w:rPr>
           <w:rFonts w:hint="cs"/>
         </w:rPr>
-        <w:t>.</w:t>
+        <w:t xml:space="preserve"/>
       </w:r>
     </w:p>
     <w:p>
@@ -753,7 +759,7 @@
         <w:rPr>
           <w:rFonts w:hint="cs"/>
         </w:rPr>
-        <w:t xml:space="preserve">Regional studies show that financial integration across ASEAN equity markets is time-varying and shaped by trade linkages, market volatility and external shocks (Karim and Ning 2013; Lean and Teng 2013). While mature regional platforms such as Bursa Malaysia provide market-completeness mechanisms such as Regulated Short Selling (RSS) and Intraday Short Selling (IDSS) to facilitate continuous cross-tier arbitrage, Vietnam’s HOSE operates under strict statutory prohibitions on cash short selling. We frame this structural contrast as an institutional comparative hypothesis regarding how trading restrictions interact with multiscale price synchronization.</w:t>
+        <w:t xml:space="preserve">Regional studies show that financial integration across ASEAN equity markets is time-varying and shaped by trade linkages, market volatility and external shocks (Karim and Ning 2013; Lean and Teng 2013). Unlike markets that permit regulated short selling, Vietnam’s HOSE prohibits cash short selling, so we treat the role of trading restrictions in multiscale price synchronization as a hypothesis for comparative work rather than as a tested result.</w:t>
       </w:r>
     </w:p>
     <w:p>
@@ -811,7 +817,7 @@
         <w:jc w:val="both"/>
       </w:pPr>
       <w:r>
-        <w:t xml:space="preserve">Firstly, we map the overlap distortion in nested benchmark systems. While headline large-cap and broad-market indices exhibit near-perfect cross-correlations (0.975–0.980) across intraday and daily intervals, this apparent co-movement falls by 0.086–0.096 correlation points once shared capitalization is extracted through a market-weighted mid-cap proxy. We further show that, at the 30-minute frequency, the purged cross-tier dependence tends to increase with the investment horizon (significantly over the full scale range and with the same sign over the reliable range), consistent with the resolution of intraday microstructure frictions and the gradual diffusion of market-wide information.</w:t>
+        <w:t xml:space="preserve">Firstly, we quantify the overlap distortion in nested benchmark systems. Headline large-cap and broad-market indices exhibit near-perfect cross-correlations (0.975–0.980) at all frequencies, and extracting shared capitalization through a market-weighted mid-cap proxy lowers the correlation with large caps by 0.086–0.096, a gap whose bootstrap confidence intervals exclude zero at every frequency. Correlations involving the broad market rise with the horizon at the 30-minute and 1-hour frequencies, whereas the purged mid-cap correlation is statistically flat across horizons.</w:t>
       </w:r>
     </w:p>
     <w:p>
@@ -824,7 +830,7 @@
         <w:jc w:val="both"/>
       </w:pPr>
       <w:r>
-        <w:t xml:space="preserve">Secondly, we provide a volatility-conditioned evaluation of crisis dynamics. Raw cross-tier correlations tighten by up to 0.30 correlation points in high-volatility regimes, which would conventionally be read as a correlation breakdown. Applying the Forbes and Rigobon (2002) adjustment under two regime definitions, we show that the adjusted crisis correlation never significantly exceeds its calm-period level. Mid-cap diversification failure during Vietnamese market stress therefore reflects interdependence amplified by volatility rather than a structural change in cross-tier transmission.</w:t>
+        <w:t xml:space="preserve">Secondly, we provide a volatility-conditioned evaluation of crisis dynamics. Raw cross-tier correlations tighten by up to 0.20 correlation points in high-volatility regimes, which would conventionally be read as a correlation breakdown. Applying the Forbes and Rigobon (2002) adjustment under two regime definitions with block-bootstrap inference, we find no evidence that the adjusted crisis correlation exceeds its calm-period level. Mid-cap diversification failure during Vietnamese market stress is therefore consistent with interdependence amplified by volatility, although the test cannot exclude small structural increases.</w:t>
       </w:r>
     </w:p>
     <w:p>
@@ -837,7 +843,7 @@
         <w:jc w:val="both"/>
       </w:pPr>
       <w:r>
-        <w:t xml:space="preserve">Thirdly, we quantify the risk-management cost of static correlations. Cash portfolios formed from parent and child indices suffer variance misstatements of at most 2.7% because their constituents overlap, whereas for a dedicated mid-cap exposure a static correlation overstates portfolio variance by up to 15.6% in calm regimes and understates it by about 2% in turbulent regimes, when volatility itself has multiplied. Given the statutory prohibition on cash short selling in Vietnam, the synthetic mid-cap construct serves as a practical shadow benchmark for risk attribution, stress testing and index-product development.</w:t>
+        <w:t xml:space="preserve">Thirdly, we quantify the risk-management cost of static correlations. Cash portfolios formed from parent and child indices suffer in-sample variance misstatements of at most 2.4%, whereas for a mid-cap factor exposure a static correlation overstates portfolio variance by 2.2–9.4% in calm regimes and understates it by about 2% in turbulent regimes, when volatility itself has multiplied. Because short selling is prohibited, the non-investable mid-cap construct serves as a shadow benchmark for risk attribution, stress testing and index-product development.</w:t>
       </w:r>
     </w:p>
     <w:p>
@@ -850,7 +856,7 @@
         <w:jc w:val="both"/>
       </w:pPr>
       <w:r>
-        <w:t xml:space="preserve">The remainder of the paper is organized as follows. Section 1.1 describes the current situation and institutional background of the HOSE. Section 2 presents the data and methods, Section 3 reports the results, including multiscale scaling and robustness checks, and Section 4 discusses the findings and concludes.</w:t>
+        <w:t xml:space="preserve">The remainder of the paper is organized as follows. Section 1.1 describes the current situation and institutional background of the HOSE. Section 2 presents the data and methods, Section 3 reports the results and robustness checks, and Section 4 discusses the findings, their implications and limitations, and concludes.</w:t>
       </w:r>
     </w:p>
     <w:p>
@@ -914,7 +920,7 @@
         <w:rPr>
           <w:rFonts w:hint="cs"/>
         </w:rPr>
-        <w:t>The primary microstructure constraint is the symmetric daily price fluctuation band of ±7% relative to the previous session’s reference price. During sharp market corrections, heavily sold equities frequently hit lower limits, causing liquidity to freeze. This price collar truncates empirical return tails, is associated with artificial serial correlation, and coincides with mechanical spikes in cross-correlations as multiple index constituents are locked at the limit.</w:t>
+        <w:t xml:space="preserve">The primary microstructure constraint is the symmetric daily price fluctuation band of ±7% relative to the previous session’s reference price. During sharp market corrections, heavily sold equities frequently hit lower limits, causing liquidity to freeze. This price collar truncates return tails and can induce serial correlation and synchronized limit hits across index constituents.</w:t>
       </w:r>
     </w:p>
     <w:p>
@@ -933,16 +939,16 @@
         <w:rPr>
           <w:rFonts w:hint="cs"/>
         </w:rPr>
-        <w:t xml:space="preserve"> second structural feature is the settlement cycle. Throughout </w:t>
-      </w:r>
-      <w:r>
-        <w:t>most</w:t>
-      </w:r>
-      <w:r>
-        <w:rPr>
-          <w:rFonts w:hint="cs"/>
-        </w:rPr>
-        <w:t xml:space="preserve"> of our sample period, equities purchased on the HOSE could not be sold until the afternoon of the second business day. This settlement delay restricts intraday statistical arbitrage, preventing high-frequency traders from eliminating </w:t>
+        <w:t xml:space="preserve"> second structural feature is the settlement cycle. Under the T+2 cycle in force for most of the sample, equities purchased on the HOSE could not be sold before the afternoon of the second business day.</w:t>
+      </w:r>
+      <w:r>
+        <w:t xml:space="preserve"/>
+      </w:r>
+      <w:r>
+        <w:rPr>
+          <w:rFonts w:hint="cs"/>
+        </w:rPr>
+        <w:t xml:space="preserve"> This settlement delay restricts intraday statistical arbitrage, preventing high-frequency traders from eliminating </w:t>
       </w:r>
       <w:r>
         <w:t>the</w:t>
@@ -1044,7 +1050,7 @@
         <w:jc w:val="both"/>
       </w:pPr>
       <w:r>
-        <w:t xml:space="preserve">The dataset comprises closing prices of three HOSE indices exported from TradingView (exchange: HOSE) for January 27, 2014, to December 12, 2025: the flagship VN30 index, comprising the 30 largest and most liquid stocks screened for free-float capitalization; the VN100 index, which combines the VN30 constituents with the next 70 largest liquid stocks (the constituents of the VNMIDCAP, or VN70, index); and the composite VNINDEX, which covers all common stocks listed on the HOSE. Because a VNMIDCAP price history is not available from our data source for the full sample and all frequencies, the mid-cap segment is recovered from VN100 and VN30 by the decomposition in Section 2.2.</w:t>
+        <w:t xml:space="preserve">The dataset comprises closing prices of three HOSE indices exported from TradingView (exchange: HOSE) for January 27, 2014, to December 12, 2025: the flagship VN30 index, comprising the 30 largest and most liquid stocks screened for free-float capitalization; the VN100 index, which combines the VN30 constituents with the next 70 largest liquid stocks (the constituents of the VNMIDCAP, or VN70, index); and the composite VNINDEX, which covers all common stocks listed on the HOSE and is weighted by full market capitalization. Because a VNMIDCAP price history is not available from our data source for the full sample and all frequencies, the mid-cap segment is recovered from VN100 and VN30 by the decomposition in Section 2.2.</w:t>
       </w:r>
     </w:p>
     <w:p>
@@ -1057,7 +1063,7 @@
         <w:jc w:val="both"/>
       </w:pPr>
       <w:r>
-        <w:t xml:space="preserve">The analysis evaluates four trading frequencies: 30-minute (M30), 1-hour (H1), 4-hour (H4) and daily (1D). To guarantee simultaneity and prevent alignment bias, the index series were synchronized by exact inner joins on timestamps, and log returns were computed as:</w:t>
+        <w:t xml:space="preserve">The analysis evaluates four trading frequencies: 30-minute (M30), 1-hour (H1), 4-hour (H4) and daily (1D). To guarantee simultaneity and prevent alignment bias, the index series were synchronized by exact inner joins on timestamps, and log returns were computed as below; no index price was filled or interpolated:</w:t>
       </w:r>
     </w:p>
     <w:p>
@@ -1201,6 +1207,9 @@
           </m:r>
         </m:oMath>
       </m:oMathPara>
+      <w:r>
+        <w:t xml:space="preserve"> (2)</w:t>
+      </w:r>
     </w:p>
     <w:p>
       <w:pPr>
@@ -1299,7 +1308,7 @@
         <w:rPr>
           <w:rFonts w:hint="cs"/>
         </w:rPr>
-        <w:t xml:space="preserve">The first definition uses continuous chronological crisis episodes. To avoid arbitrary selection, an episode must satisfy three conditions: (i) a peak-to-trough VNINDEX drawdown of more than 25%; (ii) at least 45% of its trading days in the top quartile of the rolling-volatility distribution; and (iii) a documented macro-financial trigger. Three episodes qualify: the 2018 margin contraction (January–December 2018; drawdown 26.2%, 47% of days in the top quartile), the 2020 COVID-19 shock (January–June 2020; 33.5%, 52%) and the 2022 corporate bond liquidity freeze (April–November 2022; 40.2%, 60%), totaling 539 crisis trading days. The calm benchmark comprises 2016–2017 and 2023–2024 (1,000 trading days). Transient spikes, such as the May 2014 South China Sea standoff (drawdown 14.8%) and the April 2025 tariff shock (18.1%), fail conditions (i) and (ii). The second definition sorts all days by rolling volatility, classifying days below the 25th percentile (10.6% annualized) as low-volatility and days above the 75th percentile (20.0%) as high-volatility.</w:t>
+        <w:t xml:space="preserve">The first definition uses continuous chronological crisis episodes. To avoid arbitrary selection, an episode must satisfy three conditions: (i) a peak-to-trough VNINDEX drawdown of more than 25%; (ii) at least 45% of its trading days in the top quartile of the rolling-volatility distribution; and (iii) a documented macro-financial trigger. Three episodes qualify: the 2018 margin contraction (January–December 2018, including the run-up to the April peak; drawdown 26.2%, 47% of days in the top quartile), the 2020 COVID-19 shock (January–June 2020; 33.5%, 52%) and the 2022 corporate bond liquidity freeze (April–November 2022; 40.2%, 60%), totaling 539 crisis trading days. The calm benchmark comprises 2016–2017 and 2023–2024 (1,000 trading days). Transient spikes, such as the May 2014 South China Sea standoff (drawdown 14.8%) and the April 2025 tariff shock (18.1%), fail conditions (i) and (ii). The second definition sorts all days by rolling volatility, classifying days below the 25th percentile (10.6% annualized) as low-volatility and days above the 75th percentile (20.0%) as high-volatility.</w:t>
       </w:r>
     </w:p>
     <w:p>
@@ -1931,6 +1940,9 @@
           </m:r>
         </m:oMath>
       </m:oMathPara>
+      <w:r>
+        <w:t xml:space="preserve"> (3)</w:t>
+      </w:r>
     </w:p>
     <w:p>
       <w:pPr>
@@ -3366,6 +3378,9 @@
           </m:r>
         </m:oMath>
       </m:oMathPara>
+      <w:r>
+        <w:t xml:space="preserve"> (4)</w:t>
+      </w:r>
     </w:p>
     <w:p>
       <w:pPr>
@@ -3656,6 +3671,9 @@
           </m:r>
         </m:oMath>
       </m:oMathPara>
+      <w:r>
+        <w:t xml:space="preserve"> (5)</w:t>
+      </w:r>
     </w:p>
     <w:p>
       <w:pPr>
@@ -4250,6 +4268,9 @@
           </m:r>
         </m:oMath>
       </m:oMathPara>
+      <w:r>
+        <w:t xml:space="preserve"> (6)</w:t>
+      </w:r>
     </w:p>
     <w:p>
       <w:pPr>
@@ -4376,300 +4397,6 @@
           <w:rFonts w:hint="cs"/>
         </w:rPr>
         <w:t xml:space="preserve"> denotes the univariate root-mean-square fluctuation function.</w:t>
-      </w:r>
-    </w:p>
-    <w:p>
-      <w:pPr>
-        <w:jc w:val="both"/>
-      </w:pPr>
-      <w:r>
-        <w:rPr>
-          <w:rFonts w:hint="cs"/>
-        </w:rPr>
-        <w:t xml:space="preserve">To verify whether the observed co-movement at timescale </w:t>
-      </w:r>
-      <w:r>
-        <w:rPr>
-          <w:rFonts w:hint="cs"/>
-          <w:i/>
-        </w:rPr>
-        <w:t>s</w:t>
-      </w:r>
-      <w:r>
-        <w:rPr>
-          <w:rFonts w:hint="cs"/>
-        </w:rPr>
-        <w:t xml:space="preserve"> statistically exceeds random cross-sectional noise, we test the null hypothesis of cross-sectional independence (H</w:t>
-      </w:r>
-      <w:r>
-        <w:rPr>
-          <w:rFonts w:hint="cs"/>
-          <w:vertAlign w:val="subscript"/>
-        </w:rPr>
-        <w:t>0</w:t>
-      </w:r>
-      <w:r>
-        <w:rPr>
-          <w:rFonts w:hint="cs"/>
-        </w:rPr>
-        <w:t xml:space="preserve">: </w:t>
-      </w:r>
-      <w:proofErr w:type="spellStart"/>
-      <w:r>
-        <w:rPr>
-          <w:rFonts w:hint="cs"/>
-          <w:i/>
-        </w:rPr>
-        <w:t>ρ</w:t>
-      </w:r>
-      <w:r>
-        <w:rPr>
-          <w:rFonts w:hint="cs"/>
-          <w:vertAlign w:val="subscript"/>
-        </w:rPr>
-        <w:t>DCCA</w:t>
-      </w:r>
-      <w:proofErr w:type="spellEnd"/>
-      <w:r>
-        <w:rPr>
-          <w:rFonts w:hint="cs"/>
-        </w:rPr>
-        <w:t>(</w:t>
-      </w:r>
-      <w:r>
-        <w:rPr>
-          <w:rFonts w:hint="cs"/>
-          <w:i/>
-        </w:rPr>
-        <w:t>s</w:t>
-      </w:r>
-      <w:r>
-        <w:rPr>
-          <w:rFonts w:hint="cs"/>
-        </w:rPr>
-        <w:t>) = 0) using the Podobnik et al. (2011) test statistic:</w:t>
-      </w:r>
-    </w:p>
-    <w:p>
-      <w:pPr>
-        <w:spacing w:line="300" w:lineRule="auto"/>
-        <w:jc w:val="both"/>
-        <w:rPr>
-          <w:i/>
-        </w:rPr>
-      </w:pPr>
-      <m:oMathPara>
-        <m:oMathParaPr>
-          <m:jc m:val="center"/>
-        </m:oMathParaPr>
-        <m:oMath>
-          <m:r>
-            <w:rPr>
-              <w:rFonts w:ascii="Cambria Math" w:hAnsi="Cambria Math" w:hint="cs"/>
-            </w:rPr>
-            <m:t>t(s)=</m:t>
-          </m:r>
-          <m:f>
-            <m:fPr>
-              <m:ctrlPr>
-                <w:rPr>
-                  <w:rFonts w:ascii="Cambria Math" w:hAnsi="Cambria Math" w:hint="cs"/>
-                  <w:i/>
-                  <w:lang w:eastAsia="zh-CN"/>
-                </w:rPr>
-              </m:ctrlPr>
-            </m:fPr>
-            <m:num>
-              <m:sSub>
-                <m:sSubPr>
-                  <m:ctrlPr>
-                    <w:rPr>
-                      <w:rFonts w:ascii="Cambria Math" w:hAnsi="Cambria Math" w:hint="cs"/>
-                      <w:i/>
-                      <w:lang w:eastAsia="zh-CN"/>
-                    </w:rPr>
-                  </m:ctrlPr>
-                </m:sSubPr>
-                <m:e>
-                  <m:r>
-                    <w:rPr>
-                      <w:rFonts w:ascii="Cambria Math" w:hAnsi="Cambria Math" w:hint="cs"/>
-                    </w:rPr>
-                    <m:t>ρ</m:t>
-                  </m:r>
-                </m:e>
-                <m:sub>
-                  <m:r>
-                    <w:rPr>
-                      <w:rFonts w:ascii="Cambria Math" w:hAnsi="Cambria Math" w:hint="cs"/>
-                    </w:rPr>
-                    <m:t>DCCA</m:t>
-                  </m:r>
-                </m:sub>
-              </m:sSub>
-              <m:r>
-                <w:rPr>
-                  <w:rFonts w:ascii="Cambria Math" w:hAnsi="Cambria Math" w:hint="cs"/>
-                </w:rPr>
-                <m:t>(s)</m:t>
-              </m:r>
-              <m:rad>
-                <m:radPr>
-                  <m:degHide m:val="1"/>
-                  <m:ctrlPr>
-                    <w:rPr>
-                      <w:rFonts w:ascii="Cambria Math" w:hAnsi="Cambria Math" w:hint="cs"/>
-                      <w:i/>
-                      <w:lang w:eastAsia="zh-CN"/>
-                    </w:rPr>
-                  </m:ctrlPr>
-                </m:radPr>
-                <m:deg/>
-                <m:e>
-                  <m:r>
-                    <w:rPr>
-                      <w:rFonts w:ascii="Cambria Math" w:hAnsi="Cambria Math" w:hint="cs"/>
-                    </w:rPr>
-                    <m:t>N-s-2</m:t>
-                  </m:r>
-                </m:e>
-              </m:rad>
-            </m:num>
-            <m:den>
-              <m:rad>
-                <m:radPr>
-                  <m:degHide m:val="1"/>
-                  <m:ctrlPr>
-                    <w:rPr>
-                      <w:rFonts w:ascii="Cambria Math" w:hAnsi="Cambria Math" w:hint="cs"/>
-                      <w:i/>
-                      <w:lang w:eastAsia="zh-CN"/>
-                    </w:rPr>
-                  </m:ctrlPr>
-                </m:radPr>
-                <m:deg/>
-                <m:e>
-                  <m:r>
-                    <w:rPr>
-                      <w:rFonts w:ascii="Cambria Math" w:hAnsi="Cambria Math" w:hint="cs"/>
-                    </w:rPr>
-                    <m:t>1-</m:t>
-                  </m:r>
-                  <m:sSubSup>
-                    <m:sSubSupPr>
-                      <m:ctrlPr>
-                        <w:rPr>
-                          <w:rFonts w:ascii="Cambria Math" w:hAnsi="Cambria Math" w:hint="cs"/>
-                          <w:i/>
-                          <w:lang w:eastAsia="zh-CN"/>
-                        </w:rPr>
-                      </m:ctrlPr>
-                    </m:sSubSupPr>
-                    <m:e>
-                      <m:r>
-                        <w:rPr>
-                          <w:rFonts w:ascii="Cambria Math" w:hAnsi="Cambria Math" w:hint="cs"/>
-                        </w:rPr>
-                        <m:t>ρ</m:t>
-                      </m:r>
-                    </m:e>
-                    <m:sub>
-                      <m:r>
-                        <w:rPr>
-                          <w:rFonts w:ascii="Cambria Math" w:hAnsi="Cambria Math" w:hint="cs"/>
-                        </w:rPr>
-                        <m:t>DCCA</m:t>
-                      </m:r>
-                    </m:sub>
-                    <m:sup>
-                      <m:r>
-                        <w:rPr>
-                          <w:rFonts w:ascii="Cambria Math" w:hAnsi="Cambria Math" w:hint="cs"/>
-                        </w:rPr>
-                        <m:t>2</m:t>
-                      </m:r>
-                    </m:sup>
-                  </m:sSubSup>
-                  <m:r>
-                    <w:rPr>
-                      <w:rFonts w:ascii="Cambria Math" w:hAnsi="Cambria Math" w:hint="cs"/>
-                    </w:rPr>
-                    <m:t>(s)</m:t>
-                  </m:r>
-                </m:e>
-              </m:rad>
-            </m:den>
-          </m:f>
-          <m:r>
-            <w:rPr>
-              <w:rFonts w:ascii="Cambria Math" w:hAnsi="Cambria Math" w:hint="cs"/>
-            </w:rPr>
-            <m:t>,</m:t>
-          </m:r>
-        </m:oMath>
-      </m:oMathPara>
-    </w:p>
-    <w:p>
-      <w:pPr>
-        <w:spacing w:line="300" w:lineRule="auto"/>
-        <w:jc w:val="both"/>
-        <w:rPr>
-          <w:lang w:val="vi-VN"/>
-        </w:rPr>
-      </w:pPr>
-      <w:r>
-        <w:rPr>
-          <w:rFonts w:hint="cs"/>
-        </w:rPr>
-        <w:t xml:space="preserve">which follows a </w:t>
-      </w:r>
-      <w:proofErr w:type="gramStart"/>
-      <w:r>
-        <w:rPr>
-          <w:rFonts w:hint="cs"/>
-        </w:rPr>
-        <w:t>Student</w:t>
-      </w:r>
-      <w:proofErr w:type="gramEnd"/>
-      <w:r>
-        <w:rPr>
-          <w:rFonts w:hint="cs"/>
-        </w:rPr>
-        <w:t>-</w:t>
-      </w:r>
-      <m:oMath>
-        <m:r>
-          <m:rPr>
-            <m:sty m:val="p"/>
-          </m:rPr>
-          <w:rPr>
-            <w:rFonts w:ascii="Cambria Math" w:hAnsi="Cambria Math" w:hint="cs"/>
-          </w:rPr>
-          <m:t>t</m:t>
-        </m:r>
-      </m:oMath>
-      <w:r>
-        <w:rPr>
-          <w:rFonts w:hint="cs"/>
-        </w:rPr>
-        <w:t xml:space="preserve"> distribution with </w:t>
-      </w:r>
-      <m:oMath>
-        <m:r>
-          <m:rPr>
-            <m:sty m:val="p"/>
-          </m:rPr>
-          <w:rPr>
-            <w:rFonts w:ascii="Cambria Math" w:hAnsi="Cambria Math" w:hint="cs"/>
-          </w:rPr>
-          <m:t>N-s-2</m:t>
-        </m:r>
-      </m:oMath>
-      <w:r>
-        <w:rPr>
-          <w:rFonts w:hint="cs"/>
-        </w:rPr>
-        <w:t xml:space="preserve"> degrees of freedom under the null hypothesis (Podobnik et al. 2011).</w:t>
       </w:r>
     </w:p>
     <w:p>
@@ -5004,6 +4731,9 @@
           </m:r>
         </m:oMath>
       </m:oMathPara>
+      <w:r>
+        <w:t xml:space="preserve"> (7)</w:t>
+      </w:r>
     </w:p>
     <w:p>
       <w:pPr>
@@ -5311,6 +5041,9 @@
           </m:r>
         </m:oMath>
       </m:oMathPara>
+      <w:r>
+        <w:t xml:space="preserve"> (8)</w:t>
+      </w:r>
     </w:p>
     <w:p>
       <w:pPr>
@@ -5484,6 +5217,9 @@
       </w:r>
       <w:r>
         <w:t xml:space="preserve">).</w:t>
+      </w:r>
+      <w:r>
+        <w:t xml:space="preserve"> (9)</w:t>
       </w:r>
     </w:p>
     <w:p>
@@ -6243,6 +5979,9 @@
           </m:r>
         </m:oMath>
       </m:oMathPara>
+      <w:r>
+        <w:t xml:space="preserve"> (10)</w:t>
+      </w:r>
     </w:p>
     <w:p>
       <w:pPr>
@@ -7007,6 +6746,9 @@
           </m:r>
         </m:oMath>
       </m:oMathPara>
+      <w:r>
+        <w:t xml:space="preserve"> (11)</w:t>
+      </w:r>
     </w:p>
     <w:p>
       <w:pPr>
@@ -7429,6 +7171,9 @@
           </m:r>
         </m:oMath>
       </m:oMathPara>
+      <w:r>
+        <w:t xml:space="preserve"> (12)</w:t>
+      </w:r>
     </w:p>
     <w:p>
       <w:pPr>
@@ -7451,7 +7196,7 @@
         <w:rPr>
           <w:rFonts w:hint="cs"/>
         </w:rPr>
-        <w:t xml:space="preserve">–VN30, in which large-cap returns serve as the market benchmark and the purged mid-cap component shares no constituents with VN30. For nested pairs (VN30–VN100, VN30–VNINDEX and VN100–VNINDEX), the assumption is violated by construction because VN30 accounts for over two-thirds of VN100 capitalization, so conditioning formulas yield unidentified parameters. We therefore restrict the formal test of a structural correlation increase to the P</w:t>
+        <w:t xml:space="preserve">–VN30, in which large-cap returns serve as the market benchmark and the purged mid-cap component shares no constituents with VN30. For nested pairs (VN30–VN100, VN30–VNINDEX and VN100–VNINDEX), the assumption is violated by construction because VN30 accounts for over two-thirds of VN100 capitalization, so conditioning formulas yield unidentified parameters. Regime correlations are Pearson correlations of daily returns within each regime, and δ is the relative increase in the variance of VN30 returns, so that the correction and the correlation refer to the same measure. We restrict the formal test of a structural correlation increase to the P</w:t>
       </w:r>
       <w:r>
         <w:rPr>
@@ -7481,920 +7226,7 @@
         <w:rPr/>
       </w:pPr>
       <w:r>
-        <w:t>T</w:t>
-      </w:r>
-      <w:r>
-        <w:rPr>
-          <w:rFonts w:hint="cs"/>
-        </w:rPr>
-        <w:t>he formal hypothesis test</w:t>
-      </w:r>
-      <w:r>
-        <w:t xml:space="preserve"> is evaluated as follows:</w:t>
-      </w:r>
-    </w:p>
-    <w:p>
-      <w:pPr>
-        <w:jc w:val="both"/>
-      </w:pPr>
-      <w:r>
-        <w:rPr>
-          <w:rFonts w:hint="cs"/>
-        </w:rPr>
-        <w:t xml:space="preserve"/>
-      </w:r>
-      <m:oMath>
-        <m:sSub>
-          <m:sSubPr>
-            <m:ctrlPr>
-              <w:rPr>
-                <w:rFonts w:ascii="Cambria Math" w:hAnsi="Cambria Math" w:hint="cs"/>
-                <w:lang w:eastAsia="zh-CN"/>
-              </w:rPr>
-            </m:ctrlPr>
-          </m:sSubPr>
-          <m:e>
-            <m:r>
-              <m:rPr>
-                <m:sty m:val="p"/>
-              </m:rPr>
-              <w:rPr>
-                <w:rFonts w:ascii="Cambria Math" w:hAnsi="Cambria Math" w:hint="cs"/>
-              </w:rPr>
-              <m:t>H</m:t>
-            </m:r>
-          </m:e>
-          <m:sub>
-            <m:r>
-              <m:rPr>
-                <m:sty m:val="p"/>
-              </m:rPr>
-              <w:rPr>
-                <w:rFonts w:ascii="Cambria Math" w:hAnsi="Cambria Math" w:hint="cs"/>
-              </w:rPr>
-              <m:t>0</m:t>
-            </m:r>
-            <m:r>
-              <m:rPr>
-                <m:sty m:val="p"/>
-              </m:rPr>
-              <w:rPr>
-                <w:rFonts w:ascii="Cambria Math" w:hAnsi="Cambria Math"/>
-              </w:rPr>
-              <m:t xml:space="preserve"> </m:t>
-            </m:r>
-          </m:sub>
-        </m:sSub>
-        <m:r>
-          <m:rPr>
-            <m:sty m:val="p"/>
-          </m:rPr>
-          <w:rPr>
-            <w:rFonts w:ascii="Cambria Math" w:hAnsi="Cambria Math" w:hint="cs"/>
-          </w:rPr>
-          <m:t>:</m:t>
-        </m:r>
-        <m:sSup>
-          <m:sSupPr>
-            <m:ctrlPr>
-              <w:rPr>
-                <w:rFonts w:ascii="Cambria Math" w:hAnsi="Cambria Math" w:hint="cs"/>
-                <w:lang w:eastAsia="zh-CN"/>
-              </w:rPr>
-            </m:ctrlPr>
-          </m:sSupPr>
-          <m:e>
-            <m:r>
-              <m:rPr>
-                <m:sty m:val="p"/>
-              </m:rPr>
-              <w:rPr>
-                <w:rFonts w:ascii="Cambria Math" w:hAnsi="Cambria Math" w:hint="cs"/>
-              </w:rPr>
-              <m:t>ρ</m:t>
-            </m:r>
-          </m:e>
-          <m:sup>
-            <m:r>
-              <m:rPr>
-                <m:sty m:val="p"/>
-              </m:rPr>
-              <w:rPr>
-                <w:rFonts w:ascii="Cambria Math" w:hAnsi="Cambria Math" w:hint="cs"/>
-              </w:rPr>
-              <m:t>*</m:t>
-            </m:r>
-          </m:sup>
-        </m:sSup>
-        <m:r>
-          <m:rPr>
-            <m:sty m:val="p"/>
-          </m:rPr>
-          <w:rPr>
-            <w:rFonts w:ascii="Cambria Math" w:hAnsi="Cambria Math" w:hint="cs"/>
-          </w:rPr>
-          <m:t>≤</m:t>
-        </m:r>
-        <m:sSub>
-          <m:sSubPr>
-            <m:ctrlPr>
-              <w:rPr>
-                <w:rFonts w:ascii="Cambria Math" w:hAnsi="Cambria Math" w:hint="cs"/>
-                <w:lang w:eastAsia="zh-CN"/>
-              </w:rPr>
-            </m:ctrlPr>
-          </m:sSubPr>
-          <m:e>
-            <m:r>
-              <m:rPr>
-                <m:sty m:val="p"/>
-              </m:rPr>
-              <w:rPr>
-                <w:rFonts w:ascii="Cambria Math" w:hAnsi="Cambria Math" w:hint="cs"/>
-              </w:rPr>
-              <m:t>ρ</m:t>
-            </m:r>
-          </m:e>
-          <m:sub>
-            <m:r>
-              <m:rPr>
-                <m:sty m:val="p"/>
-              </m:rPr>
-              <w:rPr>
-                <w:rFonts w:ascii="Cambria Math" w:hAnsi="Cambria Math" w:hint="cs"/>
-              </w:rPr>
-              <m:t>low</m:t>
-            </m:r>
-          </m:sub>
-        </m:sSub>
-      </m:oMath>
-      <w:r>
-        <w:rPr>
-          <w:rFonts w:hint="cs"/>
-        </w:rPr>
-        <w:t xml:space="preserve"> versus </w:t>
-      </w:r>
-      <m:oMath>
-        <m:sSub>
-          <m:sSubPr>
-            <m:ctrlPr>
-              <w:rPr>
-                <w:rFonts w:ascii="Cambria Math" w:hAnsi="Cambria Math" w:hint="cs"/>
-                <w:lang w:eastAsia="zh-CN"/>
-              </w:rPr>
-            </m:ctrlPr>
-          </m:sSubPr>
-          <m:e>
-            <m:r>
-              <m:rPr>
-                <m:sty m:val="p"/>
-              </m:rPr>
-              <w:rPr>
-                <w:rFonts w:ascii="Cambria Math" w:hAnsi="Cambria Math" w:hint="cs"/>
-              </w:rPr>
-              <m:t>H</m:t>
-            </m:r>
-          </m:e>
-          <m:sub>
-            <m:r>
-              <m:rPr>
-                <m:sty m:val="p"/>
-              </m:rPr>
-              <w:rPr>
-                <w:rFonts w:ascii="Cambria Math" w:hAnsi="Cambria Math" w:hint="cs"/>
-              </w:rPr>
-              <m:t>1</m:t>
-            </m:r>
-          </m:sub>
-        </m:sSub>
-        <m:r>
-          <m:rPr>
-            <m:sty m:val="p"/>
-          </m:rPr>
-          <w:rPr>
-            <w:rFonts w:ascii="Cambria Math" w:hAnsi="Cambria Math" w:hint="cs"/>
-          </w:rPr>
-          <m:t>:</m:t>
-        </m:r>
-        <m:sSup>
-          <m:sSupPr>
-            <m:ctrlPr>
-              <w:rPr>
-                <w:rFonts w:ascii="Cambria Math" w:hAnsi="Cambria Math" w:hint="cs"/>
-                <w:lang w:eastAsia="zh-CN"/>
-              </w:rPr>
-            </m:ctrlPr>
-          </m:sSupPr>
-          <m:e>
-            <m:r>
-              <m:rPr>
-                <m:sty m:val="p"/>
-              </m:rPr>
-              <w:rPr>
-                <w:rFonts w:ascii="Cambria Math" w:hAnsi="Cambria Math" w:hint="cs"/>
-              </w:rPr>
-              <m:t>ρ</m:t>
-            </m:r>
-          </m:e>
-          <m:sup>
-            <m:r>
-              <m:rPr>
-                <m:sty m:val="p"/>
-              </m:rPr>
-              <w:rPr>
-                <w:rFonts w:ascii="Cambria Math" w:hAnsi="Cambria Math" w:hint="cs"/>
-              </w:rPr>
-              <m:t>*</m:t>
-            </m:r>
-          </m:sup>
-        </m:sSup>
-        <m:r>
-          <m:rPr>
-            <m:sty m:val="p"/>
-          </m:rPr>
-          <w:rPr>
-            <w:rFonts w:ascii="Cambria Math" w:hAnsi="Cambria Math" w:hint="cs"/>
-          </w:rPr>
-          <m:t>&gt;</m:t>
-        </m:r>
-        <m:sSub>
-          <m:sSubPr>
-            <m:ctrlPr>
-              <w:rPr>
-                <w:rFonts w:ascii="Cambria Math" w:hAnsi="Cambria Math" w:hint="cs"/>
-                <w:lang w:eastAsia="zh-CN"/>
-              </w:rPr>
-            </m:ctrlPr>
-          </m:sSubPr>
-          <m:e>
-            <m:r>
-              <m:rPr>
-                <m:sty m:val="p"/>
-              </m:rPr>
-              <w:rPr>
-                <w:rFonts w:ascii="Cambria Math" w:hAnsi="Cambria Math" w:hint="cs"/>
-              </w:rPr>
-              <m:t>ρ</m:t>
-            </m:r>
-          </m:e>
-          <m:sub>
-            <m:r>
-              <m:rPr>
-                <m:sty m:val="p"/>
-              </m:rPr>
-              <w:rPr>
-                <w:rFonts w:ascii="Cambria Math" w:hAnsi="Cambria Math" w:hint="cs"/>
-              </w:rPr>
-              <m:t>low</m:t>
-            </m:r>
-          </m:sub>
-        </m:sSub>
-      </m:oMath>
-      <w:r>
-        <w:rPr>
-          <w:rFonts w:hint="cs"/>
-        </w:rPr>
-        <w:t xml:space="preserve"> using the two-sample asymptotic standard error:</w:t>
-      </w:r>
-    </w:p>
-    <w:p>
-      <w:pPr>
-        <w:jc w:val="both"/>
-      </w:pPr>
-      <m:oMathPara>
-        <m:oMathParaPr>
-          <m:jc m:val="center"/>
-        </m:oMathParaPr>
-        <m:oMath>
-          <m:r>
-            <m:rPr>
-              <m:nor/>
-            </m:rPr>
-            <w:rPr>
-              <w:rFonts w:hint="cs"/>
-            </w:rPr>
-            <m:t>SE</m:t>
-          </m:r>
-          <m:r>
-            <m:rPr>
-              <m:sty m:val="p"/>
-            </m:rPr>
-            <w:rPr>
-              <w:rFonts w:ascii="Cambria Math" w:hAnsi="Cambria Math" w:hint="cs"/>
-            </w:rPr>
-            <m:t>(</m:t>
-          </m:r>
-          <m:sSup>
-            <m:sSupPr>
-              <m:ctrlPr>
-                <w:rPr>
-                  <w:rFonts w:ascii="Cambria Math" w:hAnsi="Cambria Math" w:hint="cs"/>
-                  <w:lang w:eastAsia="zh-CN"/>
-                </w:rPr>
-              </m:ctrlPr>
-            </m:sSupPr>
-            <m:e>
-              <m:r>
-                <m:rPr>
-                  <m:sty m:val="p"/>
-                </m:rPr>
-                <w:rPr>
-                  <w:rFonts w:ascii="Cambria Math" w:hAnsi="Cambria Math" w:hint="cs"/>
-                </w:rPr>
-                <m:t>ρ</m:t>
-              </m:r>
-            </m:e>
-            <m:sup>
-              <m:r>
-                <m:rPr>
-                  <m:sty m:val="p"/>
-                </m:rPr>
-                <w:rPr>
-                  <w:rFonts w:ascii="Cambria Math" w:hAnsi="Cambria Math" w:hint="cs"/>
-                </w:rPr>
-                <m:t>*</m:t>
-              </m:r>
-            </m:sup>
-          </m:sSup>
-          <m:r>
-            <m:rPr>
-              <m:sty m:val="p"/>
-            </m:rPr>
-            <w:rPr>
-              <w:rFonts w:ascii="Cambria Math" w:hAnsi="Cambria Math" w:hint="cs"/>
-            </w:rPr>
-            <m:t>-</m:t>
-          </m:r>
-          <m:sSub>
-            <m:sSubPr>
-              <m:ctrlPr>
-                <w:rPr>
-                  <w:rFonts w:ascii="Cambria Math" w:hAnsi="Cambria Math" w:hint="cs"/>
-                  <w:lang w:eastAsia="zh-CN"/>
-                </w:rPr>
-              </m:ctrlPr>
-            </m:sSubPr>
-            <m:e>
-              <m:r>
-                <m:rPr>
-                  <m:sty m:val="p"/>
-                </m:rPr>
-                <w:rPr>
-                  <w:rFonts w:ascii="Cambria Math" w:hAnsi="Cambria Math" w:hint="cs"/>
-                </w:rPr>
-                <m:t>ρ</m:t>
-              </m:r>
-            </m:e>
-            <m:sub>
-              <m:r>
-                <m:rPr>
-                  <m:sty m:val="p"/>
-                </m:rPr>
-                <w:rPr>
-                  <w:rFonts w:ascii="Cambria Math" w:hAnsi="Cambria Math" w:hint="cs"/>
-                </w:rPr>
-                <m:t>low</m:t>
-              </m:r>
-            </m:sub>
-          </m:sSub>
-          <m:r>
-            <m:rPr>
-              <m:sty m:val="p"/>
-            </m:rPr>
-            <w:rPr>
-              <w:rFonts w:ascii="Cambria Math" w:hAnsi="Cambria Math" w:hint="cs"/>
-            </w:rPr>
-            <m:t>)=</m:t>
-          </m:r>
-          <m:rad>
-            <m:radPr>
-              <m:degHide m:val="1"/>
-              <m:ctrlPr>
-                <w:rPr>
-                  <w:rFonts w:ascii="Cambria Math" w:hAnsi="Cambria Math" w:hint="cs"/>
-                  <w:lang w:eastAsia="zh-CN"/>
-                </w:rPr>
-              </m:ctrlPr>
-            </m:radPr>
-            <m:deg/>
-            <m:e>
-              <m:f>
-                <m:fPr>
-                  <m:ctrlPr>
-                    <w:rPr>
-                      <w:rFonts w:ascii="Cambria Math" w:hAnsi="Cambria Math" w:hint="cs"/>
-                      <w:lang w:eastAsia="zh-CN"/>
-                    </w:rPr>
-                  </m:ctrlPr>
-                </m:fPr>
-                <m:num>
-                  <m:r>
-                    <m:rPr>
-                      <m:sty m:val="p"/>
-                    </m:rPr>
-                    <w:rPr>
-                      <w:rFonts w:ascii="Cambria Math" w:hAnsi="Cambria Math" w:hint="cs"/>
-                    </w:rPr>
-                    <m:t>(1-(</m:t>
-                  </m:r>
-                  <m:sSup>
-                    <m:sSupPr>
-                      <m:ctrlPr>
-                        <w:rPr>
-                          <w:rFonts w:ascii="Cambria Math" w:hAnsi="Cambria Math" w:hint="cs"/>
-                          <w:lang w:eastAsia="zh-CN"/>
-                        </w:rPr>
-                      </m:ctrlPr>
-                    </m:sSupPr>
-                    <m:e>
-                      <m:r>
-                        <m:rPr>
-                          <m:sty m:val="p"/>
-                        </m:rPr>
-                        <w:rPr>
-                          <w:rFonts w:ascii="Cambria Math" w:hAnsi="Cambria Math" w:hint="cs"/>
-                        </w:rPr>
-                        <m:t>ρ</m:t>
-                      </m:r>
-                    </m:e>
-                    <m:sup>
-                      <m:r>
-                        <m:rPr>
-                          <m:sty m:val="p"/>
-                        </m:rPr>
-                        <w:rPr>
-                          <w:rFonts w:ascii="Cambria Math" w:hAnsi="Cambria Math" w:hint="cs"/>
-                        </w:rPr>
-                        <m:t>*</m:t>
-                      </m:r>
-                    </m:sup>
-                  </m:sSup>
-                  <m:sSup>
-                    <m:sSupPr>
-                      <m:ctrlPr>
-                        <w:rPr>
-                          <w:rFonts w:ascii="Cambria Math" w:hAnsi="Cambria Math" w:hint="cs"/>
-                          <w:lang w:eastAsia="zh-CN"/>
-                        </w:rPr>
-                      </m:ctrlPr>
-                    </m:sSupPr>
-                    <m:e>
-                      <m:r>
-                        <m:rPr>
-                          <m:sty m:val="p"/>
-                        </m:rPr>
-                        <w:rPr>
-                          <w:rFonts w:ascii="Cambria Math" w:hAnsi="Cambria Math" w:hint="cs"/>
-                        </w:rPr>
-                        <m:t>)</m:t>
-                      </m:r>
-                    </m:e>
-                    <m:sup>
-                      <m:r>
-                        <m:rPr>
-                          <m:sty m:val="p"/>
-                        </m:rPr>
-                        <w:rPr>
-                          <w:rFonts w:ascii="Cambria Math" w:hAnsi="Cambria Math" w:hint="cs"/>
-                        </w:rPr>
-                        <m:t>2</m:t>
-                      </m:r>
-                    </m:sup>
-                  </m:sSup>
-                  <m:sSup>
-                    <m:sSupPr>
-                      <m:ctrlPr>
-                        <w:rPr>
-                          <w:rFonts w:ascii="Cambria Math" w:hAnsi="Cambria Math" w:hint="cs"/>
-                          <w:lang w:eastAsia="zh-CN"/>
-                        </w:rPr>
-                      </m:ctrlPr>
-                    </m:sSupPr>
-                    <m:e>
-                      <m:r>
-                        <m:rPr>
-                          <m:sty m:val="p"/>
-                        </m:rPr>
-                        <w:rPr>
-                          <w:rFonts w:ascii="Cambria Math" w:hAnsi="Cambria Math" w:hint="cs"/>
-                        </w:rPr>
-                        <m:t>)</m:t>
-                      </m:r>
-                    </m:e>
-                    <m:sup>
-                      <m:r>
-                        <m:rPr>
-                          <m:sty m:val="p"/>
-                        </m:rPr>
-                        <w:rPr>
-                          <w:rFonts w:ascii="Cambria Math" w:hAnsi="Cambria Math" w:hint="cs"/>
-                        </w:rPr>
-                        <m:t>2</m:t>
-                      </m:r>
-                    </m:sup>
-                  </m:sSup>
-                </m:num>
-                <m:den>
-                  <m:sSub>
-                    <m:sSubPr>
-                      <m:ctrlPr>
-                        <w:rPr>
-                          <w:rFonts w:ascii="Cambria Math" w:hAnsi="Cambria Math" w:hint="cs"/>
-                          <w:lang w:eastAsia="zh-CN"/>
-                        </w:rPr>
-                      </m:ctrlPr>
-                    </m:sSubPr>
-                    <m:e>
-                      <m:r>
-                        <m:rPr>
-                          <m:sty m:val="p"/>
-                        </m:rPr>
-                        <w:rPr>
-                          <w:rFonts w:ascii="Cambria Math" w:hAnsi="Cambria Math" w:hint="cs"/>
-                        </w:rPr>
-                        <m:t>N</m:t>
-                      </m:r>
-                    </m:e>
-                    <m:sub>
-                      <m:r>
-                        <m:rPr>
-                          <m:sty m:val="p"/>
-                        </m:rPr>
-                        <w:rPr>
-                          <w:rFonts w:ascii="Cambria Math" w:hAnsi="Cambria Math" w:hint="cs"/>
-                        </w:rPr>
-                        <m:t>crisis</m:t>
-                      </m:r>
-                    </m:sub>
-                  </m:sSub>
-                </m:den>
-              </m:f>
-              <m:r>
-                <m:rPr>
-                  <m:sty m:val="p"/>
-                </m:rPr>
-                <w:rPr>
-                  <w:rFonts w:ascii="Cambria Math" w:hAnsi="Cambria Math" w:hint="cs"/>
-                </w:rPr>
-                <m:t>+</m:t>
-              </m:r>
-              <m:f>
-                <m:fPr>
-                  <m:ctrlPr>
-                    <w:rPr>
-                      <w:rFonts w:ascii="Cambria Math" w:hAnsi="Cambria Math" w:hint="cs"/>
-                      <w:lang w:eastAsia="zh-CN"/>
-                    </w:rPr>
-                  </m:ctrlPr>
-                </m:fPr>
-                <m:num>
-                  <m:r>
-                    <m:rPr>
-                      <m:sty m:val="p"/>
-                    </m:rPr>
-                    <w:rPr>
-                      <w:rFonts w:ascii="Cambria Math" w:hAnsi="Cambria Math" w:hint="cs"/>
-                    </w:rPr>
-                    <m:t>(1-</m:t>
-                  </m:r>
-                  <m:sSubSup>
-                    <m:sSubSupPr>
-                      <m:ctrlPr>
-                        <w:rPr>
-                          <w:rFonts w:ascii="Cambria Math" w:hAnsi="Cambria Math" w:hint="cs"/>
-                          <w:lang w:eastAsia="zh-CN"/>
-                        </w:rPr>
-                      </m:ctrlPr>
-                    </m:sSubSupPr>
-                    <m:e>
-                      <m:r>
-                        <m:rPr>
-                          <m:sty m:val="p"/>
-                        </m:rPr>
-                        <w:rPr>
-                          <w:rFonts w:ascii="Cambria Math" w:hAnsi="Cambria Math" w:hint="cs"/>
-                        </w:rPr>
-                        <m:t>ρ</m:t>
-                      </m:r>
-                    </m:e>
-                    <m:sub>
-                      <m:r>
-                        <m:rPr>
-                          <m:sty m:val="p"/>
-                        </m:rPr>
-                        <w:rPr>
-                          <w:rFonts w:ascii="Cambria Math" w:hAnsi="Cambria Math" w:hint="cs"/>
-                        </w:rPr>
-                        <m:t>low</m:t>
-                      </m:r>
-                    </m:sub>
-                    <m:sup>
-                      <m:r>
-                        <m:rPr>
-                          <m:sty m:val="p"/>
-                        </m:rPr>
-                        <w:rPr>
-                          <w:rFonts w:ascii="Cambria Math" w:hAnsi="Cambria Math" w:hint="cs"/>
-                        </w:rPr>
-                        <m:t>2</m:t>
-                      </m:r>
-                    </m:sup>
-                  </m:sSubSup>
-                  <m:sSup>
-                    <m:sSupPr>
-                      <m:ctrlPr>
-                        <w:rPr>
-                          <w:rFonts w:ascii="Cambria Math" w:hAnsi="Cambria Math" w:hint="cs"/>
-                          <w:lang w:eastAsia="zh-CN"/>
-                        </w:rPr>
-                      </m:ctrlPr>
-                    </m:sSupPr>
-                    <m:e>
-                      <m:r>
-                        <m:rPr>
-                          <m:sty m:val="p"/>
-                        </m:rPr>
-                        <w:rPr>
-                          <w:rFonts w:ascii="Cambria Math" w:hAnsi="Cambria Math" w:hint="cs"/>
-                        </w:rPr>
-                        <m:t>)</m:t>
-                      </m:r>
-                    </m:e>
-                    <m:sup>
-                      <m:r>
-                        <m:rPr>
-                          <m:sty m:val="p"/>
-                        </m:rPr>
-                        <w:rPr>
-                          <w:rFonts w:ascii="Cambria Math" w:hAnsi="Cambria Math" w:hint="cs"/>
-                        </w:rPr>
-                        <m:t>2</m:t>
-                      </m:r>
-                    </m:sup>
-                  </m:sSup>
-                </m:num>
-                <m:den>
-                  <m:sSub>
-                    <m:sSubPr>
-                      <m:ctrlPr>
-                        <w:rPr>
-                          <w:rFonts w:ascii="Cambria Math" w:hAnsi="Cambria Math" w:hint="cs"/>
-                          <w:lang w:eastAsia="zh-CN"/>
-                        </w:rPr>
-                      </m:ctrlPr>
-                    </m:sSubPr>
-                    <m:e>
-                      <m:r>
-                        <m:rPr>
-                          <m:sty m:val="p"/>
-                        </m:rPr>
-                        <w:rPr>
-                          <w:rFonts w:ascii="Cambria Math" w:hAnsi="Cambria Math" w:hint="cs"/>
-                        </w:rPr>
-                        <m:t>N</m:t>
-                      </m:r>
-                    </m:e>
-                    <m:sub>
-                      <m:r>
-                        <m:rPr>
-                          <m:sty m:val="p"/>
-                        </m:rPr>
-                        <w:rPr>
-                          <w:rFonts w:ascii="Cambria Math" w:hAnsi="Cambria Math" w:hint="cs"/>
-                        </w:rPr>
-                        <m:t>calm</m:t>
-                      </m:r>
-                    </m:sub>
-                  </m:sSub>
-                </m:den>
-              </m:f>
-            </m:e>
-          </m:rad>
-          <m:r>
-            <m:rPr>
-              <m:sty m:val="p"/>
-            </m:rPr>
-            <w:rPr>
-              <w:rFonts w:ascii="Cambria Math" w:hAnsi="Cambria Math" w:hint="cs"/>
-            </w:rPr>
-            <m:t>,</m:t>
-          </m:r>
-        </m:oMath>
-      </m:oMathPara>
-    </w:p>
-    <w:p>
-      <w:pPr>
-        <w:jc w:val="both"/>
-      </w:pPr>
-      <w:r>
-        <w:rPr>
-          <w:rFonts w:hint="cs"/>
-        </w:rPr>
-        <w:t xml:space="preserve">and test statistic </w:t>
-      </w:r>
-      <m:oMath>
-        <m:r>
-          <m:rPr>
-            <m:sty m:val="p"/>
-          </m:rPr>
-          <w:rPr>
-            <w:rFonts w:ascii="Cambria Math" w:hAnsi="Cambria Math" w:hint="cs"/>
-          </w:rPr>
-          <m:t>t=</m:t>
-        </m:r>
-        <m:f>
-          <m:fPr>
-            <m:ctrlPr>
-              <w:rPr>
-                <w:rFonts w:ascii="Cambria Math" w:hAnsi="Cambria Math" w:hint="cs"/>
-                <w:lang w:eastAsia="zh-CN"/>
-              </w:rPr>
-            </m:ctrlPr>
-          </m:fPr>
-          <m:num>
-            <m:sSup>
-              <m:sSupPr>
-                <m:ctrlPr>
-                  <w:rPr>
-                    <w:rFonts w:ascii="Cambria Math" w:hAnsi="Cambria Math" w:hint="cs"/>
-                    <w:lang w:eastAsia="zh-CN"/>
-                  </w:rPr>
-                </m:ctrlPr>
-              </m:sSupPr>
-              <m:e>
-                <m:r>
-                  <m:rPr>
-                    <m:sty m:val="p"/>
-                  </m:rPr>
-                  <w:rPr>
-                    <w:rFonts w:ascii="Cambria Math" w:hAnsi="Cambria Math" w:hint="cs"/>
-                  </w:rPr>
-                  <m:t>ρ</m:t>
-                </m:r>
-              </m:e>
-              <m:sup>
-                <m:r>
-                  <m:rPr>
-                    <m:sty m:val="p"/>
-                  </m:rPr>
-                  <w:rPr>
-                    <w:rFonts w:ascii="Cambria Math" w:hAnsi="Cambria Math" w:hint="cs"/>
-                  </w:rPr>
-                  <m:t>*</m:t>
-                </m:r>
-              </m:sup>
-            </m:sSup>
-            <m:r>
-              <m:rPr>
-                <m:sty m:val="p"/>
-              </m:rPr>
-              <w:rPr>
-                <w:rFonts w:ascii="Cambria Math" w:hAnsi="Cambria Math" w:hint="cs"/>
-              </w:rPr>
-              <m:t>-</m:t>
-            </m:r>
-            <m:sSub>
-              <m:sSubPr>
-                <m:ctrlPr>
-                  <w:rPr>
-                    <w:rFonts w:ascii="Cambria Math" w:hAnsi="Cambria Math" w:hint="cs"/>
-                    <w:lang w:eastAsia="zh-CN"/>
-                  </w:rPr>
-                </m:ctrlPr>
-              </m:sSubPr>
-              <m:e>
-                <m:r>
-                  <m:rPr>
-                    <m:sty m:val="p"/>
-                  </m:rPr>
-                  <w:rPr>
-                    <w:rFonts w:ascii="Cambria Math" w:hAnsi="Cambria Math" w:hint="cs"/>
-                  </w:rPr>
-                  <m:t>ρ</m:t>
-                </m:r>
-              </m:e>
-              <m:sub>
-                <m:r>
-                  <m:rPr>
-                    <m:sty m:val="p"/>
-                  </m:rPr>
-                  <w:rPr>
-                    <w:rFonts w:ascii="Cambria Math" w:hAnsi="Cambria Math" w:hint="cs"/>
-                  </w:rPr>
-                  <m:t>low</m:t>
-                </m:r>
-              </m:sub>
-            </m:sSub>
-          </m:num>
-          <m:den>
-            <m:r>
-              <m:rPr>
-                <m:nor/>
-              </m:rPr>
-              <w:rPr>
-                <w:rFonts w:hint="cs"/>
-              </w:rPr>
-              <m:t>SE</m:t>
-            </m:r>
-            <m:r>
-              <m:rPr>
-                <m:sty m:val="p"/>
-              </m:rPr>
-              <w:rPr>
-                <w:rFonts w:ascii="Cambria Math" w:hAnsi="Cambria Math" w:hint="cs"/>
-              </w:rPr>
-              <m:t>(</m:t>
-            </m:r>
-            <m:sSup>
-              <m:sSupPr>
-                <m:ctrlPr>
-                  <w:rPr>
-                    <w:rFonts w:ascii="Cambria Math" w:hAnsi="Cambria Math" w:hint="cs"/>
-                    <w:lang w:eastAsia="zh-CN"/>
-                  </w:rPr>
-                </m:ctrlPr>
-              </m:sSupPr>
-              <m:e>
-                <m:r>
-                  <m:rPr>
-                    <m:sty m:val="p"/>
-                  </m:rPr>
-                  <w:rPr>
-                    <w:rFonts w:ascii="Cambria Math" w:hAnsi="Cambria Math" w:hint="cs"/>
-                  </w:rPr>
-                  <m:t>ρ</m:t>
-                </m:r>
-              </m:e>
-              <m:sup>
-                <m:r>
-                  <m:rPr>
-                    <m:sty m:val="p"/>
-                  </m:rPr>
-                  <w:rPr>
-                    <w:rFonts w:ascii="Cambria Math" w:hAnsi="Cambria Math" w:hint="cs"/>
-                  </w:rPr>
-                  <m:t>*</m:t>
-                </m:r>
-              </m:sup>
-            </m:sSup>
-            <m:r>
-              <m:rPr>
-                <m:sty m:val="p"/>
-              </m:rPr>
-              <w:rPr>
-                <w:rFonts w:ascii="Cambria Math" w:hAnsi="Cambria Math" w:hint="cs"/>
-              </w:rPr>
-              <m:t>-</m:t>
-            </m:r>
-            <m:sSub>
-              <m:sSubPr>
-                <m:ctrlPr>
-                  <w:rPr>
-                    <w:rFonts w:ascii="Cambria Math" w:hAnsi="Cambria Math" w:hint="cs"/>
-                    <w:lang w:eastAsia="zh-CN"/>
-                  </w:rPr>
-                </m:ctrlPr>
-              </m:sSubPr>
-              <m:e>
-                <m:r>
-                  <m:rPr>
-                    <m:sty m:val="p"/>
-                  </m:rPr>
-                  <w:rPr>
-                    <w:rFonts w:ascii="Cambria Math" w:hAnsi="Cambria Math" w:hint="cs"/>
-                  </w:rPr>
-                  <m:t>ρ</m:t>
-                </m:r>
-              </m:e>
-              <m:sub>
-                <m:r>
-                  <m:rPr>
-                    <m:sty m:val="p"/>
-                  </m:rPr>
-                  <w:rPr>
-                    <w:rFonts w:ascii="Cambria Math" w:hAnsi="Cambria Math" w:hint="cs"/>
-                  </w:rPr>
-                  <m:t>low</m:t>
-                </m:r>
-              </m:sub>
-            </m:sSub>
-            <m:r>
-              <m:rPr>
-                <m:sty m:val="p"/>
-              </m:rPr>
-              <w:rPr>
-                <w:rFonts w:ascii="Cambria Math" w:hAnsi="Cambria Math" w:hint="cs"/>
-              </w:rPr>
-              <m:t>)</m:t>
-            </m:r>
-          </m:den>
-        </m:f>
-      </m:oMath>
-      <w:r>
-        <w:rPr>
-          <w:rFonts w:hint="cs"/>
-        </w:rPr>
-        <w:t>.</w:t>
+        <w:t xml:space="preserve">Inference uses a stationary block bootstrap (mean block length 20 trading days) applied separately within each regime; each of 1,999 replications recomputes the calm and crisis correlations and δ. We report a percentile 95% interval for the difference between the adjusted crisis correlation and the calm correlation, a one-sided bootstrap p-value for the null of no increase, and the power to detect an increase of 0.05.</w:t>
       </w:r>
     </w:p>
     <w:p>
@@ -8777,6 +7609,9 @@
           </m:r>
         </m:oMath>
       </m:oMathPara>
+      <w:r>
+        <w:t xml:space="preserve"> (13)</w:t>
+      </w:r>
     </w:p>
     <w:p>
       <w:pPr>
@@ -8786,7 +7621,7 @@
         <w:rPr>
           <w:rFonts w:hint="cs"/>
         </w:rPr>
-        <w:t xml:space="preserve">with the timescale evaluated on 30 logarithmically spaced points between 5 bars and one quarter of the sample length (5 to 5,485 bars at M30); Section 3.8.1 re-estimates the regression below the reliability threshold of Section 3.3. Because DCCA coefficients at adjacent timescales share overlapping data, the regression errors are positively autocorrelated and classical OLS standard errors are biased downward. We therefore use Newey and West (1987) heteroskedasticity- and autocorrelation-consistent (HAC) standard errors with a lag truncation of three, the value given by the standard data-dependent rule for 30 observations.</w:t>
+        <w:t xml:space="preserve">with the timescale evaluated on 30 logarithmically spaced points between 5 bars and one quarter of the sample length (5 to 5,485 bars at M30), and separately on the reliable range of Section 3.3. Because the DCCA coefficients at different scales are functionals of the same two series, the regression residuals are not independent across scales. Inference therefore resamples the data rather than the scales: a stationary block bootstrap of the bivariate return series (499 replications, mean block length of about 20 trading days) recomputes the whole DCCA curve and its slope in each replicate, and we report percentile 95% intervals. The same bootstrap provides the intervals for the average correlations in Table 2.</w:t>
       </w:r>
     </w:p>
     <w:p>
@@ -8832,7 +7667,7 @@
         <w:rPr>
           <w:rFonts w:hint="cs"/>
         </w:rPr>
-        <w:t xml:space="preserve">To capture multifractal heterogeneity across fluctuation magnitudes, we implement the MF-DCCA of Zhou (2008) with the absolute-value operator (Oświęcimka et al. 2014), incorporating bivariate moving-average formalisms (Jiang and Zhou 2011). The q-th order fluctuation function is:</w:t>
+        <w:t xml:space="preserve">To capture multifractal heterogeneity across fluctuation magnitudes, we implement the MF-DCCA of Zhou (2008) using absolute local covariances to avoid complex-valued moments, an issue discussed by Oświęcimka et al. (2014), incorporating bivariate moving-average formalisms (Jiang and Zhou 2011). The q-th order fluctuation function is:</w:t>
       </w:r>
     </w:p>
     <w:p>
@@ -9157,6 +7992,9 @@
           </m:r>
         </m:oMath>
       </m:oMathPara>
+      <w:r>
+        <w:t xml:space="preserve"> (14)</w:t>
+      </w:r>
     </w:p>
     <w:p>
       <w:pPr>
@@ -9374,6 +8212,9 @@
           </m:r>
         </m:oMath>
       </m:oMathPara>
+      <w:r>
+        <w:t xml:space="preserve"> (15)</w:t>
+      </w:r>
     </w:p>
     <w:p>
       <w:pPr>
@@ -9383,7 +8224,7 @@
         <w:rPr>
           <w:rFonts w:hint="cs"/>
         </w:rPr>
-        <w:t xml:space="preserve">The multifractal spectrum width, the difference between the exponents at the smallest and largest q, quantifies the degree of multifractal complexity and sensitivity to market shocks.</w:t>
+        <w:t xml:space="preserve">The range of generalized exponents, Δh = h(−5) − h(5), measures how strongly the scaling differs between small and large fluctuations. Because fat tails alone widen this range, we compare each observed range with 100 surrogates in which the paired returns are jointly shuffled, which preserves the return distributions and their contemporaneous correlation but destroys temporal structure.</w:t>
       </w:r>
     </w:p>
     <w:p>
@@ -13934,7 +12775,7 @@
               <w:rPr>
                 <w:rFonts w:hint="cs"/>
               </w:rPr>
-              <w:t xml:space="preserve">0.093</w:t>
+              <w:t xml:space="preserve">0.093 [0.065, 0.124]</w:t>
             </w:r>
           </w:p>
         </w:tc>
@@ -14046,7 +12887,7 @@
               <w:rPr>
                 <w:rFonts w:hint="cs"/>
               </w:rPr>
-              <w:t xml:space="preserve">0.096</w:t>
+              <w:t xml:space="preserve">0.096 [0.070, 0.126]</w:t>
             </w:r>
           </w:p>
         </w:tc>
@@ -14158,7 +12999,7 @@
               <w:rPr>
                 <w:rFonts w:hint="cs"/>
               </w:rPr>
-              <w:t xml:space="preserve">0.086</w:t>
+              <w:t xml:space="preserve">0.086 [0.060, 0.116]</w:t>
             </w:r>
           </w:p>
         </w:tc>
@@ -14270,7 +13111,7 @@
               <w:rPr>
                 <w:rFonts w:hint="cs"/>
               </w:rPr>
-              <w:t xml:space="preserve">0.087</w:t>
+              <w:t xml:space="preserve">0.087 [0.061, 0.114]</w:t>
             </w:r>
           </w:p>
         </w:tc>
@@ -14335,7 +13176,7 @@
         <w:rPr>
           <w:rFonts w:hint="cs"/>
         </w:rPr>
-        <w:t xml:space="preserve"> (Table 3), m = 1. The nested group is the mean of VN30–VNINDEX, VN30–VN100 and VN100–VNINDEX. Source: Authors’ calculations.</w:t>
+        <w:t xml:space="preserve"> (Table 3), m = 1; nested group = mean of the three parent–child pairs. Brackets: block-bootstrap 95% intervals. Source: Authors’ calculations.</w:t>
       </w:r>
     </w:p>
     <w:p>
@@ -14360,7 +13201,7 @@
         <w:rPr>
           <w:rFonts w:hint="cs"/>
         </w:rPr>
-        <w:t xml:space="preserve">–VN30 produces a markedly lower correlation of 0.883–0.892, a consistent gap of 0.086–0.096 correlation points. Averages in the synchronized window (Panel A) and the full sample (Panel B) differ by at most 0.007 for every series, so the unequal calendar coverage of the four frequencies does not drive the results.</w:t>
+        <w:t xml:space="preserve">–VN30 produces a markedly lower correlation of 0.883–0.892, a gap of 0.086–0.096 correlation points whose bootstrap intervals (0.060 to 0.126 across frequencies) exclude zero. The purged correlation nevertheless remains high, so the overlap inflates rather than creates the co-movement. Averages in the synchronized window (Panel A) and the full sample (Panel B) differ by at most 0.007 for every series.</w:t>
       </w:r>
     </w:p>
     <w:p>
@@ -14556,7 +13397,7 @@
         <w:rPr>
           <w:rFonts w:hint="cs"/>
         </w:rPr>
-        <w:t xml:space="preserve">Because the number of segments shrinks as the timescale grows, the DCCA coefficient becomes unreliable at large timescales. For each sample size, we simulate pairs of Gaussian white-noise series with known correlations of −0.3, 0, 0.3, 0.5, 0.7 and 0.9 (167 replications each, 1,002 per frequency) and compute the mean absolute estimation error on 40 log-spaced scales. The reliability threshold is the largest scale below the first scale at which the worst-case error exceeds 0.05. Table 3 reports the thresholds.</w:t>
+        <w:t xml:space="preserve">Because the number of segments shrinks as the timescale grows, the DCCA coefficient becomes unreliable at large timescales. For each sample size, we simulate pairs of Gaussian white-noise series with known correlations of −0.3, 0, 0.3, 0.5, 0.7 and 0.9 (167 replications each, 1,002 per frequency) and compute the mean absolute estimation error on 40 log-spaced scales. The reliability threshold is the largest scale below the first scale at which the worst-case error exceeds 0.05. Because returns are heavy-tailed and volatility-clustered, we repeat the calibration with GARCH(1,1) surrogates driven by Student-t innovations with five degrees of freedom. Table 3 reports both thresholds.</w:t>
       </w:r>
     </w:p>
     <w:p>
@@ -14598,6 +13439,7 @@
         <w:gridCol w:w="2678"/>
         <w:gridCol w:w="3345"/>
         <w:gridCol w:w="3345"/>
+        <w:gridCol w:w="3345"/>
       </w:tblGrid>
       <w:tr>
         <w:trPr>
@@ -14692,7 +13534,7 @@
                 <w:sz w:val="24"/>
                 <w:szCs w:val="24"/>
               </w:rPr>
-              <w:t xml:space="preserve">Maximum reliable scale (s</w:t>
+              <w:t xml:space="preserve">Gaussian s</w:t>
             </w:r>
             <w:r>
               <w:rPr>
@@ -14703,13 +13545,45 @@
               </w:rPr>
               <w:t xml:space="preserve">rel</w:t>
             </w:r>
-            <w:r>
-              <w:rPr>
-                <w:rFonts w:hint="cs"/>
+          </w:p>
+        </w:tc>
+        <w:tc>
+          <w:tcPr>
+            <w:tcW w:w="3345" w:type="dxa"/>
+            <w:tcBorders>
+              <w:top w:val="single" w:sz="4" w:space="0" w:color="auto"/>
+              <w:left w:val="single" w:sz="4" w:space="0" w:color="auto"/>
+              <w:bottom w:val="single" w:sz="4" w:space="0" w:color="auto"/>
+              <w:right w:val="single" w:sz="4" w:space="0" w:color="auto"/>
+            </w:tcBorders>
+            <w:hideMark/>
+          </w:tcPr>
+          <w:p>
+            <w:pPr>
+              <w:pStyle w:val="p1a"/>
+              <w:spacing w:line="300" w:lineRule="auto"/>
+              <w:rPr>
                 <w:sz w:val="24"/>
                 <w:szCs w:val="24"/>
-              </w:rPr>
-              <w:t xml:space="preserve">)</w:t>
+                <w:lang w:bidi="hi-IN"/>
+              </w:rPr>
+            </w:pPr>
+            <w:r>
+              <w:rPr>
+                <w:rFonts w:hint="cs"/>
+                <w:sz w:val="24"/>
+                <w:szCs w:val="24"/>
+              </w:rPr>
+              <w:t xml:space="preserve">Heavy-tailed s</w:t>
+            </w:r>
+            <w:r>
+              <w:rPr>
+                <w:rFonts w:hint="cs"/>
+                <w:sz w:val="24"/>
+                <w:szCs w:val="24"/>
+                <w:vertAlign w:val="subscript"/>
+              </w:rPr>
+              <w:t xml:space="preserve">rel</w:t>
             </w:r>
           </w:p>
         </w:tc>
@@ -14814,6 +13688,37 @@
             </w:r>
           </w:p>
         </w:tc>
+        <w:tc>
+          <w:tcPr>
+            <w:tcW w:w="3345" w:type="dxa"/>
+            <w:tcBorders>
+              <w:top w:val="single" w:sz="4" w:space="0" w:color="auto"/>
+              <w:left w:val="single" w:sz="4" w:space="0" w:color="auto"/>
+              <w:bottom w:val="single" w:sz="4" w:space="0" w:color="auto"/>
+              <w:right w:val="single" w:sz="4" w:space="0" w:color="auto"/>
+            </w:tcBorders>
+            <w:hideMark/>
+          </w:tcPr>
+          <w:p>
+            <w:pPr>
+              <w:pStyle w:val="p1a"/>
+              <w:spacing w:line="300" w:lineRule="auto"/>
+              <w:rPr>
+                <w:sz w:val="24"/>
+                <w:szCs w:val="24"/>
+                <w:lang w:bidi="hi-IN"/>
+              </w:rPr>
+            </w:pPr>
+            <w:r>
+              <w:rPr>
+                <w:rFonts w:hint="cs"/>
+                <w:sz w:val="24"/>
+                <w:szCs w:val="24"/>
+              </w:rPr>
+              <w:t xml:space="preserve">20</w:t>
+            </w:r>
+          </w:p>
+        </w:tc>
       </w:tr>
       <w:tr>
         <w:trPr>
@@ -14915,6 +13820,37 @@
             </w:r>
           </w:p>
         </w:tc>
+        <w:tc>
+          <w:tcPr>
+            <w:tcW w:w="3345" w:type="dxa"/>
+            <w:tcBorders>
+              <w:top w:val="single" w:sz="4" w:space="0" w:color="auto"/>
+              <w:left w:val="single" w:sz="4" w:space="0" w:color="auto"/>
+              <w:bottom w:val="single" w:sz="4" w:space="0" w:color="auto"/>
+              <w:right w:val="single" w:sz="4" w:space="0" w:color="auto"/>
+            </w:tcBorders>
+            <w:hideMark/>
+          </w:tcPr>
+          <w:p>
+            <w:pPr>
+              <w:pStyle w:val="p1a"/>
+              <w:spacing w:line="300" w:lineRule="auto"/>
+              <w:rPr>
+                <w:sz w:val="24"/>
+                <w:szCs w:val="24"/>
+                <w:lang w:bidi="hi-IN"/>
+              </w:rPr>
+            </w:pPr>
+            <w:r>
+              <w:rPr>
+                <w:rFonts w:hint="cs"/>
+                <w:sz w:val="24"/>
+                <w:szCs w:val="24"/>
+              </w:rPr>
+              <w:t xml:space="preserve">151</w:t>
+            </w:r>
+          </w:p>
+        </w:tc>
       </w:tr>
       <w:tr>
         <w:trPr>
@@ -15016,6 +13952,37 @@
             </w:r>
           </w:p>
         </w:tc>
+        <w:tc>
+          <w:tcPr>
+            <w:tcW w:w="3345" w:type="dxa"/>
+            <w:tcBorders>
+              <w:top w:val="single" w:sz="4" w:space="0" w:color="auto"/>
+              <w:left w:val="single" w:sz="4" w:space="0" w:color="auto"/>
+              <w:bottom w:val="single" w:sz="4" w:space="0" w:color="auto"/>
+              <w:right w:val="single" w:sz="4" w:space="0" w:color="auto"/>
+            </w:tcBorders>
+            <w:hideMark/>
+          </w:tcPr>
+          <w:p>
+            <w:pPr>
+              <w:pStyle w:val="p1a"/>
+              <w:spacing w:line="300" w:lineRule="auto"/>
+              <w:rPr>
+                <w:sz w:val="24"/>
+                <w:szCs w:val="24"/>
+                <w:lang w:bidi="hi-IN"/>
+              </w:rPr>
+            </w:pPr>
+            <w:r>
+              <w:rPr>
+                <w:rFonts w:hint="cs"/>
+                <w:sz w:val="24"/>
+                <w:szCs w:val="24"/>
+              </w:rPr>
+              <w:t xml:space="preserve">86</w:t>
+            </w:r>
+          </w:p>
+        </w:tc>
       </w:tr>
       <w:tr>
         <w:trPr>
@@ -15118,6 +14085,37 @@
             </w:r>
           </w:p>
         </w:tc>
+        <w:tc>
+          <w:tcPr>
+            <w:tcW w:w="3345" w:type="dxa"/>
+            <w:tcBorders>
+              <w:top w:val="single" w:sz="4" w:space="0" w:color="auto"/>
+              <w:left w:val="single" w:sz="4" w:space="0" w:color="auto"/>
+              <w:bottom w:val="single" w:sz="4" w:space="0" w:color="auto"/>
+              <w:right w:val="single" w:sz="4" w:space="0" w:color="auto"/>
+            </w:tcBorders>
+            <w:hideMark/>
+          </w:tcPr>
+          <w:p>
+            <w:pPr>
+              <w:pStyle w:val="p1a"/>
+              <w:spacing w:line="300" w:lineRule="auto"/>
+              <w:rPr>
+                <w:sz w:val="24"/>
+                <w:szCs w:val="24"/>
+                <w:lang w:bidi="hi-IN"/>
+              </w:rPr>
+            </w:pPr>
+            <w:r>
+              <w:rPr>
+                <w:rFonts w:hint="cs"/>
+                <w:sz w:val="24"/>
+                <w:szCs w:val="24"/>
+              </w:rPr>
+              <w:t xml:space="preserve">28</w:t>
+            </w:r>
+          </w:p>
+        </w:tc>
       </w:tr>
     </w:tbl>
     <w:p>
@@ -15134,7 +14132,7 @@
         <w:rPr>
           <w:rFonts w:hint="cs"/>
         </w:rPr>
-        <w:t xml:space="preserve">Notes: Worst-case mean absolute error below 0.05 in 1,002 white-noise simulations per frequency. Source: Authors’ calculations.</w:t>
+        <w:t xml:space="preserve">Notes: Largest scale at which the worst-case mean absolute error stays below 0.05; Gaussian: 1,002 white-noise simulations; heavy-tailed: 300 GARCH(1,1) simulations with Student-t (5) innovations. Source: Authors’ calculations.</w:t>
       </w:r>
     </w:p>
     <w:p>
@@ -15142,7 +14140,16 @@
         <w:jc w:val="both"/>
       </w:pPr>
       <w:r>
-        <w:t xml:space="preserve">The estimates are insensitive to the detrending order: for VN30–VNINDEX at the daily frequency, the mean reliable-range correlation is 0.9665, 0.9663 and 0.9667 for m = 1, 2 and 3. The statistical proxies (P</w:t>
+        <w:t xml:space="preserve">The heavy-tailed thresholds are markedly smaller, but averaging over them leaves the results intact (nested pairs 0.975–0.979; P</w:t>
+      </w:r>
+      <w:r>
+        <w:rPr>
+          <w:vertAlign w:val="subscript"/>
+        </w:rPr>
+        <w:t xml:space="preserve">cap</w:t>
+      </w:r>
+      <w:r>
+        <w:t xml:space="preserve">–VN30 0.882–0.890). The estimates are also insensitive to the detrending order: for VN30–VNINDEX at the daily frequency, the mean reliable-range correlation is 0.9665, 0.9663 and 0.9667 for m = 1, 2 and 3. The statistical proxies (P</w:t>
       </w:r>
       <w:r>
         <w:rPr>
@@ -15213,7 +14220,33 @@
         <w:rPr>
           <w:rFonts w:hint="cs"/>
         </w:rPr>
-        <w:t xml:space="preserve">The generalized Hurst exponent at the second order, h(2), lies within 0.527–0.544 for all series and frequencies, indicating weak positive persistence. However, the multifractal spectrum width, the difference between the exponents at q = −5 and q = 5, reveals substantive heterogeneity across pairs. For the nested index pairs, the width spans 0.252–0.431. For the purged capitalization proxy, it reaches 0.435–0.656 and is the largest of all pairs at every frequency, indicating richer nonlinear cross-correlation structure than in the mechanically bound nested pairs. The statistical residual proxies produce widths of 0.211–0.494 that vary erratically across frequencies, consistent with amplified noise.</w:t>
+        <w:t xml:space="preserve">The generalized Hurst exponent at the second order, h(2), lies within 0.527–0.544 for all series and frequencies, indicating weak positive persistence. The range of generalized exponents is 0.252–0.431 for the nested pairs and 0.435–0.656 for P</w:t>
+      </w:r>
+      <w:r>
+        <w:rPr>
+          <w:rFonts w:hint="cs"/>
+          <w:vertAlign w:val="subscript"/>
+        </w:rPr>
+        <w:t xml:space="preserve">cap</w:t>
+      </w:r>
+      <w:r>
+        <w:rPr>
+          <w:rFonts w:hint="cs"/>
+        </w:rPr>
+        <w:t xml:space="preserve">–VN30, but shuffled surrogates show that much of this range reflects fat tails rather than temporal cross-correlation: the P</w:t>
+      </w:r>
+      <w:r>
+        <w:rPr>
+          <w:rFonts w:hint="cs"/>
+          <w:vertAlign w:val="subscript"/>
+        </w:rPr>
+        <w:t xml:space="preserve">cap</w:t>
+      </w:r>
+      <w:r>
+        <w:rPr>
+          <w:rFonts w:hint="cs"/>
+        </w:rPr>
+        <w:t xml:space="preserve">–VN30 range exceeds the 95th surrogate percentile only at 1D (observed 0.656 against a 95th percentile of 0.577), and the nested pairs exceed it in 2 of 12 cases. The multifractal evidence therefore supports only a modest, mainly daily, nonlinear cross-correlation structure in the purged series.</w:t>
       </w:r>
     </w:p>
     <w:p>
@@ -15343,7 +14376,7 @@
         <w:rPr>
           <w:rFonts w:hint="cs"/>
         </w:rPr>
-        <w:t xml:space="preserve">Notes: q ∈ [−5, 5]\{0}. Source: Authors’ calculations based on HOSE index data (TradingView).</w:t>
+        <w:t xml:space="preserve">Notes: q ∈ [−5, 5]\{0}; daily data. Source: Authors’ calculations based on HOSE index data (TradingView).</w:t>
       </w:r>
     </w:p>
     <w:p>
@@ -15377,7 +14410,7 @@
         <w:rPr>
           <w:rFonts w:hint="cs"/>
         </w:rPr>
-        <w:t xml:space="preserve">Table 4 presents the unadjusted and Forbes–Rigobon conditioned correlations to assess whether the observed surge in co-movement during market turmoil reflects genuine economic interdependence or volatility expansion. Regime correlations are DCCA coefficients at a 20-day horizon estimated on the concatenated calm and turbulent subsamples of daily returns.</w:t>
+        <w:t xml:space="preserve">Table 4 presents the unadjusted and Forbes–Rigobon conditioned correlations to assess whether the surge in co-movement during market turmoil reflects a structural change or volatility expansion.</w:t>
       </w:r>
     </w:p>
     <w:p>
@@ -15622,7 +14655,33 @@
               <w:rPr>
                 <w:rFonts w:hint="cs"/>
               </w:rPr>
-              <w:t xml:space="preserve">Asymp. SE</w:t>
+              <w:t xml:space="preserve">ρ</w:t>
+            </w:r>
+            <w:r>
+              <w:rPr>
+                <w:rFonts w:hint="cs"/>
+                <w:vertAlign w:val="superscript"/>
+              </w:rPr>
+              <w:t xml:space="preserve">*</w:t>
+            </w:r>
+            <w:r>
+              <w:rPr>
+                <w:rFonts w:hint="cs"/>
+              </w:rPr>
+              <w:t xml:space="preserve"> − ρ</w:t>
+            </w:r>
+            <w:r>
+              <w:rPr>
+                <w:rFonts w:hint="cs"/>
+                <w:vertAlign w:val="subscript"/>
+              </w:rPr>
+              <w:t xml:space="preserve">low</w:t>
+            </w:r>
+            <w:r>
+              <w:rPr>
+                <w:rFonts w:hint="cs"/>
+              </w:rPr>
+              <w:t xml:space="preserve"> [95% CI]</w:t>
             </w:r>
           </w:p>
         </w:tc>
@@ -15651,7 +14710,7 @@
               <w:rPr>
                 <w:rFonts w:hint="cs"/>
               </w:rPr>
-              <w:t xml:space="preserve">t-stat</w:t>
+              <w:t xml:space="preserve">p-value</w:t>
             </w:r>
           </w:p>
         </w:tc>
@@ -15680,7 +14739,7 @@
               <w:rPr>
                 <w:rFonts w:hint="cs"/>
               </w:rPr>
-              <w:t xml:space="preserve">p-value</w:t>
+              <w:t xml:space="preserve">Power</w:t>
             </w:r>
           </w:p>
         </w:tc>
@@ -15799,7 +14858,7 @@
                 <w:rFonts w:hint="cs"/>
                 <w:color w:val="000000"/>
               </w:rPr>
-              <w:t xml:space="preserve">0.844</w:t>
+              <w:t xml:space="preserve">0.847</w:t>
             </w:r>
           </w:p>
         </w:tc>
@@ -15919,7 +14978,7 @@
                 <w:rFonts w:hint="cs"/>
                 <w:color w:val="000000"/>
               </w:rPr>
-              <w:t xml:space="preserve">0.018</w:t>
+              <w:t xml:space="preserve">−0.044 [−0.082, 0.001]</w:t>
             </w:r>
           </w:p>
         </w:tc>
@@ -15949,7 +15008,7 @@
                 <w:rFonts w:hint="cs"/>
                 <w:color w:val="000000"/>
               </w:rPr>
-              <w:t xml:space="preserve">−2.28</w:t>
+              <w:t xml:space="preserve">0.985</w:t>
             </w:r>
           </w:p>
         </w:tc>
@@ -15979,7 +15038,7 @@
                 <w:rFonts w:hint="cs"/>
                 <w:color w:val="000000"/>
               </w:rPr>
-              <w:t xml:space="preserve">0.989</w:t>
+              <w:t xml:space="preserve">0.77</w:t>
             </w:r>
           </w:p>
         </w:tc>
@@ -16098,7 +15157,7 @@
                 <w:rFonts w:hint="cs"/>
                 <w:color w:val="000000"/>
               </w:rPr>
-              <w:t xml:space="preserve">0.633</w:t>
+              <w:t xml:space="preserve">0.727</w:t>
             </w:r>
           </w:p>
         </w:tc>
@@ -16128,7 +15187,7 @@
                 <w:rFonts w:hint="cs"/>
                 <w:color w:val="000000"/>
               </w:rPr>
-              <w:t xml:space="preserve">0.929</w:t>
+              <w:t xml:space="preserve">0.928</w:t>
             </w:r>
           </w:p>
         </w:tc>
@@ -16188,7 +15247,7 @@
                 <w:rFonts w:hint="cs"/>
                 <w:color w:val="000000"/>
               </w:rPr>
-              <w:t xml:space="preserve">0.663</w:t>
+              <w:t xml:space="preserve">0.661</w:t>
             </w:r>
           </w:p>
         </w:tc>
@@ -16218,7 +15277,7 @@
                 <w:rFonts w:hint="cs"/>
                 <w:color w:val="000000"/>
               </w:rPr>
-              <w:t xml:space="preserve">0.030</w:t>
+              <w:t xml:space="preserve">−0.066 [−0.132, 0.008]</w:t>
             </w:r>
           </w:p>
         </w:tc>
@@ -16248,7 +15307,7 @@
                 <w:rFonts w:hint="cs"/>
                 <w:color w:val="000000"/>
               </w:rPr>
-              <w:t xml:space="preserve">0.97</w:t>
+              <w:t xml:space="preserve">0.974</w:t>
             </w:r>
           </w:p>
         </w:tc>
@@ -16278,7 +15337,7 @@
                 <w:rFonts w:hint="cs"/>
                 <w:color w:val="000000"/>
               </w:rPr>
-              <w:t xml:space="preserve">0.165</w:t>
+              <w:t xml:space="preserve">0.41</w:t>
             </w:r>
           </w:p>
         </w:tc>
@@ -16296,7 +15355,7 @@
         <w:rPr>
           <w:rFonts w:hint="cs"/>
         </w:rPr>
-        <w:t xml:space="preserve">Notes: DCCA correlations at s ≈ 20 days; δ is the relative increase in VN30 return variance; one-sided test of H</w:t>
+        <w:t xml:space="preserve">Notes: Pearson correlations of daily returns; δ = relative increase in VN30 return variance; one-sided bootstrap p-value for H</w:t>
       </w:r>
       <w:r>
         <w:rPr>
@@ -16335,33 +15394,7 @@
         <w:rPr>
           <w:rFonts w:hint="cs"/>
         </w:rPr>
-        <w:t xml:space="preserve">. N</w:t>
-      </w:r>
-      <w:r>
-        <w:rPr>
-          <w:rFonts w:hint="cs"/>
-          <w:vertAlign w:val="subscript"/>
-        </w:rPr>
-        <w:t xml:space="preserve">calm</w:t>
-      </w:r>
-      <w:r>
-        <w:rPr>
-          <w:rFonts w:hint="cs"/>
-        </w:rPr>
-        <w:t xml:space="preserve">/N</w:t>
-      </w:r>
-      <w:r>
-        <w:rPr>
-          <w:rFonts w:hint="cs"/>
-          <w:vertAlign w:val="subscript"/>
-        </w:rPr>
-        <w:t xml:space="preserve">crisis</w:t>
-      </w:r>
-      <w:r>
-        <w:rPr>
-          <w:rFonts w:hint="cs"/>
-        </w:rPr>
-        <w:t xml:space="preserve"> = 1,000/539 (Panel A) and 739/739 (Panel B). Source: Authors’ calculations.</w:t>
+        <w:t xml:space="preserve">; power to detect an increase of 0.05. Panel A: 1,000 calm and 539 crisis days; Panel B: 739 days per regime. Source: Authors’ calculations.</w:t>
       </w:r>
     </w:p>
     <w:p>
@@ -16378,7 +15411,7 @@
         <w:t xml:space="preserve">cap</w:t>
       </w:r>
       <w:r>
-        <w:t xml:space="preserve">–VN30. Because nested pairs embed the conditioning asset in the dependent series, constituent overlap creates an endogenous feedback loop that violates the exogeneity condition of Forbes and Rigobon (2002). For diagnostic comparison only, raw correlations for the nested pairs rise from 0.955–0.983 in calm periods to 0.980–0.992 in crisis episodes, and from 0.923–0.962 to 0.982–0.992 across rolling-volatility regimes.</w:t>
+        <w:t xml:space="preserve">–VN30, because nested pairs embed the conditioning asset in the dependent series and violate the exogeneity condition of Forbes and Rigobon (2002). For diagnostic comparison only, raw correlations for the nested pairs rise from 0.959–0.983 in calm periods to 0.978–0.992 in crisis episodes, and from 0.921–0.973 to 0.981–0.992 across rolling-volatility regimes.</w:t>
       </w:r>
     </w:p>
     <w:p>
@@ -16389,7 +15422,7 @@
         <w:rPr>
           <w:rFonts w:hint="cs"/>
         </w:rPr>
-        <w:t xml:space="preserve">In Panel A, regimes correspond to the three prolonged crisis episodes. Raw cross-tier correlation rises from 0.844 in calm years to 0.924 during crises, while the variance of VN30 returns increases by 221% (δ = 2.21). Once this volatility expansion is accounted for, the adjusted crisis correlation falls to 0.803, below its calm level, so the null hypothesis of no structural increase cannot be rejected (t = −2.28, p = 0.989). The tighter co-movement during systemic stress is thus consistent with an unchanged transmission structure operating under higher volatility, the interdependence interpretation of Forbes and Rigobon (2002). Liquidity constraints and delayed price adjustment in retail-dominated trading (Tran and Tran 2025) offer a plausible channel through which volatility spreads across capitalization tiers without altering their underlying linkage.</w:t>
+        <w:t xml:space="preserve">In Panel A, raw cross-tier correlation rises from 0.847 in calm years to 0.924 during the three crisis episodes, while the variance of VN30 returns increases by 221%. After conditioning, the adjusted crisis correlation is 0.803, and the difference from the calm level (−0.044; 95% interval −0.082 to 0.001) provides no evidence of a structural increase (p = 0.985). Because the interval also includes zero, the data do not support a structural decrease either. The power to detect an increase of 0.05 is 0.77, so moderate structural increases are unlikely, whereas small ones cannot be excluded.</w:t>
       </w:r>
     </w:p>
     <w:p>
@@ -16400,7 +15433,7 @@
         <w:rPr>
           <w:rFonts w:hint="cs"/>
         </w:rPr>
-        <w:t xml:space="preserve">Panel B sorts days by the rolling 20-day volatility of VNINDEX, isolating extreme volatility clustering and producing a much larger variance expansion (δ = 7.06, a 606% increase). The raw correlation rises from 0.633 to 0.929 (+0.296 points), but the volatility adjustment (a factor of 1.402) pulls the adjusted correlation down to 0.663, only 0.030 above the calm level (t = 0.97, p = 0.165). Both definitions therefore reach the same conclusion: the apparent surge in large-cap/mid-cap correlation is a volatility effect rather than evidence of contagion. The rolling definition exaggerates the raw tightening because its low-volatility days are drawn from the quietest, least correlated intervals.</w:t>
+        <w:t xml:space="preserve">Panel B sorts days by the rolling 20-day volatility of VNINDEX, producing a larger variance expansion (δ = 7.06). The raw correlation rises from 0.727 to 0.928, but the adjusted crisis correlation (0.661) again does not exceed the calm level (difference −0.066, 95% interval −0.132 to 0.008; p = 0.974), although this test has low power (0.41). Both definitions therefore point to interdependence amplified by volatility rather than contagion, a conclusion that rests on the absence of evidence for an increase rather than on proof of its absence. Because the regimes are sorted on VNINDEX, which contains the mid-caps, and are classified ex post, the comparison describes in-sample regimes rather than a real-time signal.</w:t>
       </w:r>
     </w:p>
     <w:p>
@@ -16838,6 +15871,9 @@
           </m:r>
         </m:oMath>
       </m:oMathPara>
+      <w:r>
+        <w:t xml:space="preserve"> (16)</w:t>
+      </w:r>
     </w:p>
     <w:p>
       <w:pPr>
@@ -17711,6 +16747,9 @@
           </m:r>
         </m:oMath>
       </m:oMathPara>
+      <w:r>
+        <w:t xml:space="preserve"> (17)</w:t>
+      </w:r>
     </w:p>
     <w:p>
       <w:pPr>
@@ -17720,20 +16759,7 @@
         <w:rPr>
           <w:rFonts w:hint="cs"/>
         </w:rPr>
-        <w:t xml:space="preserve">When the two assets have equal volatility, the volatility term in the denominator equals one. In the daily data (Table 1), the volatilities of P</w:t>
-      </w:r>
-      <w:r>
-        <w:rPr>
-          <w:rFonts w:hint="cs"/>
-          <w:vertAlign w:val="subscript"/>
-        </w:rPr>
-        <w:t xml:space="preserve">cap</w:t>
-      </w:r>
-      <w:r>
-        <w:rPr>
-          <w:rFonts w:hint="cs"/>
-        </w:rPr>
-        <w:t xml:space="preserve"> (0.0124) and VN30 (0.0121) are so close that the term equals 1.0002, changing the denominator by only 0.02%; all reported figures nevertheless use the exact expression. Evaluating this relative variance error across regimes reveals a sharp distinction between tradable cash portfolios and underlying factor exposures.</w:t>
+        <w:t xml:space="preserve">All figures use regime-specific volatilities and Pearson correlations in the exact expression, so the static and regime-specific cases differ only in the correlation. Evaluating this relative variance error across regimes reveals a sharp distinction between tradable cash portfolios and underlying factor exposures.</w:t>
       </w:r>
     </w:p>
     <w:p>
@@ -17744,7 +16770,7 @@
         <w:rPr>
           <w:rFonts w:hint="cs"/>
         </w:rPr>
-        <w:t xml:space="preserve">For cash portfolios formed from parent and child indices (such as VN30–VN100), co-movement is dominated by constituent overlap. At the daily frequency, the static correlation of 0.988 compares with regime correlations of 0.962 and 0.992 under the rolling definition, so the static model overstates portfolio variance by 1.32% in the calm regime and understates it by 0.19% in the turbulent regime. Across all frequencies and parent–child pairs, the largest absolute error is 2.73% (VN30–VNINDEX, calm regime, H4), which is negligible for operational risk management.</w:t>
+        <w:t xml:space="preserve">For cash portfolios formed from parent and child indices (such as VN30–VN100), co-movement is dominated by constituent overlap. The static daily correlation of 0.988 compares with rolling-regime correlations of 0.973 and 0.992, so the static model overstates portfolio variance by 0.77% in the calm regime and understates it by 0.20% in the turbulent regime. Across the three parent–child pairs and both regime definitions, the largest absolute error is 2.35%, which is negligible for operational risk management.</w:t>
       </w:r>
     </w:p>
     <w:p>
@@ -17755,7 +16781,7 @@
         <w:rPr>
           <w:rFonts w:hint="cs"/>
         </w:rPr>
-        <w:t xml:space="preserve">Conversely, for the mid-cap factor exposure (P</w:t>
+        <w:t xml:space="preserve">Conversely, for the mid-cap factor exposure, static correlation models produce material distortion. The static model overstates portfolio variance by 2.23% (95% interval 0.91 to 3.94) in the chronological calm regime and by 9.38% (6.20 to 13.46) in the rolling low-volatility regime, whose quietest days exaggerate the effect. Because P</w:t>
       </w:r>
       <w:r>
         <w:rPr>
@@ -17768,7 +16794,7 @@
         <w:rPr>
           <w:rFonts w:hint="cs"/>
         </w:rPr>
-        <w:t xml:space="preserve">), static correlation models produce substantial distortion. Under the rolling definition, the calm-regime correlation is 0.633, whereas the full-sample static correlation is 0.889, so the static model overstates portfolio variance by 15.63%; under the chronological definition, where the calm correlation is 0.844, the overstatement is +2.44%. An allocator relying on static metrics therefore perceives the mid-cap allocation as riskier than it is during tranquil periods, which leads to excessive risk-capital provisioning and inefficient hedging allocations.</w:t>
+        <w:t xml:space="preserve"> is a non-investable construct, these figures describe the risk of a mid-cap factor exposure (for example, one obtained through a mid-cap index fund) combined with large caps, not a portfolio that can be held directly.</w:t>
       </w:r>
     </w:p>
     <w:p>
@@ -17779,7 +16805,7 @@
         <w:rPr>
           <w:rFonts w:hint="cs"/>
         </w:rPr>
-        <w:t xml:space="preserve">In the turbulent regime, the static model understates portfolio variance by 2.10% under the rolling definition and by 1.83% under the chronological definition. Although these errors appear modest, they arise when the variance of the underlying assets has risen by 221% to 606% (Table 4). Because the crisis correlation increase is explained by volatility (Section 3.5), risk budgets should be conditioned on the volatility regime rather than on a single static correlation.</w:t>
+        <w:t xml:space="preserve">In the turbulent regime, the static model understates portfolio variance by 1.84% (chronological) and 2.07% (rolling). Although modest, these errors arise when the variance of the underlying assets has risen by 221% to 706% (Table 4). All regimes are identified ex post, so the figures measure the in-sample cost of ignoring regime dependence rather than the performance of a real-time risk-budgeting rule.</w:t>
       </w:r>
     </w:p>
     <w:p>
@@ -17816,7 +16842,7 @@
         <w:rPr>
           <w:rFonts w:hint="cs"/>
         </w:rPr>
-        <w:t xml:space="preserve">Table 5 presents the log-linear scaling regressions of DCCA coefficients at the M30 frequency, whose scale grid spans the widest range of horizons, to quantify the sensitivity of cross-asset co-movement to the investment horizon.</w:t>
+        <w:t xml:space="preserve">Table 5 presents the scaling slopes of the DCCA coefficients at the M30 frequency over the full and reliable scale ranges, with block-bootstrap intervals, to quantify the sensitivity of cross-asset co-movement to the investment horizon.</w:t>
       </w:r>
     </w:p>
     <w:p>
@@ -17855,13 +16881,11 @@
         <w:tblLook w:val="0020" w:firstRow="1" w:lastRow="0" w:firstColumn="0" w:lastColumn="0" w:noHBand="0" w:noVBand="0"/>
       </w:tblPr>
       <w:tblGrid>
-        <w:gridCol w:w="1882"/>
-        <w:gridCol w:w="1660"/>
-        <w:gridCol w:w="1444"/>
-        <w:gridCol w:w="1469"/>
-        <w:gridCol w:w="923"/>
-        <w:gridCol w:w="876"/>
-        <w:gridCol w:w="1096"/>
+        <w:gridCol w:w="2275"/>
+        <w:gridCol w:w="2053"/>
+        <w:gridCol w:w="1837"/>
+        <w:gridCol w:w="1862"/>
+        <w:gridCol w:w="1316"/>
       </w:tblGrid>
       <w:tr>
         <w:trPr>
@@ -17913,24 +16937,32 @@
                 <w:sz w:val="24"/>
                 <w:szCs w:val="24"/>
               </w:rPr>
-              <w:t xml:space="preserve">Intercept (α</w:t>
-            </w:r>
-            <w:r>
-              <w:rPr>
-                <w:rFonts w:hint="cs"/>
+              <w:t xml:space="preserve">Full-range slope</w:t>
+            </w:r>
+          </w:p>
+        </w:tc>
+        <w:tc>
+          <w:tcPr>
+            <w:tcW w:w="0" w:type="auto"/>
+            <w:hideMark/>
+          </w:tcPr>
+          <w:p>
+            <w:pPr>
+              <w:pStyle w:val="p1a"/>
+              <w:spacing w:line="240" w:lineRule="auto"/>
+              <w:rPr>
                 <w:sz w:val="24"/>
                 <w:szCs w:val="24"/>
-                <w:vertAlign w:val="subscript"/>
-              </w:rPr>
-              <w:t xml:space="preserve">scale</w:t>
-            </w:r>
+                <w:lang w:bidi="hi-IN"/>
+              </w:rPr>
+            </w:pPr>
             <w:r>
               <w:rPr>
                 <w:rFonts w:hint="cs"/>
                 <w:sz w:val="24"/>
                 <w:szCs w:val="24"/>
               </w:rPr>
-              <w:t xml:space="preserve">)</w:t>
+              <w:t xml:space="preserve">95% CI</w:t>
             </w:r>
           </w:p>
         </w:tc>
@@ -17955,134 +16987,32 @@
                 <w:sz w:val="24"/>
                 <w:szCs w:val="24"/>
               </w:rPr>
-              <w:t xml:space="preserve">Slope (β</w:t>
-            </w:r>
-            <w:r>
-              <w:rPr>
-                <w:rFonts w:hint="cs"/>
+              <w:t xml:space="preserve">Reliable-range slope</w:t>
+            </w:r>
+          </w:p>
+        </w:tc>
+        <w:tc>
+          <w:tcPr>
+            <w:tcW w:w="0" w:type="auto"/>
+            <w:hideMark/>
+          </w:tcPr>
+          <w:p>
+            <w:pPr>
+              <w:pStyle w:val="p1a"/>
+              <w:spacing w:line="240" w:lineRule="auto"/>
+              <w:rPr>
                 <w:sz w:val="24"/>
                 <w:szCs w:val="24"/>
-                <w:vertAlign w:val="subscript"/>
-              </w:rPr>
-              <w:t xml:space="preserve">scale</w:t>
-            </w:r>
+                <w:lang w:bidi="hi-IN"/>
+              </w:rPr>
+            </w:pPr>
             <w:r>
               <w:rPr>
                 <w:rFonts w:hint="cs"/>
                 <w:sz w:val="24"/>
                 <w:szCs w:val="24"/>
               </w:rPr>
-              <w:t xml:space="preserve">)</w:t>
-            </w:r>
-          </w:p>
-        </w:tc>
-        <w:tc>
-          <w:tcPr>
-            <w:tcW w:w="0" w:type="auto"/>
-            <w:hideMark/>
-          </w:tcPr>
-          <w:p>
-            <w:pPr>
-              <w:pStyle w:val="p1a"/>
-              <w:spacing w:line="240" w:lineRule="auto"/>
-              <w:rPr>
-                <w:sz w:val="24"/>
-                <w:szCs w:val="24"/>
-                <w:lang w:bidi="hi-IN"/>
-              </w:rPr>
-            </w:pPr>
-            <w:r>
-              <w:rPr>
-                <w:rFonts w:hint="cs"/>
-                <w:sz w:val="24"/>
-                <w:szCs w:val="24"/>
-              </w:rPr>
-              <w:t xml:space="preserve">HAC SE</w:t>
-            </w:r>
-          </w:p>
-        </w:tc>
-        <w:tc>
-          <w:tcPr>
-            <w:tcW w:w="0" w:type="auto"/>
-            <w:hideMark/>
-          </w:tcPr>
-          <w:p>
-            <w:pPr>
-              <w:pStyle w:val="p1a"/>
-              <w:spacing w:line="240" w:lineRule="auto"/>
-              <w:rPr>
-                <w:sz w:val="24"/>
-                <w:szCs w:val="24"/>
-                <w:lang w:bidi="hi-IN"/>
-              </w:rPr>
-            </w:pPr>
-            <w:r>
-              <w:rPr>
-                <w:rFonts w:hint="cs"/>
-                <w:sz w:val="24"/>
-                <w:szCs w:val="24"/>
-              </w:rPr>
-              <w:t xml:space="preserve">p-value</w:t>
-            </w:r>
-          </w:p>
-        </w:tc>
-        <w:tc>
-          <w:tcPr>
-            <w:tcW w:w="0" w:type="auto"/>
-            <w:hideMark/>
-          </w:tcPr>
-          <w:p>
-            <w:pPr>
-              <w:pStyle w:val="p1a"/>
-              <w:suppressAutoHyphens/>
-              <w:spacing w:line="240" w:lineRule="auto"/>
-              <w:rPr>
-                <w:sz w:val="24"/>
-                <w:szCs w:val="24"/>
-                <w:lang w:bidi="hi-IN"/>
-              </w:rPr>
-            </w:pPr>
-            <w:r>
-              <w:rPr>
-                <w:rFonts w:hint="cs"/>
-                <w:sz w:val="24"/>
-                <w:szCs w:val="24"/>
-              </w:rPr>
-              <w:t xml:space="preserve">R</w:t>
-            </w:r>
-            <w:r>
-              <w:rPr>
-                <w:rFonts w:hint="cs"/>
-                <w:sz w:val="24"/>
-                <w:szCs w:val="24"/>
-                <w:vertAlign w:val="superscript"/>
-              </w:rPr>
-              <w:t xml:space="preserve">2</w:t>
-            </w:r>
-          </w:p>
-        </w:tc>
-        <w:tc>
-          <w:tcPr>
-            <w:tcW w:w="0" w:type="auto"/>
-            <w:hideMark/>
-          </w:tcPr>
-          <w:p>
-            <w:pPr>
-              <w:pStyle w:val="p1a"/>
-              <w:spacing w:line="240" w:lineRule="auto"/>
-              <w:rPr>
-                <w:sz w:val="24"/>
-                <w:szCs w:val="24"/>
-                <w:lang w:bidi="hi-IN"/>
-              </w:rPr>
-            </w:pPr>
-            <w:r>
-              <w:rPr>
-                <w:rFonts w:hint="cs"/>
-                <w:sz w:val="24"/>
-                <w:szCs w:val="24"/>
-              </w:rPr>
-              <w:t xml:space="preserve">Scales (N)</w:t>
+              <w:t xml:space="preserve">95% CI</w:t>
             </w:r>
           </w:p>
         </w:tc>
@@ -18138,7 +17068,7 @@
                 <w:sz w:val="24"/>
                 <w:szCs w:val="24"/>
               </w:rPr>
-              <w:t xml:space="preserve">0.9625***</w:t>
+              <w:t xml:space="preserve">0.0016</w:t>
             </w:r>
           </w:p>
         </w:tc>
@@ -18163,7 +17093,7 @@
                 <w:sz w:val="24"/>
                 <w:szCs w:val="24"/>
               </w:rPr>
-              <w:t xml:space="preserve">0.0016***</w:t>
+              <w:t xml:space="preserve">[−0.0025, 0.0034]</w:t>
             </w:r>
           </w:p>
         </w:tc>
@@ -18188,7 +17118,7 @@
                 <w:sz w:val="24"/>
                 <w:szCs w:val="24"/>
               </w:rPr>
-              <w:t xml:space="preserve">0.0004</w:t>
+              <w:t xml:space="preserve">0.0022</w:t>
             </w:r>
           </w:p>
         </w:tc>
@@ -18213,57 +17143,7 @@
                 <w:sz w:val="24"/>
                 <w:szCs w:val="24"/>
               </w:rPr>
-              <w:t xml:space="preserve">&lt;0.001</w:t>
-            </w:r>
-          </w:p>
-        </w:tc>
-        <w:tc>
-          <w:tcPr>
-            <w:tcW w:w="0" w:type="auto"/>
-            <w:hideMark/>
-          </w:tcPr>
-          <w:p>
-            <w:pPr>
-              <w:pStyle w:val="p1a"/>
-              <w:spacing w:line="240" w:lineRule="auto"/>
-              <w:rPr>
-                <w:sz w:val="24"/>
-                <w:szCs w:val="24"/>
-                <w:lang w:bidi="hi-IN"/>
-              </w:rPr>
-            </w:pPr>
-            <w:r>
-              <w:rPr>
-                <w:rFonts w:hint="cs"/>
-                <w:sz w:val="24"/>
-                <w:szCs w:val="24"/>
-              </w:rPr>
-              <w:t xml:space="preserve">0.486</w:t>
-            </w:r>
-          </w:p>
-        </w:tc>
-        <w:tc>
-          <w:tcPr>
-            <w:tcW w:w="0" w:type="auto"/>
-            <w:hideMark/>
-          </w:tcPr>
-          <w:p>
-            <w:pPr>
-              <w:pStyle w:val="p1a"/>
-              <w:spacing w:line="240" w:lineRule="auto"/>
-              <w:rPr>
-                <w:sz w:val="24"/>
-                <w:szCs w:val="24"/>
-                <w:lang w:bidi="hi-IN"/>
-              </w:rPr>
-            </w:pPr>
-            <w:r>
-              <w:rPr>
-                <w:rFonts w:hint="cs"/>
-                <w:sz w:val="24"/>
-                <w:szCs w:val="24"/>
-              </w:rPr>
-              <w:t xml:space="preserve">30</w:t>
+              <w:t xml:space="preserve">[0.0007, 0.0038]</w:t>
             </w:r>
           </w:p>
         </w:tc>
@@ -18319,7 +17199,7 @@
                 <w:sz w:val="24"/>
                 <w:szCs w:val="24"/>
               </w:rPr>
-              <w:t xml:space="preserve">0.9775***</w:t>
+              <w:t xml:space="preserve">0.0009</w:t>
             </w:r>
           </w:p>
         </w:tc>
@@ -18344,7 +17224,7 @@
                 <w:sz w:val="24"/>
                 <w:szCs w:val="24"/>
               </w:rPr>
-              <w:t xml:space="preserve">0.0009**</w:t>
+              <w:t xml:space="preserve">[−0.0010, 0.0021]</w:t>
             </w:r>
           </w:p>
         </w:tc>
@@ -18369,7 +17249,7 @@
                 <w:sz w:val="24"/>
                 <w:szCs w:val="24"/>
               </w:rPr>
-              <w:t xml:space="preserve">0.0004</w:t>
+              <w:t xml:space="preserve">0.0022</w:t>
             </w:r>
           </w:p>
         </w:tc>
@@ -18394,57 +17274,7 @@
                 <w:sz w:val="24"/>
                 <w:szCs w:val="24"/>
               </w:rPr>
-              <w:t xml:space="preserve">0.038</w:t>
-            </w:r>
-          </w:p>
-        </w:tc>
-        <w:tc>
-          <w:tcPr>
-            <w:tcW w:w="0" w:type="auto"/>
-            <w:hideMark/>
-          </w:tcPr>
-          <w:p>
-            <w:pPr>
-              <w:pStyle w:val="p1a"/>
-              <w:spacing w:line="240" w:lineRule="auto"/>
-              <w:rPr>
-                <w:sz w:val="24"/>
-                <w:szCs w:val="24"/>
-                <w:lang w:bidi="hi-IN"/>
-              </w:rPr>
-            </w:pPr>
-            <w:r>
-              <w:rPr>
-                <w:rFonts w:hint="cs"/>
-                <w:sz w:val="24"/>
-                <w:szCs w:val="24"/>
-              </w:rPr>
-              <w:t xml:space="preserve">0.298</w:t>
-            </w:r>
-          </w:p>
-        </w:tc>
-        <w:tc>
-          <w:tcPr>
-            <w:tcW w:w="0" w:type="auto"/>
-            <w:hideMark/>
-          </w:tcPr>
-          <w:p>
-            <w:pPr>
-              <w:pStyle w:val="p1a"/>
-              <w:spacing w:line="240" w:lineRule="auto"/>
-              <w:rPr>
-                <w:sz w:val="24"/>
-                <w:szCs w:val="24"/>
-                <w:lang w:bidi="hi-IN"/>
-              </w:rPr>
-            </w:pPr>
-            <w:r>
-              <w:rPr>
-                <w:rFonts w:hint="cs"/>
-                <w:sz w:val="24"/>
-                <w:szCs w:val="24"/>
-              </w:rPr>
-              <w:t xml:space="preserve">30</w:t>
+              <w:t xml:space="preserve">[0.0011, 0.0032]</w:t>
             </w:r>
           </w:p>
         </w:tc>
@@ -18500,7 +17330,7 @@
                 <w:sz w:val="24"/>
                 <w:szCs w:val="24"/>
               </w:rPr>
-              <w:t xml:space="preserve">0.9865***</w:t>
+              <w:t xml:space="preserve">0.0001</w:t>
             </w:r>
           </w:p>
         </w:tc>
@@ -18525,7 +17355,7 @@
                 <w:sz w:val="24"/>
                 <w:szCs w:val="24"/>
               </w:rPr>
-              <w:t xml:space="preserve">0.0001</w:t>
+              <w:t xml:space="preserve">[−0.0015, 0.0010]</w:t>
             </w:r>
           </w:p>
         </w:tc>
@@ -18550,7 +17380,7 @@
                 <w:sz w:val="24"/>
                 <w:szCs w:val="24"/>
               </w:rPr>
-              <w:t xml:space="preserve">0.0002</w:t>
+              <w:t xml:space="preserve">−0.0001</w:t>
             </w:r>
           </w:p>
         </w:tc>
@@ -18575,57 +17405,7 @@
                 <w:sz w:val="24"/>
                 <w:szCs w:val="24"/>
               </w:rPr>
-              <w:t xml:space="preserve">0.636</w:t>
-            </w:r>
-          </w:p>
-        </w:tc>
-        <w:tc>
-          <w:tcPr>
-            <w:tcW w:w="0" w:type="auto"/>
-            <w:hideMark/>
-          </w:tcPr>
-          <w:p>
-            <w:pPr>
-              <w:pStyle w:val="p1a"/>
-              <w:spacing w:line="240" w:lineRule="auto"/>
-              <w:rPr>
-                <w:sz w:val="24"/>
-                <w:szCs w:val="24"/>
-                <w:lang w:bidi="hi-IN"/>
-              </w:rPr>
-            </w:pPr>
-            <w:r>
-              <w:rPr>
-                <w:rFonts w:hint="cs"/>
-                <w:sz w:val="24"/>
-                <w:szCs w:val="24"/>
-              </w:rPr>
-              <w:t xml:space="preserve">0.020</w:t>
-            </w:r>
-          </w:p>
-        </w:tc>
-        <w:tc>
-          <w:tcPr>
-            <w:tcW w:w="0" w:type="auto"/>
-            <w:hideMark/>
-          </w:tcPr>
-          <w:p>
-            <w:pPr>
-              <w:pStyle w:val="p1a"/>
-              <w:spacing w:line="240" w:lineRule="auto"/>
-              <w:rPr>
-                <w:sz w:val="24"/>
-                <w:szCs w:val="24"/>
-                <w:lang w:bidi="hi-IN"/>
-              </w:rPr>
-            </w:pPr>
-            <w:r>
-              <w:rPr>
-                <w:rFonts w:hint="cs"/>
-                <w:sz w:val="24"/>
-                <w:szCs w:val="24"/>
-              </w:rPr>
-              <w:t xml:space="preserve">30</w:t>
+              <w:t xml:space="preserve">[−0.0007, 0.0007]</w:t>
             </w:r>
           </w:p>
         </w:tc>
@@ -18698,7 +17478,7 @@
                 <w:sz w:val="24"/>
                 <w:szCs w:val="24"/>
               </w:rPr>
-              <w:t xml:space="preserve">0.8731***</w:t>
+              <w:t xml:space="preserve">0.0025</w:t>
             </w:r>
           </w:p>
         </w:tc>
@@ -18723,7 +17503,7 @@
                 <w:sz w:val="24"/>
                 <w:szCs w:val="24"/>
               </w:rPr>
-              <w:t xml:space="preserve">0.0025***</w:t>
+              <w:t xml:space="preserve">[−0.0102, 0.0093]</w:t>
             </w:r>
           </w:p>
         </w:tc>
@@ -18748,7 +17528,7 @@
                 <w:sz w:val="24"/>
                 <w:szCs w:val="24"/>
               </w:rPr>
-              <w:t xml:space="preserve">0.0009</w:t>
+              <w:t xml:space="preserve">0.0017</w:t>
             </w:r>
           </w:p>
         </w:tc>
@@ -18773,57 +17553,7 @@
                 <w:sz w:val="24"/>
                 <w:szCs w:val="24"/>
               </w:rPr>
-              <w:t xml:space="preserve">0.009</w:t>
-            </w:r>
-          </w:p>
-        </w:tc>
-        <w:tc>
-          <w:tcPr>
-            <w:tcW w:w="0" w:type="auto"/>
-            <w:hideMark/>
-          </w:tcPr>
-          <w:p>
-            <w:pPr>
-              <w:pStyle w:val="p1a"/>
-              <w:spacing w:line="240" w:lineRule="auto"/>
-              <w:rPr>
-                <w:sz w:val="24"/>
-                <w:szCs w:val="24"/>
-                <w:lang w:bidi="hi-IN"/>
-              </w:rPr>
-            </w:pPr>
-            <w:r>
-              <w:rPr>
-                <w:rFonts w:hint="cs"/>
-                <w:sz w:val="24"/>
-                <w:szCs w:val="24"/>
-              </w:rPr>
-              <w:t xml:space="preserve">0.274</w:t>
-            </w:r>
-          </w:p>
-        </w:tc>
-        <w:tc>
-          <w:tcPr>
-            <w:tcW w:w="0" w:type="auto"/>
-            <w:hideMark/>
-          </w:tcPr>
-          <w:p>
-            <w:pPr>
-              <w:pStyle w:val="p1a"/>
-              <w:spacing w:line="240" w:lineRule="auto"/>
-              <w:rPr>
-                <w:sz w:val="24"/>
-                <w:szCs w:val="24"/>
-                <w:lang w:bidi="hi-IN"/>
-              </w:rPr>
-            </w:pPr>
-            <w:r>
-              <w:rPr>
-                <w:rFonts w:hint="cs"/>
-                <w:sz w:val="24"/>
-                <w:szCs w:val="24"/>
-              </w:rPr>
-              <w:t xml:space="preserve">30</w:t>
+              <w:t xml:space="preserve">[−0.0045, 0.0078]</w:t>
             </w:r>
           </w:p>
         </w:tc>
@@ -18896,7 +17626,7 @@
                 <w:sz w:val="24"/>
                 <w:szCs w:val="24"/>
               </w:rPr>
-              <w:t xml:space="preserve">−0.0846*</w:t>
+              <w:t xml:space="preserve">0.0222</w:t>
             </w:r>
           </w:p>
         </w:tc>
@@ -18921,7 +17651,7 @@
                 <w:sz w:val="24"/>
                 <w:szCs w:val="24"/>
               </w:rPr>
-              <w:t xml:space="preserve">0.0222*</w:t>
+              <w:t xml:space="preserve">[−0.0236, 0.0582]</w:t>
             </w:r>
           </w:p>
         </w:tc>
@@ -18946,7 +17676,7 @@
                 <w:sz w:val="24"/>
                 <w:szCs w:val="24"/>
               </w:rPr>
-              <w:t xml:space="preserve">0.0112</w:t>
+              <w:t xml:space="preserve">0.0289</w:t>
             </w:r>
           </w:p>
         </w:tc>
@@ -18971,57 +17701,7 @@
                 <w:sz w:val="24"/>
                 <w:szCs w:val="24"/>
               </w:rPr>
-              <w:t xml:space="preserve">0.058</w:t>
-            </w:r>
-          </w:p>
-        </w:tc>
-        <w:tc>
-          <w:tcPr>
-            <w:tcW w:w="0" w:type="auto"/>
-            <w:hideMark/>
-          </w:tcPr>
-          <w:p>
-            <w:pPr>
-              <w:pStyle w:val="p1a"/>
-              <w:spacing w:line="240" w:lineRule="auto"/>
-              <w:rPr>
-                <w:sz w:val="24"/>
-                <w:szCs w:val="24"/>
-                <w:lang w:bidi="hi-IN"/>
-              </w:rPr>
-            </w:pPr>
-            <w:r>
-              <w:rPr>
-                <w:rFonts w:hint="cs"/>
-                <w:sz w:val="24"/>
-                <w:szCs w:val="24"/>
-              </w:rPr>
-              <w:t xml:space="preserve">0.293</w:t>
-            </w:r>
-          </w:p>
-        </w:tc>
-        <w:tc>
-          <w:tcPr>
-            <w:tcW w:w="0" w:type="auto"/>
-            <w:hideMark/>
-          </w:tcPr>
-          <w:p>
-            <w:pPr>
-              <w:pStyle w:val="p1a"/>
-              <w:spacing w:line="240" w:lineRule="auto"/>
-              <w:rPr>
-                <w:sz w:val="24"/>
-                <w:szCs w:val="24"/>
-                <w:lang w:bidi="hi-IN"/>
-              </w:rPr>
-            </w:pPr>
-            <w:r>
-              <w:rPr>
-                <w:rFonts w:hint="cs"/>
-                <w:sz w:val="24"/>
-                <w:szCs w:val="24"/>
-              </w:rPr>
-              <w:t xml:space="preserve">30</w:t>
+              <w:t xml:space="preserve">[−0.0033, 0.0534]</w:t>
             </w:r>
           </w:p>
         </w:tc>
@@ -19094,7 +17774,7 @@
                 <w:sz w:val="24"/>
                 <w:szCs w:val="24"/>
               </w:rPr>
-              <w:t xml:space="preserve">−0.1669***</w:t>
+              <w:t xml:space="preserve">0.0221</w:t>
             </w:r>
           </w:p>
         </w:tc>
@@ -19119,7 +17799,7 @@
                 <w:sz w:val="24"/>
                 <w:szCs w:val="24"/>
               </w:rPr>
-              <w:t xml:space="preserve">0.0221*</w:t>
+              <w:t xml:space="preserve">[−0.0226, 0.0589]</w:t>
             </w:r>
           </w:p>
         </w:tc>
@@ -19144,7 +17824,7 @@
                 <w:sz w:val="24"/>
                 <w:szCs w:val="24"/>
               </w:rPr>
-              <w:t xml:space="preserve">0.0120</w:t>
+              <w:t xml:space="preserve">0.0291</w:t>
             </w:r>
           </w:p>
         </w:tc>
@@ -19169,57 +17849,7 @@
                 <w:sz w:val="24"/>
                 <w:szCs w:val="24"/>
               </w:rPr>
-              <w:t xml:space="preserve">0.076</w:t>
-            </w:r>
-          </w:p>
-        </w:tc>
-        <w:tc>
-          <w:tcPr>
-            <w:tcW w:w="0" w:type="auto"/>
-            <w:hideMark/>
-          </w:tcPr>
-          <w:p>
-            <w:pPr>
-              <w:pStyle w:val="p1a"/>
-              <w:spacing w:line="240" w:lineRule="auto"/>
-              <w:rPr>
-                <w:sz w:val="24"/>
-                <w:szCs w:val="24"/>
-                <w:lang w:bidi="hi-IN"/>
-              </w:rPr>
-            </w:pPr>
-            <w:r>
-              <w:rPr>
-                <w:rFonts w:hint="cs"/>
-                <w:sz w:val="24"/>
-                <w:szCs w:val="24"/>
-              </w:rPr>
-              <w:t xml:space="preserve">0.268</w:t>
-            </w:r>
-          </w:p>
-        </w:tc>
-        <w:tc>
-          <w:tcPr>
-            <w:tcW w:w="0" w:type="auto"/>
-            <w:hideMark/>
-          </w:tcPr>
-          <w:p>
-            <w:pPr>
-              <w:pStyle w:val="p1a"/>
-              <w:spacing w:line="240" w:lineRule="auto"/>
-              <w:rPr>
-                <w:sz w:val="24"/>
-                <w:szCs w:val="24"/>
-                <w:lang w:bidi="hi-IN"/>
-              </w:rPr>
-            </w:pPr>
-            <w:r>
-              <w:rPr>
-                <w:rFonts w:hint="cs"/>
-                <w:sz w:val="24"/>
-                <w:szCs w:val="24"/>
-              </w:rPr>
-              <w:t xml:space="preserve">30</w:t>
+              <w:t xml:space="preserve">[−0.0030, 0.0531]</w:t>
             </w:r>
           </w:p>
         </w:tc>
@@ -19292,7 +17922,7 @@
                 <w:sz w:val="24"/>
                 <w:szCs w:val="24"/>
               </w:rPr>
-              <w:t xml:space="preserve">−0.0117</w:t>
+              <w:t xml:space="preserve">0.0220</w:t>
             </w:r>
           </w:p>
         </w:tc>
@@ -19317,7 +17947,7 @@
                 <w:sz w:val="24"/>
                 <w:szCs w:val="24"/>
               </w:rPr>
-              <w:t xml:space="preserve">0.0220**</w:t>
+              <w:t xml:space="preserve">[−0.0249, 0.0574]</w:t>
             </w:r>
           </w:p>
         </w:tc>
@@ -19342,7 +17972,7 @@
                 <w:sz w:val="24"/>
                 <w:szCs w:val="24"/>
               </w:rPr>
-              <w:t xml:space="preserve">0.0104</w:t>
+              <w:t xml:space="preserve">0.0283</w:t>
             </w:r>
           </w:p>
         </w:tc>
@@ -19367,57 +17997,7 @@
                 <w:sz w:val="24"/>
                 <w:szCs w:val="24"/>
               </w:rPr>
-              <w:t xml:space="preserve">0.043</w:t>
-            </w:r>
-          </w:p>
-        </w:tc>
-        <w:tc>
-          <w:tcPr>
-            <w:tcW w:w="0" w:type="auto"/>
-            <w:hideMark/>
-          </w:tcPr>
-          <w:p>
-            <w:pPr>
-              <w:pStyle w:val="p1a"/>
-              <w:spacing w:line="240" w:lineRule="auto"/>
-              <w:rPr>
-                <w:sz w:val="24"/>
-                <w:szCs w:val="24"/>
-                <w:lang w:bidi="hi-IN"/>
-              </w:rPr>
-            </w:pPr>
-            <w:r>
-              <w:rPr>
-                <w:rFonts w:hint="cs"/>
-                <w:sz w:val="24"/>
-                <w:szCs w:val="24"/>
-              </w:rPr>
-              <w:t xml:space="preserve">0.317</w:t>
-            </w:r>
-          </w:p>
-        </w:tc>
-        <w:tc>
-          <w:tcPr>
-            <w:tcW w:w="0" w:type="auto"/>
-            <w:hideMark/>
-          </w:tcPr>
-          <w:p>
-            <w:pPr>
-              <w:pStyle w:val="p1a"/>
-              <w:spacing w:line="240" w:lineRule="auto"/>
-              <w:rPr>
-                <w:sz w:val="24"/>
-                <w:szCs w:val="24"/>
-                <w:lang w:bidi="hi-IN"/>
-              </w:rPr>
-            </w:pPr>
-            <w:r>
-              <w:rPr>
-                <w:rFonts w:hint="cs"/>
-                <w:sz w:val="24"/>
-                <w:szCs w:val="24"/>
-              </w:rPr>
-              <w:t xml:space="preserve">30</w:t>
+              <w:t xml:space="preserve">[−0.0029, 0.0526]</w:t>
             </w:r>
           </w:p>
         </w:tc>
@@ -19437,7 +18017,20 @@
         <w:rPr>
           <w:rFonts w:hint="cs"/>
         </w:rPr>
-        <w:t xml:space="preserve">Notes: 30 log-spaced scales (5 ≤ s ≤ 5,485); Newey–West HAC standard errors (3 lags). *** p &lt; 0.01, ** p &lt; 0.05, * p &lt; 0.10. Source: Authors’ calculations.</w:t>
+        <w:t xml:space="preserve">Notes: Slopes of ρ</w:t>
+      </w:r>
+      <w:r>
+        <w:rPr>
+          <w:rFonts w:hint="cs"/>
+          <w:vertAlign w:val="subscript"/>
+        </w:rPr>
+        <w:t xml:space="preserve">DCCA</w:t>
+      </w:r>
+      <w:r>
+        <w:rPr>
+          <w:rFonts w:hint="cs"/>
+        </w:rPr>
+        <w:t xml:space="preserve">(s) on ln s; full range: 30 scales from 5 to 5,485 bars; reliable range: s ≤ 444. Brackets: block-bootstrap 95% intervals (499 replications). Source: Authors’ calculations.</w:t>
       </w:r>
     </w:p>
     <w:p>
@@ -19449,7 +18042,7 @@
         <w:rPr>
           <w:rFonts w:hint="cs"/>
         </w:rPr>
-        <w:t>The regression results reveal a pronounced structural asymmetry between nested and disjoint index pairs:</w:t>
+        <w:t xml:space="preserve">The resampling results separate three patterns:</w:t>
       </w:r>
     </w:p>
     <w:p>
@@ -19460,7 +18053,7 @@
         <w:rPr>
           <w:rFonts w:hint="cs"/>
         </w:rPr>
-        <w:t xml:space="preserve">First, for the fully nested pair VN30–VN100, the slope is statistically indistinguishable from zero (0.0001, p = 0.636): because VN30 constituents dominate VN100 capitalization, their mechanical co-movement is invariant to the timescale.</w:t>
+        <w:t xml:space="preserve">First, for the fully nested pair VN30–VN100, the slope is essentially zero in both ranges: because VN30 constituents dominate VN100 capitalization, their mechanical co-movement is invariant to the timescale.</w:t>
       </w:r>
     </w:p>
     <w:p>
@@ -19471,33 +18064,7 @@
         <w:rPr>
           <w:rFonts w:hint="cs"/>
         </w:rPr>
-        <w:t xml:space="preserve">Second, pairs that contain a genuine cross-tier component exhibit significantly positive slopes: VN30–VNINDEX (0.0016, p &lt; 0.001), VN100–VNINDEX (0.0009, p = 0.038) and P</w:t>
-      </w:r>
-      <w:r>
-        <w:rPr>
-          <w:rFonts w:hint="cs"/>
-          <w:vertAlign w:val="subscript"/>
-        </w:rPr>
-        <w:t xml:space="preserve">cap</w:t>
-      </w:r>
-      <w:r>
-        <w:rPr>
-          <w:rFonts w:hint="cs"/>
-        </w:rPr>
-        <w:t xml:space="preserve">–VN30 (0.0025, p = 0.009). As the timescale expands from 30 minutes to multiple trading days, cross-correlation increases systematically. The effect is specific to intraday data: at the daily frequency, the P</w:t>
-      </w:r>
-      <w:r>
-        <w:rPr>
-          <w:rFonts w:hint="cs"/>
-          <w:vertAlign w:val="subscript"/>
-        </w:rPr>
-        <w:t xml:space="preserve">cap</w:t>
-      </w:r>
-      <w:r>
-        <w:rPr>
-          <w:rFonts w:hint="cs"/>
-        </w:rPr>
-        <w:t xml:space="preserve">–VN30 slope is insignificant (0.0014, p = 0.47), whereas VN30–VNINDEX remains significant (0.0020, p &lt; 0.001).</w:t>
+        <w:t xml:space="preserve">Second, the pairs involving the broad market rise significantly with the horizon within the reliable range: VN30–VNINDEX (0.0022, 95% interval [0.0007, 0.0038]) and VN100–VNINDEX (0.0022, [0.0011, 0.0032]). Over the reliable M30 range (5 to 444 bars) this corresponds to a rise of about 0.010 in the correlation. Over the full range, where long scales rest on few segments, the intervals include zero.</w:t>
       </w:r>
     </w:p>
     <w:p>
@@ -19508,46 +18075,20 @@
         <w:rPr>
           <w:rFonts w:hint="cs"/>
         </w:rPr>
-        <w:t xml:space="preserve">Third, for the statistical residual proxies (P</w:t>
+        <w:t xml:space="preserve">Third, the purged mid-cap correlation shows no significant horizon dependence: the P</w:t>
       </w:r>
       <w:r>
         <w:rPr>
           <w:rFonts w:hint="cs"/>
           <w:vertAlign w:val="subscript"/>
         </w:rPr>
-        <w:t xml:space="preserve">heur</w:t>
-      </w:r>
-      <w:r>
-        <w:rPr>
-          <w:rFonts w:hint="cs"/>
-        </w:rPr>
-        <w:t xml:space="preserve">, P</w:t>
-      </w:r>
-      <w:r>
-        <w:rPr>
-          <w:rFonts w:hint="cs"/>
-          <w:vertAlign w:val="subscript"/>
-        </w:rPr>
-        <w:t xml:space="preserve">ratio</w:t>
-      </w:r>
-      <w:r>
-        <w:rPr>
-          <w:rFonts w:hint="cs"/>
-        </w:rPr>
-        <w:t xml:space="preserve">, P</w:t>
-      </w:r>
-      <w:r>
-        <w:rPr>
-          <w:rFonts w:hint="cs"/>
-          <w:vertAlign w:val="subscript"/>
-        </w:rPr>
-        <w:t xml:space="preserve">res</w:t>
-      </w:r>
-      <w:r>
-        <w:rPr>
-          <w:rFonts w:hint="cs"/>
-        </w:rPr>
-        <w:t xml:space="preserve">), the slopes are larger (0.0220–0.0222) but imprecise (p = 0.043–0.076). Because the underlying residual retains short-horizon asynchronous noise, detrending over larger timescales averages out bid–ask bounce and tick mismatch, so the residual covariance with VN30 drifts from negative intraday values toward zero.</w:t>
+        <w:t xml:space="preserve">cap</w:t>
+      </w:r>
+      <w:r>
+        <w:rPr>
+          <w:rFonts w:hint="cs"/>
+        </w:rPr>
+        <w:t xml:space="preserve">–VN30 slope is 0.0025 [−0.0102, 0.0093] over the full range and 0.0017 [−0.0045, 0.0078] over the reliable range. The statistical residual proxies have larger but imprecise slopes, consistent with amplified noise.</w:t>
       </w:r>
     </w:p>
     <w:p>
@@ -19586,7 +18127,7 @@
         <w:rPr>
           <w:rFonts w:hint="cs"/>
         </w:rPr>
-        <w:t xml:space="preserve">This positive scaling behavior is consistent with the joint operation of two complementary economic mechanisms. First, under the Epps (1979) microstructure effect, non-synchronous trades and quote staleness in less liquid mid-cap constituents dampen cross-correlations at ultra-short intraday intervals (fewer than about ten bars). As holding periods lengthen, temporal aggregation synchronizes price discovery across stocks. Second, gradual information diffusion (Hong and Stein 1999) implies horizon-dependent co-movement because institutional investors and market makers trade predominantly in liquid VN30 large caps: market-wide news is reflected immediately in VN30 valuations but diffuses gradually into mid-cap stocks over several trading hours.</w:t>
+        <w:t xml:space="preserve">The horizon dependence of the broad-market pairs is consistent with two complementary mechanisms. Under the Epps (1979) effect, non-synchronous trading in less liquid constituents dampens correlations over the shortest intervals, roughly the first ten bars, and temporal aggregation removes this dampening. Beyond that range, gradual information diffusion (Hong and Stein 1999) can sustain a further rise if prices of different constituents adjust to common news at different speeds. That the purged mid-cap series shows no significant rise suggests that these effects are weaker than index-level sampling noise once the overlap is removed.</w:t>
       </w:r>
     </w:p>
     <w:p>
@@ -19594,7 +18135,7 @@
         <w:jc w:val="both"/>
       </w:pPr>
       <w:r>
-        <w:t xml:space="preserve">A critical identification boundary arises here. Although microstructure frictions (Epps 1979) and gradual information diffusion (Hong and Stein 1999) both imply correlations that rise with the timescale, the two mechanisms are observationally equivalent in index-level closing data. Disentangling transaction delays from cross-firm information diffusion would require tick-by-tick order-book data and firm-level news timestamps, which lie beyond the scope of this study.</w:t>
+        <w:t xml:space="preserve">A critical identification boundary arises here: microstructure frictions and gradual information diffusion are observationally equivalent in index-level closing data. Disentangling them would require tick-by-tick order-book data and firm-level news timestamps, which lie beyond the scope of this study.</w:t>
       </w:r>
     </w:p>
     <w:bookmarkEnd w:id="105"/>
@@ -19641,7 +18182,7 @@
           <w:sz w:val="24"/>
           <w:szCs w:val="24"/>
         </w:rPr>
-        <w:t xml:space="preserve">3.8.1 Full-Range versus Reliable-Range Stability</w:t>
+        <w:t xml:space="preserve">3.8.1 Scaling Slopes at the Other Frequencies</w:t>
       </w:r>
     </w:p>
     <w:p>
@@ -19652,7 +18193,16 @@
         </w:rPr>
       </w:pPr>
       <w:r>
-        <w:t xml:space="preserve">Table 6 compares the scaling slopes estimated over the full scale range with those estimated only over the reliable range (timescales up to 444 bars at M30).</w:t>
+        <w:t xml:space="preserve">Table 6 reports the same slopes at the daily, 1-hour and 4-hour frequencies for the broad-market pair VN30–VNINDEX and the purged pair P</w:t>
+      </w:r>
+      <w:r>
+        <w:rPr>
+          <w:vertAlign w:val="subscript"/>
+        </w:rPr>
+        <w:t xml:space="preserve">cap</w:t>
+      </w:r>
+      <w:r>
+        <w:t xml:space="preserve">–VN30.</w:t>
       </w:r>
     </w:p>
     <w:p>
@@ -19680,7 +18230,7 @@
           <w:sz w:val="24"/>
           <w:szCs w:val="24"/>
         </w:rPr>
-        <w:t xml:space="preserve">Full-range versus reliable-range scaling slopes (M30)</w:t>
+        <w:t xml:space="preserve">Scaling slopes of DCCA coefficients at the daily, 1-hour and 4-hour frequencies</w:t>
       </w:r>
     </w:p>
     <w:tbl>
@@ -19718,13 +18268,11 @@
                 <w:lang w:bidi="hi-IN"/>
               </w:rPr>
             </w:pPr>
-            <w:bookmarkStart w:id="114" w:name="OLE_LINK1"/>
-            <w:r>
-              <w:rPr>
-                <w:rFonts w:hint="cs"/>
-                <w:lang w:bidi="hi-IN"/>
-              </w:rPr>
-              <w:t>Asset Pair</w:t>
+            <w:r>
+              <w:rPr>
+                <w:rFonts w:hint="cs"/>
+              </w:rPr>
+              <w:t xml:space="preserve">Frequency and pair</w:t>
             </w:r>
           </w:p>
         </w:tc>
@@ -19750,7 +18298,7 @@
               <w:rPr>
                 <w:rFonts w:hint="cs"/>
               </w:rPr>
-              <w:t xml:space="preserve">Full-range Slope (N = 30)</w:t>
+              <w:t xml:space="preserve">Full-range slope [95% CI]</w:t>
             </w:r>
           </w:p>
         </w:tc>
@@ -19776,7 +18324,7 @@
               <w:rPr>
                 <w:rFonts w:hint="cs"/>
               </w:rPr>
-              <w:t xml:space="preserve">Reliable-range Slope (N = 19)</w:t>
+              <w:t xml:space="preserve">Reliable-range slope [95% CI]</w:t>
             </w:r>
           </w:p>
         </w:tc>
@@ -19801,9 +18349,8 @@
             <w:r>
               <w:rPr>
                 <w:rFonts w:hint="cs"/>
-                <w:lang w:bidi="hi-IN"/>
-              </w:rPr>
-              <w:t>Stability Assessment</w:t>
+              </w:rPr>
+              <w:t xml:space="preserve">Assessment</w:t>
             </w:r>
           </w:p>
         </w:tc>
@@ -19835,7 +18382,7 @@
               <w:rPr>
                 <w:rFonts w:hint="cs"/>
               </w:rPr>
-              <w:t xml:space="preserve">VN30–VNINDEX</w:t>
+              <w:t xml:space="preserve">Daily: VN30–VNINDEX</w:t>
             </w:r>
           </w:p>
         </w:tc>
@@ -19861,7 +18408,7 @@
               <w:rPr>
                 <w:rFonts w:hint="cs"/>
               </w:rPr>
-              <w:t xml:space="preserve">0.0016*** </w:t>
+              <w:t xml:space="preserve">0.0020</w:t>
             </w:r>
           </w:p>
           <w:p>
@@ -19876,7 +18423,7 @@
               <w:rPr>
                 <w:rFonts w:hint="cs"/>
               </w:rPr>
-              <w:t xml:space="preserve">(0.0004)</w:t>
+              <w:t xml:space="preserve">[−0.0064, 0.0043]</w:t>
             </w:r>
           </w:p>
         </w:tc>
@@ -19902,7 +18449,7 @@
               <w:rPr>
                 <w:rFonts w:hint="cs"/>
               </w:rPr>
-              <w:t xml:space="preserve">0.0022*** </w:t>
+              <w:t xml:space="preserve">0.0010</w:t>
             </w:r>
           </w:p>
           <w:p>
@@ -19917,7 +18464,7 @@
               <w:rPr>
                 <w:rFonts w:hint="cs"/>
               </w:rPr>
-              <w:t xml:space="preserve">(0.0005)</w:t>
+              <w:t xml:space="preserve">[−0.0031, 0.0043]</w:t>
             </w:r>
           </w:p>
         </w:tc>
@@ -19943,7 +18490,7 @@
               <w:rPr>
                 <w:rFonts w:hint="cs"/>
               </w:rPr>
-              <w:t xml:space="preserve">Stable</w:t>
+              <w:t xml:space="preserve">Flat</w:t>
             </w:r>
           </w:p>
         </w:tc>
@@ -19975,7 +18522,20 @@
               <w:rPr>
                 <w:rFonts w:hint="cs"/>
               </w:rPr>
-              <w:t xml:space="preserve">VN100–VNINDEX</w:t>
+              <w:t xml:space="preserve">Daily: P</w:t>
+            </w:r>
+            <w:r>
+              <w:rPr>
+                <w:rFonts w:hint="cs"/>
+                <w:vertAlign w:val="subscript"/>
+              </w:rPr>
+              <w:t xml:space="preserve">cap</w:t>
+            </w:r>
+            <w:r>
+              <w:rPr>
+                <w:rFonts w:hint="cs"/>
+              </w:rPr>
+              <w:t xml:space="preserve">–VN30</w:t>
             </w:r>
           </w:p>
         </w:tc>
@@ -20001,7 +18561,7 @@
               <w:rPr>
                 <w:rFonts w:hint="cs"/>
               </w:rPr>
-              <w:t xml:space="preserve">0.0009** </w:t>
+              <w:t xml:space="preserve">0.0014</w:t>
             </w:r>
           </w:p>
           <w:p>
@@ -20016,7 +18576,7 @@
               <w:rPr>
                 <w:rFonts w:hint="cs"/>
               </w:rPr>
-              <w:t xml:space="preserve">(0.0004)</w:t>
+              <w:t xml:space="preserve">[−0.0255, 0.0118]</w:t>
             </w:r>
           </w:p>
         </w:tc>
@@ -20042,7 +18602,7 @@
               <w:rPr>
                 <w:rFonts w:hint="cs"/>
               </w:rPr>
-              <w:t xml:space="preserve">0.0022*** </w:t>
+              <w:t xml:space="preserve">−0.0040</w:t>
             </w:r>
           </w:p>
           <w:p>
@@ -20057,7 +18617,7 @@
               <w:rPr>
                 <w:rFonts w:hint="cs"/>
               </w:rPr>
-              <w:t xml:space="preserve">(0.0004)</w:t>
+              <w:t xml:space="preserve">[−0.0157, 0.0085]</w:t>
             </w:r>
           </w:p>
         </w:tc>
@@ -20083,7 +18643,7 @@
               <w:rPr>
                 <w:rFonts w:hint="cs"/>
               </w:rPr>
-              <w:t xml:space="preserve">Stable</w:t>
+              <w:t xml:space="preserve">Flat</w:t>
             </w:r>
           </w:p>
         </w:tc>
@@ -20115,7 +18675,7 @@
               <w:rPr>
                 <w:rFonts w:hint="cs"/>
               </w:rPr>
-              <w:t xml:space="preserve">VN30–VN100</w:t>
+              <w:t xml:space="preserve">1-hour: VN30–VNINDEX</w:t>
             </w:r>
           </w:p>
         </w:tc>
@@ -20141,7 +18701,7 @@
               <w:rPr>
                 <w:rFonts w:hint="cs"/>
               </w:rPr>
-              <w:t xml:space="preserve">0.0001 </w:t>
+              <w:t xml:space="preserve">0.0015</w:t>
             </w:r>
           </w:p>
           <w:p>
@@ -20156,7 +18716,7 @@
               <w:rPr>
                 <w:rFonts w:hint="cs"/>
               </w:rPr>
-              <w:t xml:space="preserve">(0.0002)</w:t>
+              <w:t xml:space="preserve">[−0.0027, 0.0040]</w:t>
             </w:r>
           </w:p>
         </w:tc>
@@ -20182,7 +18742,7 @@
               <w:rPr>
                 <w:rFonts w:hint="cs"/>
               </w:rPr>
-              <w:t xml:space="preserve">−0.0001 </w:t>
+              <w:t xml:space="preserve">0.0024</w:t>
             </w:r>
           </w:p>
           <w:p>
@@ -20197,7 +18757,7 @@
               <w:rPr>
                 <w:rFonts w:hint="cs"/>
               </w:rPr>
-              <w:t xml:space="preserve">(0.0001)</w:t>
+              <w:t xml:space="preserve">[0.0006, 0.0041]</w:t>
             </w:r>
           </w:p>
         </w:tc>
@@ -20223,7 +18783,7 @@
               <w:rPr>
                 <w:rFonts w:hint="cs"/>
               </w:rPr>
-              <w:t xml:space="preserve">Flat</w:t>
+              <w:t xml:space="preserve">Rises (reliable range)</w:t>
             </w:r>
           </w:p>
         </w:tc>
@@ -20255,7 +18815,7 @@
               <w:rPr>
                 <w:rFonts w:hint="cs"/>
               </w:rPr>
-              <w:t xml:space="preserve">P</w:t>
+              <w:t xml:space="preserve">1-hour: P</w:t>
             </w:r>
             <w:r>
               <w:rPr>
@@ -20294,7 +18854,7 @@
               <w:rPr>
                 <w:rFonts w:hint="cs"/>
               </w:rPr>
-              <w:t xml:space="preserve">0.0025*** </w:t>
+              <w:t xml:space="preserve">−0.0003</w:t>
             </w:r>
           </w:p>
           <w:p>
@@ -20309,7 +18869,7 @@
               <w:rPr>
                 <w:rFonts w:hint="cs"/>
               </w:rPr>
-              <w:t xml:space="preserve">(0.0009)</w:t>
+              <w:t xml:space="preserve">[−0.0137, 0.0089]</w:t>
             </w:r>
           </w:p>
         </w:tc>
@@ -20335,7 +18895,7 @@
               <w:rPr>
                 <w:rFonts w:hint="cs"/>
               </w:rPr>
-              <w:t xml:space="preserve">0.0017 </w:t>
+              <w:t xml:space="preserve">0.0020</w:t>
             </w:r>
           </w:p>
           <w:p>
@@ -20350,7 +18910,7 @@
               <w:rPr>
                 <w:rFonts w:hint="cs"/>
               </w:rPr>
-              <w:t xml:space="preserve">(0.0010)</w:t>
+              <w:t xml:space="preserve">[−0.0035, 0.0089]</w:t>
             </w:r>
           </w:p>
         </w:tc>
@@ -20376,7 +18936,7 @@
               <w:rPr>
                 <w:rFonts w:hint="cs"/>
               </w:rPr>
-              <w:t xml:space="preserve">Weakens</w:t>
+              <w:t xml:space="preserve">Flat</w:t>
             </w:r>
           </w:p>
         </w:tc>
@@ -20408,20 +18968,7 @@
               <w:rPr>
                 <w:rFonts w:hint="cs"/>
               </w:rPr>
-              <w:t xml:space="preserve">P</w:t>
-            </w:r>
-            <w:r>
-              <w:rPr>
-                <w:rFonts w:hint="cs"/>
-                <w:vertAlign w:val="subscript"/>
-              </w:rPr>
-              <w:t xml:space="preserve">heur</w:t>
-            </w:r>
-            <w:r>
-              <w:rPr>
-                <w:rFonts w:hint="cs"/>
-              </w:rPr>
-              <w:t xml:space="preserve">–VN30</w:t>
+              <w:t xml:space="preserve">4-hour: VN30–VNINDEX</w:t>
             </w:r>
           </w:p>
         </w:tc>
@@ -20447,7 +18994,7 @@
               <w:rPr>
                 <w:rFonts w:hint="cs"/>
               </w:rPr>
-              <w:t xml:space="preserve">0.0222* </w:t>
+              <w:t xml:space="preserve">0.0014</w:t>
             </w:r>
           </w:p>
           <w:p>
@@ -20462,7 +19009,7 @@
               <w:rPr>
                 <w:rFonts w:hint="cs"/>
               </w:rPr>
-              <w:t xml:space="preserve">(0.0112)</w:t>
+              <w:t xml:space="preserve">[−0.0056, 0.0039]</w:t>
             </w:r>
           </w:p>
         </w:tc>
@@ -20488,7 +19035,7 @@
               <w:rPr>
                 <w:rFonts w:hint="cs"/>
               </w:rPr>
-              <w:t xml:space="preserve">0.0289*** </w:t>
+              <w:t xml:space="preserve">0.0003</w:t>
             </w:r>
           </w:p>
           <w:p>
@@ -20503,7 +19050,7 @@
               <w:rPr>
                 <w:rFonts w:hint="cs"/>
               </w:rPr>
-              <w:t xml:space="preserve">(0.0052)</w:t>
+              <w:t xml:space="preserve">[−0.0026, 0.0029]</w:t>
             </w:r>
           </w:p>
         </w:tc>
@@ -20529,7 +19076,7 @@
               <w:rPr>
                 <w:rFonts w:hint="cs"/>
               </w:rPr>
-              <w:t xml:space="preserve">Strengthens</w:t>
+              <w:t xml:space="preserve">Flat</w:t>
             </w:r>
           </w:p>
         </w:tc>
@@ -20561,14 +19108,14 @@
               <w:rPr>
                 <w:rFonts w:hint="cs"/>
               </w:rPr>
-              <w:t xml:space="preserve">P</w:t>
+              <w:t xml:space="preserve">4-hour: P</w:t>
             </w:r>
             <w:r>
               <w:rPr>
                 <w:rFonts w:hint="cs"/>
                 <w:vertAlign w:val="subscript"/>
               </w:rPr>
-              <w:t xml:space="preserve">ratio</w:t>
+              <w:t xml:space="preserve">cap</w:t>
             </w:r>
             <w:r>
               <w:rPr>
@@ -20600,7 +19147,7 @@
               <w:rPr>
                 <w:rFonts w:hint="cs"/>
               </w:rPr>
-              <w:t xml:space="preserve">0.0221* </w:t>
+              <w:t xml:space="preserve">0.0001</w:t>
             </w:r>
           </w:p>
           <w:p>
@@ -20615,7 +19162,7 @@
               <w:rPr>
                 <w:rFonts w:hint="cs"/>
               </w:rPr>
-              <w:t xml:space="preserve">(0.0120)</w:t>
+              <w:t xml:space="preserve">[−0.0176, 0.0103]</w:t>
             </w:r>
           </w:p>
         </w:tc>
@@ -20641,7 +19188,7 @@
               <w:rPr>
                 <w:rFonts w:hint="cs"/>
               </w:rPr>
-              <w:t xml:space="preserve">0.0291*** </w:t>
+              <w:t xml:space="preserve">−0.0020</w:t>
             </w:r>
           </w:p>
           <w:p>
@@ -20656,7 +19203,7 @@
               <w:rPr>
                 <w:rFonts w:hint="cs"/>
               </w:rPr>
-              <w:t xml:space="preserve">(0.0050)</w:t>
+              <w:t xml:space="preserve">[−0.0124, 0.0067]</w:t>
             </w:r>
           </w:p>
         </w:tc>
@@ -20682,160 +19229,7 @@
               <w:rPr>
                 <w:rFonts w:hint="cs"/>
               </w:rPr>
-              <w:t xml:space="preserve">Strengthens</w:t>
-            </w:r>
-          </w:p>
-        </w:tc>
-      </w:tr>
-      <w:tr>
-        <w:trPr>
-          <w:trHeight w:val="420"/>
-        </w:trPr>
-        <w:tc>
-          <w:tcPr>
-            <w:tcW w:w="2011" w:type="dxa"/>
-            <w:tcBorders>
-              <w:top w:val="single" w:sz="4" w:space="0" w:color="auto"/>
-              <w:left w:val="single" w:sz="4" w:space="0" w:color="auto"/>
-              <w:bottom w:val="single" w:sz="4" w:space="0" w:color="auto"/>
-              <w:right w:val="single" w:sz="4" w:space="0" w:color="auto"/>
-            </w:tcBorders>
-            <w:hideMark/>
-          </w:tcPr>
-          <w:p>
-            <w:pPr>
-              <w:suppressAutoHyphens/>
-              <w:jc w:val="both"/>
-              <w:rPr>
-                <w:lang w:bidi="hi-IN"/>
-              </w:rPr>
-            </w:pPr>
-            <w:r>
-              <w:rPr>
-                <w:rFonts w:hint="cs"/>
-              </w:rPr>
-              <w:t xml:space="preserve">P</w:t>
-            </w:r>
-            <w:r>
-              <w:rPr>
-                <w:rFonts w:hint="cs"/>
-                <w:vertAlign w:val="subscript"/>
-              </w:rPr>
-              <w:t xml:space="preserve">res</w:t>
-            </w:r>
-            <w:r>
-              <w:rPr>
-                <w:rFonts w:hint="cs"/>
-              </w:rPr>
-              <w:t xml:space="preserve">–VN30</w:t>
-            </w:r>
-          </w:p>
-        </w:tc>
-        <w:tc>
-          <w:tcPr>
-            <w:tcW w:w="2396" w:type="dxa"/>
-            <w:tcBorders>
-              <w:top w:val="single" w:sz="4" w:space="0" w:color="auto"/>
-              <w:left w:val="single" w:sz="4" w:space="0" w:color="auto"/>
-              <w:bottom w:val="single" w:sz="4" w:space="0" w:color="auto"/>
-              <w:right w:val="single" w:sz="4" w:space="0" w:color="auto"/>
-            </w:tcBorders>
-            <w:hideMark/>
-          </w:tcPr>
-          <w:p>
-            <w:pPr>
-              <w:jc w:val="both"/>
-              <w:rPr>
-                <w:lang w:val="vi-VN" w:bidi="hi-IN"/>
-              </w:rPr>
-            </w:pPr>
-            <w:r>
-              <w:rPr>
-                <w:rFonts w:hint="cs"/>
-              </w:rPr>
-              <w:t xml:space="preserve">0.0220** </w:t>
-            </w:r>
-          </w:p>
-          <w:p>
-            <w:pPr>
-              <w:suppressAutoHyphens/>
-              <w:jc w:val="both"/>
-              <w:rPr>
-                <w:lang w:bidi="hi-IN"/>
-              </w:rPr>
-            </w:pPr>
-            <w:r>
-              <w:rPr>
-                <w:rFonts w:hint="cs"/>
-              </w:rPr>
-              <w:t xml:space="preserve">(0.0104)</w:t>
-            </w:r>
-          </w:p>
-        </w:tc>
-        <w:tc>
-          <w:tcPr>
-            <w:tcW w:w="2754" w:type="dxa"/>
-            <w:tcBorders>
-              <w:top w:val="single" w:sz="4" w:space="0" w:color="auto"/>
-              <w:left w:val="single" w:sz="4" w:space="0" w:color="auto"/>
-              <w:bottom w:val="single" w:sz="4" w:space="0" w:color="auto"/>
-              <w:right w:val="single" w:sz="4" w:space="0" w:color="auto"/>
-            </w:tcBorders>
-            <w:hideMark/>
-          </w:tcPr>
-          <w:p>
-            <w:pPr>
-              <w:jc w:val="both"/>
-              <w:rPr>
-                <w:lang w:val="vi-VN" w:bidi="hi-IN"/>
-              </w:rPr>
-            </w:pPr>
-            <w:r>
-              <w:rPr>
-                <w:rFonts w:hint="cs"/>
-              </w:rPr>
-              <w:t xml:space="preserve">0.0283*** </w:t>
-            </w:r>
-          </w:p>
-          <w:p>
-            <w:pPr>
-              <w:suppressAutoHyphens/>
-              <w:jc w:val="both"/>
-              <w:rPr>
-                <w:lang w:bidi="hi-IN"/>
-              </w:rPr>
-            </w:pPr>
-            <w:r>
-              <w:rPr>
-                <w:rFonts w:hint="cs"/>
-              </w:rPr>
-              <w:t xml:space="preserve">(0.0054)</w:t>
-            </w:r>
-          </w:p>
-        </w:tc>
-        <w:tc>
-          <w:tcPr>
-            <w:tcW w:w="2093" w:type="dxa"/>
-            <w:tcBorders>
-              <w:top w:val="single" w:sz="4" w:space="0" w:color="auto"/>
-              <w:left w:val="single" w:sz="4" w:space="0" w:color="auto"/>
-              <w:bottom w:val="single" w:sz="4" w:space="0" w:color="auto"/>
-              <w:right w:val="single" w:sz="4" w:space="0" w:color="auto"/>
-            </w:tcBorders>
-            <w:hideMark/>
-          </w:tcPr>
-          <w:p>
-            <w:pPr>
-              <w:jc w:val="both"/>
-              <w:rPr>
-                <w:lang w:bidi="hi-IN"/>
-              </w:rPr>
-            </w:pPr>
-            <w:r>
-              <w:rPr>
-                <w:rFonts w:hint="cs"/>
-              </w:rPr>
-              <w:t xml:space="preserve">Stable</w:t>
+              <w:t xml:space="preserve">Flat</w:t>
             </w:r>
           </w:p>
         </w:tc>
@@ -20853,7 +19247,7 @@
         <w:rPr>
           <w:rFonts w:hint="cs"/>
         </w:rPr>
-        <w:t xml:space="preserve">Notes: HAC standard errors in parentheses. *** p &lt; 0.01, ** p &lt; 0.05, * p &lt; 0.10. Source: Authors’ calculations.</w:t>
+        <w:t xml:space="preserve">Notes: Block-bootstrap 95% intervals (499 replications); reliable ranges from Table 3 (Gaussian). Source: Authors’ calculations.</w:t>
       </w:r>
     </w:p>
     <w:bookmarkEnd w:id="114"/>
@@ -20862,7 +19256,7 @@
         <w:jc w:val="both"/>
       </w:pPr>
       <w:r>
-        <w:t xml:space="preserve">The positive slopes of VN30–VNINDEX and VN100–VNINDEX strengthen in the reliable range (0.0022, p &lt; 0.001 for both), and VN30–VN100 remains flat. For P</w:t>
+        <w:t xml:space="preserve">At the 1-hour frequency, VN30–VNINDEX again rises significantly within the reliable range (0.0024, [0.0006, 0.0041]), whereas at the daily and 4-hour frequencies no slope is distinguishable from zero. The P</w:t>
       </w:r>
       <w:r>
         <w:rPr>
@@ -20871,7 +19265,7 @@
         <w:t xml:space="preserve">cap</w:t>
       </w:r>
       <w:r>
-        <w:t xml:space="preserve">–VN30, the reliable-range slope keeps its positive sign (0.0017) but is less precisely estimated (p = 0.102). The horizon dependence of purged mid-cap co-movement is therefore robust in sign but relies partly on the longer, noisier scales, and we interpret it as suggestive; the multiscale evidence for the broad-market pairs is robust.</w:t>
+        <w:t xml:space="preserve">–VN30 slope is insignificant at every frequency. The horizon dependence documented in this study is therefore confined to broad-market pairs at the two shortest intraday frequencies.</w:t>
       </w:r>
     </w:p>
     <w:p>
@@ -21150,7 +19544,7 @@
                 <w:sz w:val="24"/>
                 <w:szCs w:val="24"/>
               </w:rPr>
-              <w:t xml:space="preserve"> (M30)</w:t>
+              <w:t xml:space="preserve"> (M30, full range)</w:t>
             </w:r>
           </w:p>
         </w:tc>
@@ -21331,7 +19725,7 @@
                 <w:sz w:val="24"/>
                 <w:szCs w:val="24"/>
               </w:rPr>
-              <w:t xml:space="preserve">0.0014*</w:t>
+              <w:t xml:space="preserve">0.0014</w:t>
             </w:r>
           </w:p>
         </w:tc>
@@ -21362,7 +19756,7 @@
                 <w:sz w:val="24"/>
                 <w:szCs w:val="24"/>
               </w:rPr>
-              <w:t xml:space="preserve">0.897</w:t>
+              <w:t xml:space="preserve">0.899</w:t>
             </w:r>
           </w:p>
         </w:tc>
@@ -21393,7 +19787,7 @@
                 <w:sz w:val="24"/>
                 <w:szCs w:val="24"/>
               </w:rPr>
-              <w:t xml:space="preserve">0.951</w:t>
+              <w:t xml:space="preserve">0.952</w:t>
             </w:r>
           </w:p>
         </w:tc>
@@ -21492,7 +19886,7 @@
                 <w:sz w:val="24"/>
                 <w:szCs w:val="24"/>
               </w:rPr>
-              <w:t xml:space="preserve">0.0019**</w:t>
+              <w:t xml:space="preserve">0.0019</w:t>
             </w:r>
           </w:p>
         </w:tc>
@@ -21523,7 +19917,7 @@
                 <w:sz w:val="24"/>
                 <w:szCs w:val="24"/>
               </w:rPr>
-              <w:t xml:space="preserve">0.869</w:t>
+              <w:t xml:space="preserve">0.871</w:t>
             </w:r>
           </w:p>
         </w:tc>
@@ -21554,7 +19948,7 @@
                 <w:sz w:val="24"/>
                 <w:szCs w:val="24"/>
               </w:rPr>
-              <w:t xml:space="preserve">0.936</w:t>
+              <w:t xml:space="preserve">0.937</w:t>
             </w:r>
           </w:p>
         </w:tc>
@@ -21653,7 +20047,7 @@
                 <w:sz w:val="24"/>
                 <w:szCs w:val="24"/>
               </w:rPr>
-              <w:t xml:space="preserve">0.0025***</w:t>
+              <w:t xml:space="preserve">0.0025</w:t>
             </w:r>
           </w:p>
         </w:tc>
@@ -21684,7 +20078,7 @@
                 <w:sz w:val="24"/>
                 <w:szCs w:val="24"/>
               </w:rPr>
-              <w:t xml:space="preserve">0.844</w:t>
+              <w:t xml:space="preserve">0.847</w:t>
             </w:r>
           </w:p>
         </w:tc>
@@ -21814,7 +20208,7 @@
                 <w:sz w:val="24"/>
                 <w:szCs w:val="24"/>
               </w:rPr>
-              <w:t xml:space="preserve">0.0033***</w:t>
+              <w:t xml:space="preserve">0.0033</w:t>
             </w:r>
           </w:p>
         </w:tc>
@@ -21845,7 +20239,7 @@
                 <w:sz w:val="24"/>
                 <w:szCs w:val="24"/>
               </w:rPr>
-              <w:t xml:space="preserve">0.806</w:t>
+              <w:t xml:space="preserve">0.812</w:t>
             </w:r>
           </w:p>
         </w:tc>
@@ -21975,7 +20369,7 @@
                 <w:sz w:val="24"/>
                 <w:szCs w:val="24"/>
               </w:rPr>
-              <w:t xml:space="preserve">0.0043***</w:t>
+              <w:t xml:space="preserve">0.0043</w:t>
             </w:r>
           </w:p>
         </w:tc>
@@ -22006,7 +20400,7 @@
                 <w:sz w:val="24"/>
                 <w:szCs w:val="24"/>
               </w:rPr>
-              <w:t xml:space="preserve">0.767</w:t>
+              <w:t xml:space="preserve">0.775</w:t>
             </w:r>
           </w:p>
         </w:tc>
@@ -22037,7 +20431,7 @@
                 <w:sz w:val="24"/>
                 <w:szCs w:val="24"/>
               </w:rPr>
-              <w:t xml:space="preserve">0.883</w:t>
+              <w:t xml:space="preserve">0.881</w:t>
             </w:r>
           </w:p>
         </w:tc>
@@ -22081,7 +20475,7 @@
         <w:rPr>
           <w:rFonts w:hint="cs"/>
         </w:rPr>
-        <w:t xml:space="preserve"> use the chronological regimes (Table 4, Panel A). *** p &lt; 0.01, ** p &lt; 0.05, * p &lt; 0.10. Source: Authors’ calculations.</w:t>
+        <w:t xml:space="preserve"> are Pearson correlations in the chronological regimes (Table 4, Panel A); slopes are point estimates (inference in Table 5). Source: Authors’ calculations.</w:t>
       </w:r>
     </w:p>
     <w:p>
@@ -22105,7 +20499,7 @@
         <w:rPr>
           <w:rFonts w:hint="cs"/>
         </w:rPr>
-        <w:t xml:space="preserve">–VN30 correlation (from 0.924 at a weight of 0.60 to 0.824 at 0.75). The central conclusions are nevertheless invariant: in every specification, the P</w:t>
+        <w:t xml:space="preserve">–VN30 correlation (from 0.924 at a weight of 0.60 to 0.824 at 0.75). The level of the purged correlation is thus conditional on the assumed weight, but the qualitative conclusions are not: in every specification the P</w:t>
       </w:r>
       <w:r>
         <w:rPr>
@@ -22118,7 +20512,7 @@
         <w:rPr>
           <w:rFonts w:hint="cs"/>
         </w:rPr>
-        <w:t xml:space="preserve"> correlation remains at least 0.052 below the 0.977 average of the nested daily pairs, the M30 scaling slope remains positive (significant at the 5% level for weights of at least 0.65 and at the 10% level for 0.60), and raw crisis tightening (0.053–0.117) remains modest relative to the accompanying volatility expansion.</w:t>
+        <w:t xml:space="preserve"> correlation remains at least 0.052 below the 0.977 average of the nested daily pairs, and the raw crisis tightening (0.053–0.106) remains modest relative to the accompanying volatility expansion.</w:t>
       </w:r>
     </w:p>
     <w:p>
@@ -22142,83 +20536,8 @@
           <w:rFonts w:hint="cs"/>
           <w:szCs w:val="24"/>
         </w:rPr>
-        <w:t xml:space="preserve">4 Discussion and Conclusion</w:t>
-      </w:r>
-    </w:p>
-    <w:p>
-      <w:pPr>
-        <w:jc w:val="both"/>
-      </w:pPr>
-      <w:r>
-        <w:rPr>
-          <w:rFonts w:hint="cs"/>
-        </w:rPr>
-        <w:t xml:space="preserve">This study econometrically examines multiscale cross-correlation dynamics and constituent overlap distortion among nested equity benchmarks in Vietnam. By deploying detrended cross-correlation analysis and its multifractal extension across intraday and daily trading horizons, the mechanical influence of shared capitalization is disentangled from genuine economic co-movement.</w:t>
-      </w:r>
-    </w:p>
-    <w:p>
-      <w:pPr>
-        <w:jc w:val="both"/>
-      </w:pPr>
-      <w:r>
-        <w:rPr>
-          <w:rFonts w:hint="cs"/>
-        </w:rPr>
-        <w:t xml:space="preserve">The empirical analysis provides three core insights:</w:t>
-      </w:r>
-    </w:p>
-    <w:p>
-      <w:pPr>
-        <w:jc w:val="both"/>
-      </w:pPr>
-    </w:p>
-    <w:p>
-      <w:pPr>
-        <w:jc w:val="both"/>
-      </w:pPr>
-      <w:r>
-        <w:rPr>
-          <w:rFonts w:hint="cs"/>
-        </w:rPr>
-        <w:t xml:space="preserve">First, conventional index pairs that embed large-cap constituents within broader benchmarks exhibit elevated cross-correlations attributable predominantly to index engineering rather than economic integration. Purging shared constituent capitalization through a market-weighted proxy uncovers a baseline co-movement about 0.09 correlation points lower. At intraday frequencies, cross-tier co-movement tends to be horizon-dependent: short-scale correlations are dampened by microstructure frictions and asynchronous quoting, while longer-horizon correlations strengthen as market-wide news diffuses across liquidity tiers.</w:t>
-      </w:r>
-    </w:p>
-    <w:p>
-      <w:pPr>
-        <w:jc w:val="both"/>
-      </w:pPr>
-    </w:p>
-    <w:p>
-      <w:pPr>
-        <w:jc w:val="both"/>
-      </w:pPr>
-      <w:r>
-        <w:rPr>
-          <w:rFonts w:hint="cs"/>
-        </w:rPr>
-        <w:t xml:space="preserve">Second, volatility conditioning shows that the tightening of cross-tier co-movement during market turmoil is explained by volatility expansion rather than by a structural break in the large-cap/mid-cap linkage. Systemic stress raises volatility across capitalization tiers, so diversification benefits shrink precisely when they are most needed even though the underlying dependence structure is stable.</w:t>
-      </w:r>
-    </w:p>
-    <w:p>
-      <w:pPr>
-        <w:jc w:val="both"/>
-      </w:pPr>
-    </w:p>
-    <w:p>
-      <w:pPr>
-        <w:jc w:val="both"/>
-      </w:pPr>
-      <w:r>
-        <w:rPr>
-          <w:rFonts w:hint="cs"/>
-        </w:rPr>
-        <w:t xml:space="preserve">Third, while cash portfolios composed of nested parent–child indices experience negligible variance misstatement, unadjusted static models materially misstate risk for mid-cap factor exposures. In calm market environments, conventional models overstate mid-cap portfolio variance by up to 15.6%, leading to inefficient hedging capital allocations; during market crises, they understate portfolio variance when volatility itself has multiplied.</w:t>
-      </w:r>
-    </w:p>
-    <w:p>
-      <w:pPr>
-        <w:jc w:val="both"/>
-      </w:pPr>
+        <w:t xml:space="preserve">4 Discussion</w:t>
+      </w:r>
     </w:p>
     <w:p>
       <w:pPr>
@@ -22240,13 +20559,19 @@
           <w:sz w:val="24"/>
           <w:szCs w:val="24"/>
         </w:rPr>
-        <w:t xml:space="preserve">4.1 Implications for ASEAN Capital Markets</w:t>
+        <w:t xml:space="preserve">4.1 Principal Findings</w:t>
       </w:r>
     </w:p>
     <w:p>
       <w:pPr>
         <w:jc w:val="both"/>
       </w:pPr>
+      <w:r>
+        <w:rPr>
+          <w:rFonts w:hint="cs"/>
+        </w:rPr>
+        <w:t xml:space="preserve">This study econometrically examines multiscale cross-correlation dynamics and constituent overlap distortion among nested equity benchmarks in Vietnam. By deploying detrended cross-correlation analysis and its multifractal extension across intraday and daily trading horizons, the mechanical influence of shared capitalization is disentangled from genuine economic co-movement.</w:t>
+      </w:r>
     </w:p>
     <w:p>
       <w:pPr>
@@ -22256,7 +20581,7 @@
         <w:rPr>
           <w:rFonts w:hint="cs"/>
         </w:rPr>
-        <w:t>These findings carry concrete implications for institutional investors, index providers, and regulatory authorities across Southeast Asia.</w:t>
+        <w:t xml:space="preserve">The empirical analysis provides three core insights:</w:t>
       </w:r>
     </w:p>
     <w:p>
@@ -22272,7 +20597,7 @@
         <w:rPr>
           <w:rFonts w:hint="cs"/>
         </w:rPr>
-        <w:t xml:space="preserve">For institutional portfolio management, asset allocators operating in ASEAN markets (such as Malaysian institutional funds, regional pension managers, and private wealth allocators) must recognize that blending large-cap and broad-market parent-child indices offers negligible diversification benefits. When constructing multi-capitalization strategies, risk managers should replace static correlation assumptions with volatility-regime-conditioned covariance frameworks that recognize both overstated risk in tranquil periods and elevated co-movement during market distress.</w:t>
+        <w:t xml:space="preserve">First, index pairs that embed large-cap constituents within broader benchmarks exhibit cross-correlations inflated by index engineering. Purging shared constituent capitalization through a market-weighted proxy lowers the correlation by about 0.09, a robust gap, although the purged co-movement remains high. Horizon dependence is confined to broad-market pairs at the shortest intraday frequencies; the purged mid-cap correlation is statistically flat across horizons.</w:t>
       </w:r>
     </w:p>
     <w:p>
@@ -22288,7 +20613,7 @@
         <w:rPr>
           <w:rFonts w:hint="cs"/>
         </w:rPr>
-        <w:t xml:space="preserve">Regarding index architecture and product innovation, stock exchanges and index providers across emerging Southeast Asian markets should prioritize the development and promotion of standalone, non-overlapping segment benchmarks. On the Ho Chi Minh City Stock Exchange, listing dedicated mid-cap exchange-traded funds based on standalone benchmarks such as VNMIDCAP (VN70) provides transparent building blocks for institutional factor allocation, helping allocators avoid the hidden overlaps inherent in headline index blends.</w:t>
+        <w:t xml:space="preserve">Second, once volatility is conditioned on, there is no evidence that cross-tier co-movement rises structurally during market turmoil. Systemic stress raises volatility across capitalization tiers, so diversification benefits shrink when they are most needed even though the underlying dependence appears stable; small structural increases cannot be excluded given the power of the test.</w:t>
       </w:r>
     </w:p>
     <w:p>
@@ -22304,7 +20629,7 @@
         <w:rPr>
           <w:rFonts w:hint="cs"/>
         </w:rPr>
-        <w:t>Finally, for market development and risk mitigation, expanding derivative product suites beyond large-cap index futures to include mid-cap and sector contracts would substantially enhance market completeness. Providing tradeable hedging instruments across multiple capitalization tiers enables institutional investors to manage cross-tier exposure without destabilizing underlying cash equity positions during periods of market stress.</w:t>
+        <w:t xml:space="preserve">Third, cash portfolios composed of nested parent–child indices experience negligible variance misstatement, whereas static correlations materially misstate the risk of mid-cap factor exposures: in-sample, they overstate variance by 2.2–9.4% in calm regimes and understate it by about 2% during crises.</w:t>
       </w:r>
     </w:p>
     <w:p>
@@ -22332,103 +20657,257 @@
           <w:sz w:val="24"/>
           <w:szCs w:val="24"/>
         </w:rPr>
-        <w:t xml:space="preserve">4.2 Limitations and Future Research</w:t>
+        <w:t xml:space="preserve">4.2 Implications for Capital Markets</w:t>
       </w:r>
     </w:p>
     <w:p>
       <w:pPr>
         <w:jc w:val="both"/>
       </w:pPr>
-      <w:r>
-        <w:rPr>
-          <w:rFonts w:hint="cs"/>
-        </w:rPr>
-        <w:t xml:space="preserve">This study has limitations that suggest directions for future research. First, the mid-cap segment is identified through a capitalization-weighted decomposition based on a single factsheet snapshot of free-float weights. Although Section 3.8.2 shows that the conclusions are robust to weights between 0.60 and 0.75, validating the proxy against the exchange-published VNMIDCAP (VN70) index at all four frequencies, and reconstructing the historical VN30 weight from semi-annual constituent reviews, would sharpen identification.</w:t>
-      </w:r>
     </w:p>
     <w:p>
       <w:pPr>
         <w:jc w:val="both"/>
       </w:pPr>
+      <w:r>
+        <w:rPr>
+          <w:rFonts w:hint="cs"/>
+        </w:rPr>
+        <w:t xml:space="preserve">These findings carry implications for institutional investors, index providers and regulators in Vietnam; for other ASEAN markets with nested architectures, such as Malaysia, Thailand and Indonesia, they are hypotheses to be tested rather than established results.</w:t>
+      </w:r>
     </w:p>
     <w:p>
       <w:pPr>
         <w:jc w:val="both"/>
       </w:pPr>
-      <w:r>
-        <w:rPr>
-          <w:rFonts w:hint="cs"/>
-        </w:rPr>
-        <w:t xml:space="preserve">Second, index-level closing prices cannot separate microstructure frictions (Epps 1979) from gradual information diffusion (Hong and Stein 1999); constituent-level tick data and order-book depth would allow these channels to be disentangled. Third, the Forbes and Rigobon (2002) adjustment assumes exogenous large-cap shocks, an assumption that forced deleveraging may weaken; regime-switching or heteroskedasticity-based identification could provide complementary evidence. Finally, applying the framework to the nested index systems of Malaysia, Thailand and Indonesia, whose short-selling and settlement rules differ from Vietnam’s, would test the institutional hypothesis that trading restrictions shape multiscale price synchronization.</w:t>
-      </w:r>
     </w:p>
     <w:p>
       <w:pPr>
         <w:jc w:val="both"/>
       </w:pPr>
+      <w:r>
+        <w:rPr>
+          <w:rFonts w:hint="cs"/>
+        </w:rPr>
+        <w:t xml:space="preserve">For institutional portfolio management, allocators investing in Vietnam should recognize that blending large-cap and broad-market parent-child indices offers negligible diversification benefits. When constructing multi-capitalization strategies, risk managers should replace static correlation assumptions with volatility-regime-conditioned covariance frameworks that recognize both overstated risk in tranquil periods and elevated co-movement during market distress.</w:t>
+      </w:r>
     </w:p>
     <w:p>
       <w:pPr>
         <w:jc w:val="both"/>
       </w:pPr>
-      <w:r>
-        <w:rPr>
-          <w:rFonts w:hint="cs"/>
-          <w:b/>
-        </w:rPr>
-        <w:t xml:space="preserve">Ethical standards </w:t>
-      </w:r>
-      <w:r>
-        <w:rPr>
-          <w:rFonts w:hint="cs"/>
-        </w:rPr>
-        <w:t xml:space="preserve">This study uses only publicly available historical index price data from the Ho Chi Minh City Stock Exchange; it involves no human participants or personal data, therefore required no ethical approval, and complies with the current laws of Vietnam.</w:t>
-      </w:r>
     </w:p>
     <w:p>
       <w:pPr>
         <w:jc w:val="both"/>
       </w:pPr>
+      <w:r>
+        <w:rPr>
+          <w:rFonts w:hint="cs"/>
+        </w:rPr>
+        <w:t xml:space="preserve">Regarding index architecture and product innovation, stock exchanges and index providers across emerging Southeast Asian markets should prioritize the development and promotion of standalone, non-overlapping segment benchmarks. On the Ho Chi Minh City Stock Exchange, expanding exchange-traded funds that track standalone benchmarks such as VNMIDCAP (VN70) would provide transparent building blocks for institutional factor allocation, helping allocators avoid the hidden overlaps inherent in headline index blends.</w:t>
+      </w:r>
     </w:p>
     <w:p>
       <w:pPr>
         <w:jc w:val="both"/>
       </w:pPr>
-      <w:r>
-        <w:rPr>
-          <w:rFonts w:hint="cs"/>
-          <w:b/>
-        </w:rPr>
-        <w:t xml:space="preserve">Data availability </w:t>
-      </w:r>
-      <w:r>
-        <w:rPr>
-          <w:rFonts w:hint="cs"/>
-        </w:rPr>
-        <w:t xml:space="preserve">The index price data were obtained from TradingView (exchange: HOSE) and are subject to the vendor’s terms of use; the merged dataset is available from the corresponding author upon reasonable request.</w:t>
-      </w:r>
     </w:p>
     <w:p>
       <w:pPr>
         <w:jc w:val="both"/>
       </w:pPr>
+      <w:r>
+        <w:rPr>
+          <w:rFonts w:hint="cs"/>
+        </w:rPr>
+        <w:t xml:space="preserve">Finally, for market development and risk mitigation, expanding derivative product suites beyond large-cap index futures to include mid-cap and sector contracts could enhance market completeness. Providing tradeable hedging instruments across multiple capitalization tiers enables institutional investors to manage cross-tier exposure without destabilizing underlying cash equity positions during periods of market stress.</w:t>
+      </w:r>
     </w:p>
     <w:p>
       <w:pPr>
         <w:jc w:val="both"/>
       </w:pPr>
+    </w:p>
+    <w:p>
+      <w:pPr>
+        <w:pStyle w:val="heading20"/>
+        <w:tabs>
+          <w:tab w:val="clear" w:pos="567"/>
+          <w:tab w:val="left" w:pos="720"/>
+        </w:tabs>
+        <w:ind w:left="0" w:firstLine="0"/>
+        <w:rPr>
+          <w:sz w:val="24"/>
+          <w:szCs w:val="24"/>
+          <w:lang w:val="vi-VN"/>
+        </w:rPr>
+      </w:pPr>
+      <w:r>
+        <w:rPr>
+          <w:rFonts w:eastAsia="null" w:hint="cs"/>
+          <w:sz w:val="24"/>
+          <w:szCs w:val="24"/>
+        </w:rPr>
+        <w:t xml:space="preserve">4.3 Limitations and Future Research</w:t>
+      </w:r>
+    </w:p>
+    <w:p>
+      <w:pPr>
+        <w:jc w:val="both"/>
+      </w:pPr>
+      <w:r>
+        <w:rPr>
+          <w:rFonts w:hint="cs"/>
+        </w:rPr>
+        <w:t xml:space="preserve">This study has limitations that suggest directions for future research. First, the mid-cap segment is identified through a capitalization-weighted decomposition based on a single factsheet snapshot of free-float weights. Although Section 3.8.2 shows that the conclusions are robust to weights between 0.60 and 0.75, validating the proxy against the exchange-published VNMIDCAP (VN70) index at all four frequencies, and reconstructing the historical VN30 weight from semi-annual constituent reviews, would sharpen identification.</w:t>
+      </w:r>
+    </w:p>
+    <w:p>
+      <w:pPr>
+        <w:jc w:val="both"/>
+      </w:pPr>
+    </w:p>
+    <w:p>
+      <w:pPr>
+        <w:jc w:val="both"/>
+      </w:pPr>
+      <w:r>
+        <w:rPr>
+          <w:rFonts w:hint="cs"/>
+        </w:rPr>
+        <w:t xml:space="preserve">Second, index-level closing prices cannot separate microstructure frictions (Epps 1979) from gradual information diffusion (Hong and Stein 1999); constituent-level tick data would allow these channels to be disentangled. Third, the Forbes and Rigobon (2002) adjustment assumes exogenous large-cap shocks, which forced deleveraging may weaken, and its power against small structural changes is limited; regime-switching or heteroskedasticity-based identification could provide complementary evidence. Fourth, regimes are classified ex post, so an out-of-sample evaluation of regime-conditioned risk budgets is needed before the portfolio results can guide practice. Finally, applying the framework to the nested index systems of Malaysia, Thailand and Indonesia would test the hypothesis that trading restrictions shape multiscale price synchronization.</w:t>
+      </w:r>
+    </w:p>
+    <w:p>
+      <w:pPr>
+        <w:jc w:val="both"/>
+      </w:pPr>
+    </w:p>
+    <w:p>
+      <w:pPr>
+        <w:pStyle w:val="heading20"/>
+        <w:tabs>
+          <w:tab w:val="clear" w:pos="567"/>
+          <w:tab w:val="left" w:pos="720"/>
+        </w:tabs>
+        <w:ind w:left="0" w:firstLine="0"/>
+        <w:rPr>
+          <w:sz w:val="24"/>
+          <w:szCs w:val="24"/>
+          <w:lang w:val="vi-VN"/>
+        </w:rPr>
+      </w:pPr>
+      <w:r>
+        <w:rPr>
+          <w:rFonts w:eastAsia="null" w:hint="cs"/>
+          <w:sz w:val="24"/>
+          <w:szCs w:val="24"/>
+        </w:rPr>
+        <w:t xml:space="preserve">4.4 Conclusion</w:t>
+      </w:r>
+    </w:p>
+    <w:p>
+      <w:pPr>
+        <w:jc w:val="both"/>
+      </w:pPr>
+      <w:r>
+        <w:rPr>
+          <w:rFonts w:hint="cs"/>
+        </w:rPr>
+        <w:t xml:space="preserve">Nested equity indices on the HOSE overstate the co-movement between large caps and the rest of the market because they share constituents. A capitalization-weighted decomposition removes about 0.09 of correlation, the remaining cross-tier dependence shows no structural increase in crises once volatility is accounted for, and static correlations misstate the risk of mid-cap exposures by amounts that depend on the volatility regime. Independent mid-cap benchmarks and volatility-regime-conditioned risk budgets are the natural responses.</w:t>
+      </w:r>
+    </w:p>
+    <w:p>
+      <w:pPr>
+        <w:jc w:val="both"/>
+      </w:pPr>
+    </w:p>
+    <w:p>
+      <w:pPr>
+        <w:jc w:val="both"/>
+      </w:pPr>
       <w:r>
         <w:rPr>
           <w:rFonts w:hint="cs"/>
           <w:b/>
         </w:rPr>
+        <w:t xml:space="preserve">Ethical standards </w:t>
+      </w:r>
+      <w:r>
+        <w:rPr>
+          <w:rFonts w:hint="cs"/>
+        </w:rPr>
+        <w:t xml:space="preserve">This study uses only publicly available historical index price data from the Ho Chi Minh City Stock Exchange; it involves no human participants or personal data, therefore required no ethical approval, and complies with the current laws of Vietnam.</w:t>
+      </w:r>
+    </w:p>
+    <w:p>
+      <w:pPr>
+        <w:jc w:val="both"/>
+      </w:pPr>
+    </w:p>
+    <w:p>
+      <w:pPr>
+        <w:jc w:val="both"/>
+      </w:pPr>
+      <w:r>
+        <w:rPr>
+          <w:rFonts w:hint="cs"/>
+          <w:b/>
+        </w:rPr>
+        <w:t xml:space="preserve">Data availability </w:t>
+      </w:r>
+      <w:r>
+        <w:rPr>
+          <w:rFonts w:hint="cs"/>
+        </w:rPr>
+        <w:t xml:space="preserve">The index price data were obtained from TradingView (exchange: HOSE) and are subject to the vendor’s terms of use; the merged dataset is available from the corresponding author upon reasonable request.</w:t>
+      </w:r>
+    </w:p>
+    <w:p>
+      <w:pPr>
+        <w:jc w:val="both"/>
+      </w:pPr>
+    </w:p>
+    <w:p>
+      <w:pPr>
+        <w:jc w:val="both"/>
+      </w:pPr>
+      <w:r>
+        <w:rPr>
+          <w:rFonts w:hint="cs"/>
+          <w:b/>
+        </w:rPr>
         <w:t xml:space="preserve">Code availability </w:t>
       </w:r>
       <w:r>
         <w:rPr>
           <w:rFonts w:hint="cs"/>
         </w:rPr>
-        <w:t xml:space="preserve">The R code that reproduces every table and figure is available from the corresponding author upon request.</w:t>
+        <w:t xml:space="preserve">The R code that reproduces every table and figure is provided as Online Resource 1 and will be deposited in a public repository upon acceptance.</w:t>
+      </w:r>
+    </w:p>
+    <w:p>
+      <w:pPr>
+        <w:jc w:val="both"/>
+      </w:pPr>
+    </w:p>
+    <w:p>
+      <w:pPr>
+        <w:jc w:val="both"/>
+      </w:pPr>
+      <w:r>
+        <w:rPr>
+          <w:rFonts w:hint="cs"/>
+          <w:b/>
+        </w:rPr>
+        <w:t xml:space="preserve">Funding </w:t>
+      </w:r>
+      <w:r>
+        <w:rPr>
+          <w:rFonts w:hint="cs"/>
+        </w:rPr>
+        <w:t xml:space="preserve">Funding information is provided on the separate title page in accordance with the journal’s double-blind review policy.</w:t>
       </w:r>
     </w:p>
     <w:p>
@@ -22993,39 +21472,6 @@
           <w:rFonts w:hint="cs"/>
         </w:rPr>
         <w:t xml:space="preserve">(1), 24. https://doi.org/10.3390/jrfm15010024</w:t>
-      </w:r>
-    </w:p>
-    <w:p>
-      <w:pPr>
-        <w:pStyle w:val="referenceitem"/>
-        <w:numPr>
-          <w:ilvl w:val="0"/>
-          <w:numId w:val="0"/>
-        </w:numPr>
-        <w:tabs>
-          <w:tab w:val="left" w:pos="720"/>
-        </w:tabs>
-        <w:spacing w:line="300" w:lineRule="auto"/>
-        <w:ind w:left="720" w:hanging="720"/>
-      </w:pPr>
-      <w:r>
-        <w:rPr>
-          <w:rFonts w:hint="cs"/>
-        </w:rPr>
-        <w:t xml:space="preserve">Newey, W. K., &amp; West, K. D. (1987). A simple, positive semi-definite, heteroskedasticity and autocorrelation consistent covariance matrix. </w:t>
-      </w:r>
-      <w:r>
-        <w:rPr>
-          <w:rFonts w:hint="cs"/>
-          <w:i/>
-        </w:rPr>
-        <w:t xml:space="preserve">Econometrica, 55</w:t>
-      </w:r>
-      <w:r>
-        <w:rPr>
-          <w:rFonts w:hint="cs"/>
-        </w:rPr>
-        <w:t xml:space="preserve">(3), 703–708. https://doi.org/10.2307/1913610</w:t>
       </w:r>
     </w:p>
     <w:p>

</xml_diff>

<commit_message>
Rounds 2-4: ARS re-review fixes, proofreading + stop-slop language rounds (academic-paper gate), figure axis labels; final APFM manuscript
Co-Authored-By: Claude Opus 5.5 <noreply@anthropic.com>
Claude-Session: https://claude.ai/code/session_01Qq7x1vqifuGojcDRAnNitB
</commit_message>
<xml_diff>
--- a/Python for Algorithmic Trading/NCKH/Bài stock toán/submission/final_APFM/Co_movement_manuscript_APFM_final.docx
+++ b/Python for Algorithmic Trading/NCKH/Bài stock toán/submission/final_APFM/Co_movement_manuscript_APFM_final.docx
@@ -53,7 +53,7 @@
           <w:sz w:val="24"/>
           <w:szCs w:val="24"/>
         </w:rPr>
-        <w:t xml:space="preserve">Asset allocators in emerging Southeast Asian markets frequently treat large-cap and broad-market indices as separate diversification instruments, even in nested architectures where large-cap stocks dominate the broader market. Standard risk models thereby conflate mechanical constituent overlap with genuine economic co-movement. Utilizing Detrended Cross-Correlation Analysis (DCCA) and its multifractal extension on 30-minute, 1-hour, 4-hour and daily data from the Ho Chi Minh City Stock Exchange (2014–2025), this study illustrates that shared capitalization inflates the near-perfect correlations among nested indices (0.975–0.980). Purging constituent overlap with a capitalization-weighted mid-cap proxy lowers the correlation with large caps by 0.086–0.096, with block-bootstrap intervals that exclude zero at every frequency, although the purged correlation remains high (about 0.88). Correlations involving the broad market rise with the horizon at the 30-minute and 1-hour frequencies, whereas the purged mid-cap correlation shows no significant horizon dependence. Raw cross-tier correlation rises from 0.73 to 0.93 in high-volatility regimes, but after Forbes–Rigobon volatility conditioning there is no evidence of a structural increase, consistent with interdependence rather than contagion. Consequently, a static correlation overstates in-sample mid-cap portfolio variance by 2.2–9.4% in calm regimes and understates it by about 2% in turbulent regimes. These findings support independent mid-cap benchmarks and volatility-regime-sensitive risk budgeting in Vietnam, and they motivate tests in other markets of the Association of Southeast Asian Nations (ASEAN) with nested index architectures.</w:t>
+        <w:t xml:space="preserve">Asset allocators in emerging Southeast Asian markets often treat large-cap and broad-market indices as separate diversification instruments, even in nested architectures where large-cap stocks dominate the broader market. Risk models built on index-level correlations therefore conflate mechanical constituent overlap with economic co-movement. Using Detrended Cross-Correlation Analysis (DCCA) and its multifractal extension on 30-minute, 1-hour, 4-hour and daily data from the Ho Chi Minh City Stock Exchange (2014–2025), this study shows that shared capitalization inflates the near-perfect correlations among nested indices (0.975–0.980). Purging constituent overlap with a capitalization-weighted mid-cap proxy lowers the correlation with large caps by 0.086–0.096, with block-bootstrap intervals that exclude zero at every frequency, although the purged correlation remains high (about 0.88). Correlations involving the broad market rise with the horizon at the 30-minute and 1-hour frequencies, whereas the purged mid-cap correlation shows no significant horizon dependence. Raw cross-tier correlation rises from 0.73 to 0.93 in high-volatility regimes, but after Forbes–Rigobon volatility conditioning there is no evidence of a structural increase, consistent with interdependence rather than contagion. A static correlation overstates in-sample mid-cap portfolio variance by 2.2–9.4% in calm regimes and understates it by about 2% in turbulent regimes. These findings support independent mid-cap benchmarks and volatility-regime-sensitive risk budgeting in Vietnam, and they motivate tests in other markets of the Association of Southeast Asian Nations (ASEAN) with nested index architectures.</w:t>
       </w:r>
     </w:p>
     <w:p>
@@ -131,49 +131,11 @@
       <w:pPr>
         <w:jc w:val="both"/>
       </w:pPr>
-      <w:bookmarkStart w:id="28" w:name="X658d517f100aa41d683afb1a58bd69217d3b6dc"/>
-      <w:bookmarkEnd w:id="27"/>
-      <w:r>
-        <w:rPr>
-          <w:rFonts w:hint="cs"/>
-        </w:rPr>
-        <w:t xml:space="preserve">Portfolio managers and institutional asset allocators in emerging equity markets frequently construct multi-capitalization portfolios under the assumption that large-cap and mid-cap stock indices serve as independent diversification instruments. Many risk models, asset allocation algorithms and stress-testing frameworks parameterize cross-asset dependence using a single static Pearson correlation coefficient estimated from daily closing prices </w:t>
-      </w:r>
-      <w:r>
-        <w:rPr>
-          <w:rFonts w:hint="cs"/>
-        </w:rPr>
-        <w:fldChar w:fldCharType="begin"/>
-      </w:r>
-      <w:r>
-        <w:rPr>
-          <w:rFonts w:hint="cs"/>
-        </w:rPr>
-        <w:instrText xml:space="preserve"> ADDIN PAPERPAL_ITEM CSL_CITATION {"citationItems":[{"itemType":"journalArticle","author":[{"given":"H","family":"Markowitz"}],"container-title":"The Journal of Finance","id":"1a283c2c-52c0-4086-b237-48291ed18e20","formattedCitation":"Markowitz, H. (1952). Portfolio selection. The Journal of Finance, 7(1), 77\u201391. https://doi.org/10.1111/j.1540-6261.1952.tb01525.x","type":"article-journal","issued":{"date-parts":[["1952"]]},"title":"Portfolio selection","DOI":"10.1111/j.1540-6261.1952.tb01525.x"}],"citationID":"1a283c2c-52c0-4086-b237-48291ed18e20","properties":{"formattedCitation":"(Markowitz, 1952)","plainCitation":"(Markowitz, 1952)","noteIndex":0}}</w:instrText>
-      </w:r>
-      <w:r>
-        <w:rPr>
-          <w:rFonts w:hint="cs"/>
-        </w:rPr>
-        <w:fldChar w:fldCharType="separate"/>
-      </w:r>
-      <w:r>
-        <w:rPr>
-          <w:rFonts w:hint="cs"/>
-        </w:rPr>
-        <w:t>(Markowitz 1952)</w:t>
-      </w:r>
-      <w:r>
-        <w:rPr>
-          <w:rFonts w:hint="cs"/>
-        </w:rPr>
-        <w:fldChar w:fldCharType="end"/>
-      </w:r>
-      <w:r>
-        <w:rPr>
-          <w:rFonts w:hint="cs"/>
-        </w:rPr>
-        <w:t>. This conventional approach embeds two critical, yet rarely tested, assumptions: first, that cross-asset co-movement is scale-invariant across holding horizons ranging from high-frequency intraday intervals to multi-month cycles; and second, that cross-sectional dependence remains constant across calm and volatile market regimes.</w:t>
+      <w:r>
+        <w:rPr>
+          <w:rFonts w:hint="cs"/>
+        </w:rPr>
+        <w:t xml:space="preserve">Portfolio managers in emerging equity markets often build multi-capitalization portfolios as if large-cap and mid-cap indices were separate diversification instruments. Many risk models, asset allocation algorithms and stress tests describe cross-asset dependence with one static Pearson correlation estimated from daily closing prices (Markowitz 1952). This practice rests on two assumptions that are rarely tested: that co-movement does not depend on the holding horizon, from intraday intervals to several months, and that dependence is the same in calm and volatile regimes.</w:t>
       </w:r>
     </w:p>
     <w:p>
@@ -189,14 +151,14 @@
         <w:rPr>
           <w:rFonts w:hint="cs"/>
         </w:rPr>
-        <w:t xml:space="preserve">In nested equity index systems, this reliance on static correlations creates an econometric bias. Across Southeast Asian equity markets, index providers routinely employ nested, capitalization-tiered architectures. For example, the FTSE Bursa Malaysia KLCI (top 30) is nested within the </w:t>
+        <w:t xml:space="preserve">In nested equity index systems, a static correlation also mixes two sources of dependence. Across the equity markets of the Association of Southeast Asian Nations (ASEAN), index providers use nested, capitalization-tiered architectures. For example, the FTSE Bursa Malaysia KLCI (top 30) is nested within the </w:t>
       </w:r>
       <w:r>
         <w:rPr>
           <w:rFonts w:hint="cs"/>
         </w:rPr>
         <w:lastRenderedPageBreak/>
-        <w:t>FTSE Bursa Malaysia Top 100 Index and FBM EMAS Index, the SET50 is nested within the SET100 in Thailand, and the IDX30 is nested within the LQ45 in Indonesia. While mature ASEAN exchanges, such as Bursa Malaysia, support continuous cash-futures arbitrage and market completeness through Regulated Short Selling (RSS) and Intraday Short Selling (IDSS) on eligible constituent equities, emerging frontier exchanges frequently operate under binding short-sale prohibitions and slower settlement cycles. On the Ho Chi Minh City Stock Exchange (HOSE), the flagship large-cap index (VN30) is fully embedded within the top-100 benchmark (VN100), which is in turn nested within the broad market index (VNINDEX), satisfying the strict subset relation:</w:t>
+        <w:t xml:space="preserve">FTSE Bursa Malaysia Top 100 Index and FBM EMAS Index, the SET50 is nested within the SET100 in Thailand, and the IDX30 is nested within the LQ45 in Indonesia. Bursa Malaysia permits Regulated Short Selling (RSS) and Intraday Short Selling (IDSS) on eligible constituents, whereas Vietnam prohibits cash short selling (Section 1.1). On the Ho Chi Minh City Stock Exchange (HOSE), the flagship large-cap index (VN30) is contained in the top-100 benchmark (VN100), which is in turn nested within the broad market index (VNINDEX), satisfying the strict subset relation:</w:t>
       </w:r>
     </w:p>
     <w:p>
@@ -218,7 +180,7 @@
         <w:rPr>
           <w:rFonts w:hint="cs"/>
         </w:rPr>
-        <w:t xml:space="preserve">Because the 30 largest firms represent over two-thirds of the free-float market capitalization of VN100, the return co-movement among these indices is mechanically bound by construction. Treating their empirical correlation as an indicator of genuine economic linkage conflates index engineering overlap with market co-movement. When an institutional investor diversifies across the VN30 and VN100, the perceived diversification benefit may be largely illusory.</w:t>
+        <w:t xml:space="preserve">Because the 30 largest firms represent over two-thirds of the free-float market capitalization of VN100, the return co-movement among these indices is high by construction, and reading their correlation as economic linkage confuses index design with market co-movement. An investor who splits a position between VN30 and VN100 funds gains little diversification.</w:t>
       </w:r>
     </w:p>
     <w:p>
@@ -244,14 +206,14 @@
         <w:rPr>
           <w:rFonts w:hint="cs"/>
         </w:rPr>
-        <w:t>econophysics</w:t>
+        <w:t xml:space="preserve">econophysics and financial econometrics use</w:t>
       </w:r>
       <w:proofErr w:type="spellEnd"/>
       <w:r>
         <w:rPr>
           <w:rFonts w:hint="cs"/>
         </w:rPr>
-        <w:t xml:space="preserve"> and financial econometrics have increasingly adopted Detrended Cross-Correlation Analysis (DCCA) </w:t>
+        <w:t xml:space="preserve"> Detrended Cross-Correlation Analysis (DCCA) </w:t>
       </w:r>
       <w:r>
         <w:rPr>
@@ -373,7 +335,7 @@
         <w:rPr>
           <w:rFonts w:hint="cs"/>
         </w:rPr>
-        <w:t xml:space="preserve"> (2011) normalized the DCCA covariance to establish a bounded correlation metric, while Podobnik et al. (2011) established the analytical finite-sample distribution for hypothesis testing. Subsequent advances have integrated moving-average formalisms </w:t>
+        <w:t xml:space="preserve"> (2011) normalized the DCCA covariance to establish a bounded correlation metric, while Podobnik et al. (2011) proposed statistical tests for power-law cross-correlations. Subsequent advances have integrated moving-average formalisms </w:t>
       </w:r>
       <w:r>
         <w:rPr>
@@ -454,7 +416,7 @@
         <w:rPr>
           <w:rFonts w:hint="cs"/>
         </w:rPr>
-        <w:t xml:space="preserve">. Applied empirical studies confirm that multiscale cross-correlations vary systematically across holding periods in developed equity markets, commodity baskets, and cross-border assets </w:t>
+        <w:t xml:space="preserve">. Applied studies show that multiscale cross-correlations vary systematically across holding periods in developed equity markets, commodity baskets and cross-border assets </w:t>
       </w:r>
       <w:r>
         <w:rPr>
@@ -517,31 +479,31 @@
         <w:rPr>
           <w:rFonts w:hint="cs"/>
         </w:rPr>
-        <w:t xml:space="preserve">. However, this literature predominantly analyzes asset pairs that are strictly disjoint in their constituent composition (such as stock-bond pairs or cross-country equity benchmarks). </w:t>
-      </w:r>
-      <w:r>
-        <w:t xml:space="preserve">The behavioral dynamics of multiscale cross-correlations within nested index </w:t>
-      </w:r>
-      <w:r>
-        <w:t>architectures</w:t>
-      </w:r>
-      <w:r>
-        <w:t>,</w:t>
-      </w:r>
-      <w:r>
-        <w:t xml:space="preserve"> where mechanical </w:t>
-      </w:r>
-      <w:r>
-        <w:t xml:space="preserve">overlap and </w:t>
-      </w:r>
-      <w:r>
-        <w:t>g</w:t>
-      </w:r>
-      <w:r>
-        <w:t>enuine economic transmission coexist</w:t>
-      </w:r>
-      <w:r>
-        <w:t xml:space="preserve">, remain comparatively underexplored.</w:t>
+        <w:t xml:space="preserve">. However, this literature mostly analyzes asset pairs with no common constituents (such as stock-bond pairs or cross-country equity benchmarks). </w:t>
+      </w:r>
+      <w:r>
+        <w:t xml:space="preserve">Multiscale cross-correlations within nested index architectures, where mechanical overlap and economic transmission coexist, have received little attention.</w:t>
+      </w:r>
+      <w:r>
+        <w:t xml:space="preserve"/>
+      </w:r>
+      <w:r>
+        <w:t xml:space="preserve"/>
+      </w:r>
+      <w:r>
+        <w:t xml:space="preserve"/>
+      </w:r>
+      <w:r>
+        <w:t xml:space="preserve"/>
+      </w:r>
+      <w:r>
+        <w:t xml:space="preserve"/>
+      </w:r>
+      <w:r>
+        <w:t xml:space="preserve"/>
+      </w:r>
+      <w:r>
+        <w:t xml:space="preserve"/>
       </w:r>
       <w:r>
         <w:t xml:space="preserve"/>
@@ -563,21 +525,7 @@
         <w:rPr>
           <w:rFonts w:hint="cs"/>
         </w:rPr>
-        <w:t xml:space="preserve">This gap in the benchmark design interacts directly with index engineering and constituent overlap. When index providers construct size-based benchmarks using top-down capitalization cut-offs, large-cap equities inevitably dominate broad-market indices. While </w:t>
-      </w:r>
-      <w:proofErr w:type="spellStart"/>
-      <w:r>
-        <w:rPr>
-          <w:rFonts w:hint="cs"/>
-        </w:rPr>
-        <w:t>Michis</w:t>
-      </w:r>
-      <w:proofErr w:type="spellEnd"/>
-      <w:r>
-        <w:rPr>
-          <w:rFonts w:hint="cs"/>
-        </w:rPr>
-        <w:t xml:space="preserve"> (2022) applied wavelet partial correlations to eliminate redundant factor exposures in non-overlapping asset clusters, Rodriguez and Alvarez-Ramirez (2021) documented time- and scale-varying volume–return cross-correlations in US equity markets. Emerging markets face substantial risk from passive tracking. If risk models fail to purge shared constituent capitalization, they mistake mechanical index engineering for economic diversification.</w:t>
+        <w:t xml:space="preserve">The overlap problem arises from index design. When index providers build size-based benchmarks with top-down capitalization cut-offs, large-cap stocks dominate the broad-market index. Michis (2022) applied wavelet partial correlations to remove redundant factor exposures in non-overlapping asset clusters, and Rodriguez and Alvarez-Ramirez (2021) documented time- and scale-varying volume–return cross-correlations in US equity markets, but neither study addresses overlapping constituents. A risk model that does not purge shared capitalization mistakes index construction for economic diversification.</w:t>
       </w:r>
     </w:p>
     <w:p>
@@ -593,14 +541,14 @@
         <w:rPr>
           <w:rFonts w:hint="cs"/>
         </w:rPr>
-        <w:t xml:space="preserve">Market regime shifts and microstructure frictions complicate this dependence. A well-established empirical stylized fact is that cross-asset correlations are asymmetric, increasing during market </w:t>
+        <w:t xml:space="preserve">Market regime shifts and microstructure frictions complicate this dependence. Cross-asset correlations are asymmetric and increase during market downturns, when diversification matters most</w:t>
       </w:r>
       <w:r>
         <w:rPr>
           <w:rFonts w:hint="cs"/>
         </w:rPr>
         <w:lastRenderedPageBreak/>
-        <w:t xml:space="preserve">downturns when diversification is critical </w:t>
+        <w:t xml:space="preserve"> </w:t>
       </w:r>
       <w:r>
         <w:rPr>
@@ -650,7 +598,7 @@
         <w:rPr>
           <w:rFonts w:hint="cs"/>
         </w:rPr>
-        <w:t xml:space="preserve"> (2002) showed that unadjusted sample correlations increase mechanically with market volatility, so that an observed correlation surge may reflect volatility expansion rather than a structural change in cross-market linkages. At intraday intervals, this dynamic intersects with the Epps (1979) effect, where non-synchronous transactions and quote delays depress short-horizon correlations. In parallel, gradual information diffusion (Hong and Stein 1999) implies that news is incorporated into prices with a delay, so co-movement between securities that are repriced at different speeds can rise with the horizon.</w:t>
+        <w:t xml:space="preserve"> (2002) showed that unadjusted sample correlations rise with market volatility, so that an observed correlation surge may reflect volatility expansion rather than a structural change in cross-market linkages. At intraday intervals, this dynamic intersects with the Epps (1979) effect, where non-synchronous transactions and quote delays depress short-horizon correlations. In parallel, gradual information diffusion (Hong and Stein 1999) implies that news is incorporated into prices with a delay, so co-movement between securities that are repriced at different speeds can rise with the horizon.</w:t>
       </w:r>
       <w:r>
         <w:rPr>
@@ -759,7 +707,7 @@
         <w:rPr>
           <w:rFonts w:hint="cs"/>
         </w:rPr>
-        <w:t xml:space="preserve">Regional studies show that financial integration across ASEAN equity markets is time-varying and shaped by trade linkages, market volatility and external shocks (Karim and Ning 2013; Lean and Teng 2013). Unlike markets that permit regulated short selling, Vietnam’s HOSE prohibits cash short selling, so we treat the role of trading restrictions in multiscale price synchronization as a hypothesis for comparative work rather than as a tested result.</w:t>
+        <w:t xml:space="preserve">Regional studies show that financial integration across ASEAN equity markets is time-varying and shaped by trade linkages, market volatility and external shocks (Karim and Ning 2013; Lean and Teng 2013). Because the HOSE prohibits cash short selling, unlike markets with regulated short selling, we treat the role of trading restrictions in multiscale price synchronization as a hypothesis for comparative work rather than as a tested result.</w:t>
       </w:r>
     </w:p>
     <w:p>
@@ -775,7 +723,7 @@
         <w:rPr>
           <w:rFonts w:hint="cs"/>
         </w:rPr>
-        <w:t xml:space="preserve">To address these unresolved issues, this study examines VN30, VN100 and VNINDEX from January 2014 to December 2025 at four trading frequencies: 30-minute (M30), 1-hour (H1), 4-hour (H4) and daily (1D). To isolate genuine economic linkage from constituent overlap, we construct a capitalization-weighted proxy (P</w:t>
+        <w:t xml:space="preserve">This study examines VN30, VN100 and VNINDEX from January 2014 to December 2025 at four trading frequencies: 30-minute (M30), 1-hour (H1), 4-hour (H4) and daily (1D). To separate economic linkage from constituent overlap, we construct a capitalization-weighted proxy (P</w:t>
       </w:r>
       <w:r>
         <w:rPr>
@@ -804,7 +752,7 @@
         <w:rPr>
           <w:rFonts w:hint="cs"/>
         </w:rPr>
-        <w:t xml:space="preserve">This study makes three primary contributions to the extant empirical finance and risk management literature.</w:t>
+        <w:t xml:space="preserve">We make three contributions to the empirical finance and risk management literature.</w:t>
       </w:r>
     </w:p>
     <w:p>
@@ -817,7 +765,7 @@
         <w:jc w:val="both"/>
       </w:pPr>
       <w:r>
-        <w:t xml:space="preserve">Firstly, we quantify the overlap distortion in nested benchmark systems. Headline large-cap and broad-market indices exhibit near-perfect cross-correlations (0.975–0.980) at all frequencies, and extracting shared capitalization through a market-weighted mid-cap proxy lowers the correlation with large caps by 0.086–0.096, a gap whose bootstrap confidence intervals exclude zero at every frequency. Correlations involving the broad market rise with the horizon at the 30-minute and 1-hour frequencies, whereas the purged mid-cap correlation is statistically flat across horizons.</w:t>
+        <w:t xml:space="preserve">First, we quantify the overlap distortion in nested benchmark systems. Headline large-cap and broad-market indices show near-perfect cross-correlations (0.975–0.980) at all frequencies, and extracting shared capitalization through a market-weighted mid-cap proxy lowers the correlation with large caps by 0.086–0.096, a gap whose bootstrap confidence intervals exclude zero at every frequency. Correlations involving the broad market rise with the horizon at the 30-minute and 1-hour frequencies, whereas the purged mid-cap correlation is statistically flat across horizons.</w:t>
       </w:r>
     </w:p>
     <w:p>
@@ -830,7 +778,7 @@
         <w:jc w:val="both"/>
       </w:pPr>
       <w:r>
-        <w:t xml:space="preserve">Secondly, we provide a volatility-conditioned evaluation of crisis dynamics. Raw cross-tier correlations tighten by up to 0.20 correlation points in high-volatility regimes, which would conventionally be read as a correlation breakdown. Applying the Forbes and Rigobon (2002) adjustment under two regime definitions with block-bootstrap inference, we find no evidence that the adjusted crisis correlation exceeds its calm-period level. Mid-cap diversification failure during Vietnamese market stress is therefore consistent with interdependence amplified by volatility, although the test cannot exclude small structural increases.</w:t>
+        <w:t xml:space="preserve">Second, we provide a volatility-conditioned evaluation of crisis dynamics. Raw cross-tier correlations tighten by up to 0.20 correlation points in high-volatility regimes, which is usually read as a correlation breakdown. Applying the Forbes and Rigobon (2002) adjustment under two regime definitions with block-bootstrap inference, we find no evidence that the adjusted crisis correlation exceeds its calm-period level. The loss of mid-cap diversification during Vietnamese market stress is therefore consistent with interdependence amplified by volatility, although the test cannot exclude small structural increases.</w:t>
       </w:r>
     </w:p>
     <w:p>
@@ -843,7 +791,7 @@
         <w:jc w:val="both"/>
       </w:pPr>
       <w:r>
-        <w:t xml:space="preserve">Thirdly, we quantify the risk-management cost of static correlations. Cash portfolios formed from parent and child indices suffer in-sample variance misstatements of at most 2.4%, whereas for a mid-cap factor exposure a static correlation overstates portfolio variance by 2.2–9.4% in calm regimes and understates it by about 2% in turbulent regimes, when volatility itself has multiplied. Because short selling is prohibited, the non-investable mid-cap construct serves as a shadow benchmark for risk attribution, stress testing and index-product development.</w:t>
+        <w:t xml:space="preserve">Third, we quantify the risk-management cost of static correlations. Cash portfolios formed from parent and child indices show in-sample variance misstatements of at most 2.4%, whereas for a mid-cap factor exposure a static correlation overstates portfolio variance by 2.2–9.4% in calm regimes and understates it by about 2% in turbulent regimes, when volatility itself has multiplied. Because short selling is prohibited, the non-investable mid-cap construct serves as a shadow benchmark for risk attribution, stress testing and index-product development.</w:t>
       </w:r>
     </w:p>
     <w:p>
@@ -892,7 +840,7 @@
         <w:rPr>
           <w:rFonts w:hint="cs"/>
         </w:rPr>
-        <w:t>The institutional architecture of the HOSE, regulated by the State Securities Commission of Vietnam (SSC), imposes specific regulatory constraints that directly shape price discovery, return distributions</w:t>
+        <w:t xml:space="preserve">The institutional architecture of the HOSE, regulated by the State Securities Commission of Vietnam (SSC), imposes regulatory constraints that shape price discovery, return distributions</w:t>
       </w:r>
       <w:r>
         <w:rPr>
@@ -920,7 +868,7 @@
         <w:rPr>
           <w:rFonts w:hint="cs"/>
         </w:rPr>
-        <w:t xml:space="preserve">The primary microstructure constraint is the symmetric daily price fluctuation band of ±7% relative to the previous session’s reference price. During sharp market corrections, heavily sold equities frequently hit lower limits, causing liquidity to freeze. This price collar truncates return tails and can induce serial correlation and synchronized limit hits across index constituents.</w:t>
+        <w:t xml:space="preserve">The primary microstructure constraint is the symmetric daily price fluctuation band of ±7% relative to the reference price of the previous session. During sharp market corrections, heavily sold stocks can reach the lower limit, where trading dries up. This price collar truncates return tails and can induce serial correlation and synchronized limit hits across index constituents.</w:t>
       </w:r>
     </w:p>
     <w:p>
@@ -995,7 +943,7 @@
         <w:rPr>
           <w:rFonts w:hint="cs"/>
         </w:rPr>
-        <w:t xml:space="preserve">Finally, securities legislation, including Decree 155/2020/ND-CP and SSC Circular 120/2020/TT-BTC, prohibits cash short selling: investors may sell only securities already held in their accounts. Margin regulations require an initial margin of at least 50%, capping gross leverage at about 2.0×, and Circular 68/2024/TT-BTC, which removed the pre-funding requirement for foreign institutional investors, left the short-sale prohibition unchanged. Although VN30 index futures trade on the Hanoi Stock Exchange derivatives market, no exchange-traded hedging instrument exists for the mid-cap segment. The absence of cash short selling prevents arbitrageurs from trading the spread between large caps and mid-caps, which can prolong intraday non-synchronicity (the Epps effect) and delay price synchronization between VN30 and mid-cap stocks.</w:t>
+        <w:t xml:space="preserve">Finally, securities legislation, including Decree 155/2020/ND-CP and SSC Circular 120/2020/TT-BTC, prohibits cash short selling: investors may sell only securities already held in their accounts. Margin regulations require an initial margin of at least 50%, capping gross leverage at about 2.0×, and Circular 68/2024/TT-BTC, which removed the pre-funding requirement for foreign institutional investors, left the short-sale prohibition unchanged. Although VN30 index futures trade on the Hanoi Stock Exchange derivatives market, no futures contract is listed on a mid-cap index. The absence of cash short selling prevents arbitrageurs from trading the spread between large caps and mid-caps, which can prolong intraday non-synchronicity (the Epps effect) and delay price synchronization between VN30 and mid-cap stocks.</w:t>
       </w:r>
     </w:p>
     <w:p>
@@ -1063,7 +1011,7 @@
         <w:jc w:val="both"/>
       </w:pPr>
       <w:r>
-        <w:t xml:space="preserve">The analysis evaluates four trading frequencies: 30-minute (M30), 1-hour (H1), 4-hour (H4) and daily (1D). To guarantee simultaneity and prevent alignment bias, the index series were synchronized by exact inner joins on timestamps, and log returns were computed as below; no index price was filled or interpolated:</w:t>
+        <w:t xml:space="preserve">The analysis covers four trading frequencies: 30-minute (M30), 1-hour (H1), 4-hour (H4) and daily (1D). We synchronize the index series by exact inner joins on timestamps and compute log returns as below; no index price is filled or interpolated:</w:t>
       </w:r>
     </w:p>
     <w:p>
@@ -1217,19 +1165,7 @@
         <w:jc w:val="both"/>
       </w:pPr>
       <w:r>
-        <w:t>The</w:t>
-      </w:r>
-      <w:r>
-        <w:rPr>
-          <w:rFonts w:hint="cs"/>
-        </w:rPr>
-        <w:t xml:space="preserve"> </w:t>
-      </w:r>
-      <w:r>
-        <w:rPr>
-          <w:rFonts w:hint="cs"/>
-        </w:rPr>
-        <w:t>empirical research design operates across two complementary sample tiers:</w:t>
+        <w:t xml:space="preserve">We use two sample tiers.</w:t>
       </w:r>
     </w:p>
     <w:p>
@@ -1240,7 +1176,7 @@
         <w:rPr>
           <w:rFonts w:hint="cs"/>
         </w:rPr>
-        <w:t xml:space="preserve">The first tier is the Multi-Frequency Synchronized Overlap Window (January 3, 2017 to December 9, 2024), establishing a strictly synchronized common calendar window where all four frequencies (M30, H1, H4, 1D) overlap simultaneously without calendar attrition (1D: N=1,983; M30: N=19,463; H1: N=9,879; H4: N=3,953). This sample forms</w:t>
+        <w:t xml:space="preserve">The first tier is the Multi-Frequency Synchronized Overlap Window (January 3, 2017 to December 9, 2024), a common calendar window in which all four frequencies overlap (1D: N=1,983; M30: N=19,463; H1: N=9,879; H4: N=3,953). This sample forms</w:t>
       </w:r>
       <w:r>
         <w:t xml:space="preserve"/>
@@ -1265,7 +1201,7 @@
         <w:rPr>
           <w:rFonts w:hint="cs"/>
         </w:rPr>
-        <w:t xml:space="preserve">The second tier is the Extended Historical Depth Sample, deployed to maximize data depth for scaling regressions, regime tests and Monte Carlo reliability thresholds (1D: February 2014–December 2025, N = 2,963; M30: January 2017–December 2025, N = 21,942; H1 and H4: January 2014–December 2024, N = 13,523 and 5,410). The 1-hour and 4-hour series available from the data vendor end on December 9, 2024, whereas the daily and 30-minute series extend to December 12, 2025. All four frequencies overlap without any calendar gap in the first tier, which is used for cross-frequency comparisons.</w:t>
+        <w:t xml:space="preserve">The second tier is the Extended Historical Depth Sample, used for scaling regressions, regime tests and Monte Carlo reliability thresholds (1D: February 2014–December 2025, N = 2,963; M30: January 2017–December 2025, N = 21,942; H1 and H4: January 2014–December 2024, N = 13,523 and 5,410). The 1-hour and 4-hour series available from the data vendor end on December 9, 2024, whereas the daily and 30-minute series extend to December 12, 2025.</w:t>
       </w:r>
     </w:p>
     <w:p>
@@ -1292,7 +1228,7 @@
         <w:rPr>
           <w:rFonts w:hint="cs"/>
         </w:rPr>
-        <w:t xml:space="preserve">Regime dependence is evaluated under two definitions based on the 20-day rolling standard deviation of VNINDEX returns (Fig. 1).</w:t>
+        <w:t xml:space="preserve">We evaluate regime dependence under two definitions based on the 20-day rolling standard deviation of VNINDEX returns (Fig. 1).</w:t>
       </w:r>
     </w:p>
     <w:p>
@@ -1494,7 +1430,7 @@
         <w:rPr>
           <w:rFonts w:hint="cs"/>
         </w:rPr>
-        <w:t xml:space="preserve">. To preserve long-range dependence and eliminate high-frequency drift, we map </w:t>
+        <w:t xml:space="preserve">. We map </w:t>
       </w:r>
       <w:r>
         <w:t>the</w:t>
@@ -2231,7 +2167,7 @@
         <w:rPr>
           <w:rFonts w:hint="cs"/>
         </w:rPr>
-        <w:t xml:space="preserve">Both profiles are subsequently partitioned into </w:t>
+        <w:t xml:space="preserve">Both profiles are then partitioned into </w:t>
       </w:r>
       <m:oMath>
         <m:sSub>
@@ -2391,7 +2327,7 @@
         <w:rPr>
           <w:rFonts w:hint="cs"/>
         </w:rPr>
-        <w:t xml:space="preserve">To remove deterministic intraday patterns and local macroeconomic trends that would otherwise spuriously inflate cross-correlations, we fit local polynomial trends </w:t>
+        <w:t xml:space="preserve">Within each segment, we fit local polynomial trends </w:t>
       </w:r>
       <w:r>
         <w:rPr>
@@ -2430,7 +2366,7 @@
         <w:rPr>
           <w:rFonts w:hint="cs"/>
         </w:rPr>
-        <w:t xml:space="preserve"> using ordinary least squares (</w:t>
+        <w:t xml:space="preserve"> using ordinary least squares (OLS; </w:t>
       </w:r>
       <w:r>
         <w:rPr>
@@ -3996,7 +3932,7 @@
         <w:rPr>
           <w:rFonts w:hint="cs"/>
         </w:rPr>
-        <w:t xml:space="preserve"> and render cross-scale estimates directly comparable to classical correlation benchmarks, the DCCA cross-correlation coefficient normalizes the bivariate covariance by the product of univariate root mean square fluctuations:</w:t>
+        <w:t xml:space="preserve"> and make estimates at different scales comparable with ordinary correlations, the DCCA cross-correlation coefficient normalizes the bivariate covariance by the product of univariate root mean square fluctuations:</w:t>
       </w:r>
     </w:p>
     <w:p>
@@ -4758,7 +4694,7 @@
         <w:rPr>
           <w:rFonts w:hint="cs"/>
         </w:rPr>
-        <w:t>First, we define a fundamental capitalization-weighted proxy (</w:t>
+        <w:t xml:space="preserve">First, we define a capitalization-weighted proxy (</w:t>
       </w:r>
       <m:oMath>
         <m:sSub>
@@ -5092,7 +5028,7 @@
         <w:rPr>
           <w:rFonts w:hint="cs"/>
         </w:rPr>
-        <w:t xml:space="preserve">For comparison, we examine a statistically calibrated proxy (P</w:t>
+        <w:t xml:space="preserve">For comparison, we examine a statistically weighted proxy (P</w:t>
       </w:r>
       <w:r>
         <w:rPr>
@@ -5256,7 +5192,7 @@
         <w:rPr>
           <w:rFonts w:hint="cs"/>
         </w:rPr>
-        <w:t xml:space="preserve">. Statistical weights cannot substitute for capitalization weights in nested index systems.</w:t>
+        <w:t xml:space="preserve">. In this nested system, statistical weights are a poor substitute for capitalization weights.</w:t>
       </w:r>
     </w:p>
     <w:p>
@@ -5335,7 +5271,7 @@
         <w:rPr>
           <w:rFonts w:hint="cs"/>
         </w:rPr>
-        <w:t xml:space="preserve"> strictly as an analytical shadow benchmark that isolates inter-tier economic dependence for risk budgeting.</w:t>
+        <w:t xml:space="preserve"> as an analytical shadow benchmark that isolates inter-tier economic dependence for risk budgeting.</w:t>
       </w:r>
     </w:p>
     <w:p>
@@ -5373,7 +5309,7 @@
         <w:rPr>
           <w:rFonts w:hint="cs"/>
         </w:rPr>
-        <w:t xml:space="preserve">A central econometric question in constructing the capitalization-weighted proxy </w:t>
+        <w:t xml:space="preserve">A key question for the capitalization-weighted proxy </w:t>
       </w:r>
       <w:proofErr w:type="spellStart"/>
       <w:r>
@@ -5415,22 +5351,22 @@
         <w:rPr>
           <w:rFonts w:hint="cs"/>
         </w:rPr>
-        <w:t xml:space="preserve"> over the 2014–2025 sample. In empirical market index administration, </w:t>
-      </w:r>
-      <w:r>
-        <w:t>the</w:t>
+        <w:t xml:space="preserve"> over the 2014–2025 sample. </w:t>
+      </w:r>
+      <w:r>
+        <w:t xml:space="preserve"/>
       </w:r>
       <w:r>
         <w:rPr>
           <w:lang w:val="vi-VN"/>
         </w:rPr>
-        <w:t xml:space="preserve"> </w:t>
-      </w:r>
-      <w:r>
-        <w:rPr>
-          <w:rFonts w:hint="cs"/>
-        </w:rPr>
-        <w:t xml:space="preserve">constituent weights are not mathematically static. The HOSE conducts semi-annual constituent reviews. During these reviews, constituent memberships are refreshed, free-float factors (</w:t>
+        <w:t xml:space="preserve"/>
+      </w:r>
+      <w:r>
+        <w:rPr>
+          <w:rFonts w:hint="cs"/>
+        </w:rPr>
+        <w:t xml:space="preserve">The HOSE conducts semi-annual constituent reviews. During these reviews, constituent memberships are refreshed, free-float factors (</w:t>
       </w:r>
       <m:oMath>
         <m:r>
@@ -5466,7 +5402,7 @@
           <w:rFonts w:hint="cs"/>
         </w:rPr>
         <w:lastRenderedPageBreak/>
-        <w:t>semi-annual rebalancing dates, constituent market capitalizations continuously drift in response to daily relative equity price movements.</w:t>
+        <w:t xml:space="preserve">semi-annual rebalancing dates, constituent market capitalizations drift with relative price movements.</w:t>
       </w:r>
     </w:p>
     <w:p>
@@ -6025,21 +5961,7 @@
         <w:rPr>
           <w:rFonts w:hint="cs"/>
         </w:rPr>
-        <w:t xml:space="preserve">To verify whether the surge in cross-correlation during turbulent market periods represents structural correlation breakdown or mechanical volatility expansion, we implement the conditioning framework proposed by Forbes and </w:t>
-      </w:r>
-      <w:proofErr w:type="spellStart"/>
-      <w:r>
-        <w:rPr>
-          <w:rFonts w:hint="cs"/>
-        </w:rPr>
-        <w:t>Rigobon</w:t>
-      </w:r>
-      <w:proofErr w:type="spellEnd"/>
-      <w:r>
-        <w:rPr>
-          <w:rFonts w:hint="cs"/>
-        </w:rPr>
-        <w:t xml:space="preserve"> (2002).</w:t>
+        <w:t xml:space="preserve">To test whether the rise in cross-correlation during turbulent periods reflects a structural change or volatility expansion, we apply the conditioning framework of Forbes and Rigobon (2002).</w:t>
       </w:r>
     </w:p>
     <w:p>
@@ -6758,7 +6680,7 @@
         <w:rPr>
           <w:rFonts w:hint="cs"/>
         </w:rPr>
-        <w:t xml:space="preserve">As market volatility rises from a calm to a crisis regime, the unadjusted correlation increases toward one purely because the variance of the conditioning market rises, even when the structural slope and residual variance remain constant.</w:t>
+        <w:t xml:space="preserve">As market volatility rises from a calm to a crisis regime, the unadjusted correlation moves toward one because the variance of the conditioning market rises, even when the structural slope and residual variance remain constant.</w:t>
       </w:r>
     </w:p>
     <w:p>
@@ -7217,7 +7139,7 @@
         <w:jc w:val="both"/>
       </w:pPr>
       <w:r>
-        <w:t xml:space="preserve">The identification boundary of the Forbes–Rigobon framework during acute market stress is explicitly recognized: severe downturns on the HOSE often precipitate widespread retail margin calls, driving synchronized liquidations across large-cap and mid-cap equities. This bidirectional selling pressure partially weakens the exogeneity condition, so the adjusted correlation should be interpreted as cross-tier dependence under liquidity-constrained stress rather than as purely unidirectional shock transmission from large caps to mid-caps.</w:t>
+        <w:t xml:space="preserve">The framework has an identification limit under acute stress. Severe downturns on the HOSE can trigger retail margin calls and synchronized liquidations across large-cap and mid-cap stocks. This two-way selling pressure weakens the exogeneity condition, so we interpret the adjusted correlation as cross-tier dependence under liquidity-constrained stress, not as one-way shock transmission from large caps to mid-caps.</w:t>
       </w:r>
     </w:p>
     <w:p>
@@ -7632,7 +7554,7 @@
         <w:rPr>
           <w:rFonts w:hint="cs"/>
         </w:rPr>
-        <w:t xml:space="preserve">We also account for the Epps (1979) effect: at high frequencies (M30, H1), non-synchronous transactions between liquid VN30 large caps and less liquid mid-caps depress the correlation at small timescales (roughly ten bars or fewer). As the timescale increases, aggregation synchronizes price discovery, producing a positive scaling slope that reflects the fading of microstructure frictions combined with gradual information diffusion (Hong and Stein 1999).</w:t>
+        <w:t xml:space="preserve">We also account for the Epps (1979) effect: at high frequencies (M30, H1), non-synchronous transactions between liquid VN30 large caps and less liquid mid-caps depress the correlation at small timescales (roughly ten bars or fewer). As the timescale increases, aggregation synchronizes price discovery and can produce a positive scaling slope; gradual information diffusion (Hong and Stein 1999) can have the same effect. Section 3.7 tests whether such slopes are present.</w:t>
       </w:r>
     </w:p>
     <w:bookmarkEnd w:id="77"/>
@@ -11981,7 +11903,7 @@
         <w:rPr>
           <w:rFonts w:hint="cs"/>
         </w:rPr>
-        <w:t xml:space="preserve"> (0.0124) and VN30 (0.0121) and lowest for VNINDEX (0.0115), consistent with the diversification of the broad index. Across intraday intervals, the standard deviation increases with bar length. All series are negatively skewed, and the Jarque–Bera statistics rise from 3,202–3,898 at 1D to 887,934–1,310,762 at M30, driven by extreme kurtosis (above 33 at M30). This pronounced leptokurtosis supports the use of DCCA and MF-DCCA, which do not rely on Gaussian assumptions.</w:t>
+        <w:t xml:space="preserve"> (0.0124) and VN30 (0.0121) and lowest for VNINDEX (0.0115), consistent with the diversification of the broad index. Across intraday intervals, the standard deviation increases with bar length. All series are negatively skewed, and the Jarque–Bera statistics rise from 3,202–3,898 at 1D to 887,934–1,310,762 at M30, driven by extreme kurtosis (above 33 at M30). This leptokurtosis supports the use of DCCA and MF-DCCA, which do not rely on Gaussian assumptions.</w:t>
       </w:r>
     </w:p>
     <w:p>
@@ -12012,7 +11934,7 @@
         <w:jc w:val="both"/>
       </w:pPr>
       <w:r>
-        <w:t xml:space="preserve">Table 2 presents the average DCCA cross-correlation coefficients across trading frequencies, allowing cross-index dependence to be compared across temporal horizons and constituent structures.</w:t>
+        <w:t xml:space="preserve">Table 2 reports the average DCCA cross-correlation coefficients by trading frequency for the nested pairs and for the purged pair.</w:t>
       </w:r>
     </w:p>
     <w:p>
@@ -13201,7 +13123,7 @@
         <w:rPr>
           <w:rFonts w:hint="cs"/>
         </w:rPr>
-        <w:t xml:space="preserve">–VN30 produces a markedly lower correlation of 0.883–0.892, a gap of 0.086–0.096 correlation points whose bootstrap intervals (0.060 to 0.126 across frequencies) exclude zero. The purged correlation nevertheless remains high, so the overlap inflates rather than creates the co-movement. Averages in the synchronized window (Panel A) and the full sample (Panel B) differ by at most 0.007 for every series.</w:t>
+        <w:t xml:space="preserve">–VN30 has a lower correlation of 0.883–0.892, a gap of 0.086–0.096 correlation points whose bootstrap intervals (0.060 to 0.126 across frequencies) exclude zero. The purged correlation nevertheless remains high, so the overlap inflates rather than creates the co-movement. Averages in the synchronized window (Panel A) and the full sample (Panel B) differ by at most 0.007 for every series.</w:t>
       </w:r>
     </w:p>
     <w:p>
@@ -13212,19 +13134,7 @@
         <w:rPr>
           <w:rFonts w:hint="cs"/>
         </w:rPr>
-        <w:t>Figure 2 plots the multiscale DCCA trajectories across all four trading frequencies, directly contrasting the purged mid-cap proxy with</w:t>
-      </w:r>
-      <w:r>
-        <w:rPr>
-          <w:lang w:val="vi-VN"/>
-        </w:rPr>
-        <w:t xml:space="preserve"> the</w:t>
-      </w:r>
-      <w:r>
-        <w:rPr>
-          <w:rFonts w:hint="cs"/>
-        </w:rPr>
-        <w:t xml:space="preserve"> nested index pairs.</w:t>
+        <w:t xml:space="preserve">Figure 2 plots the DCCA coefficient against the timescale at all four trading frequencies for the purged mid-cap proxy and the nested index pairs.</w:t>
       </w:r>
     </w:p>
     <w:p>
@@ -13397,7 +13307,7 @@
         <w:rPr>
           <w:rFonts w:hint="cs"/>
         </w:rPr>
-        <w:t xml:space="preserve">Because the number of segments shrinks as the timescale grows, the DCCA coefficient becomes unreliable at large timescales. For each sample size, we simulate pairs of Gaussian white-noise series with known correlations of −0.3, 0, 0.3, 0.5, 0.7 and 0.9 (167 replications each, 1,002 per frequency) and compute the mean absolute estimation error on 40 log-spaced scales. The reliability threshold is the largest scale below the first scale at which the worst-case error exceeds 0.05. Because returns are heavy-tailed and volatility-clustered, we repeat the calibration with GARCH(1,1) surrogates driven by Student-t innovations with five degrees of freedom. Table 3 reports both thresholds.</w:t>
+        <w:t xml:space="preserve">Because the number of segments shrinks as the timescale grows, the DCCA coefficient becomes unreliable at large timescales. For each sample size, we simulate pairs of Gaussian white-noise series with known correlations of −0.3, 0, 0.3, 0.5, 0.7 and 0.9 (167 replications each, 1,002 per frequency) and compute the mean absolute estimation error on 40 log-spaced scales. The reliability threshold is the largest scale below the first scale at which the worst-case error exceeds 0.05. Because returns are heavy-tailed and volatility-clustered, we repeat the calibration with generalized autoregressive conditional heteroskedasticity, GARCH(1,1), surrogates driven by Student-t innovations with five degrees of freedom. Table 3 reports both thresholds.</w:t>
       </w:r>
     </w:p>
     <w:p>
@@ -14140,7 +14050,7 @@
         <w:jc w:val="both"/>
       </w:pPr>
       <w:r>
-        <w:t xml:space="preserve">The heavy-tailed thresholds are markedly smaller, but averaging over them leaves the results intact (nested pairs 0.975–0.979; P</w:t>
+        <w:t xml:space="preserve">The heavy-tailed thresholds are smaller, but averaging over them leaves the results intact (nested pairs 0.975–0.979; P</w:t>
       </w:r>
       <w:r>
         <w:rPr>
@@ -14410,7 +14320,7 @@
         <w:rPr>
           <w:rFonts w:hint="cs"/>
         </w:rPr>
-        <w:t xml:space="preserve">Table 4 presents the unadjusted and Forbes–Rigobon conditioned correlations to assess whether the surge in co-movement during market turmoil reflects a structural change or volatility expansion.</w:t>
+        <w:t xml:space="preserve">Table 4 reports the unadjusted and Forbes–Rigobon conditioned correlations for the chronological and rolling-volatility regimes.</w:t>
       </w:r>
     </w:p>
     <w:p>
@@ -16759,7 +16669,7 @@
         <w:rPr>
           <w:rFonts w:hint="cs"/>
         </w:rPr>
-        <w:t xml:space="preserve">All figures use regime-specific volatilities and Pearson correlations in the exact expression, so the static and regime-specific cases differ only in the correlation. Evaluating this relative variance error across regimes reveals a sharp distinction between tradable cash portfolios and underlying factor exposures.</w:t>
+        <w:t xml:space="preserve">All figures use regime-specific volatilities and Pearson correlations in the exact expression, so the static and regime-specific cases differ only in the correlation. The errors differ between tradable cash portfolios and factor exposures.</w:t>
       </w:r>
     </w:p>
     <w:p>
@@ -16781,7 +16691,7 @@
         <w:rPr>
           <w:rFonts w:hint="cs"/>
         </w:rPr>
-        <w:t xml:space="preserve">Conversely, for the mid-cap factor exposure, static correlation models produce material distortion. The static model overstates portfolio variance by 2.23% (95% interval 0.91 to 3.94) in the chronological calm regime and by 9.38% (6.20 to 13.46) in the rolling low-volatility regime, whose quietest days exaggerate the effect. Because P</w:t>
+        <w:t xml:space="preserve">For the mid-cap factor exposure, the errors are larger. The static model overstates portfolio variance by 2.23% (95% interval 0.91 to 3.94) in the chronological calm regime and by 9.38% (6.20 to 13.46) in the rolling low-volatility regime, whose quietest days exaggerate the effect. Because P</w:t>
       </w:r>
       <w:r>
         <w:rPr>
@@ -16805,7 +16715,7 @@
         <w:rPr>
           <w:rFonts w:hint="cs"/>
         </w:rPr>
-        <w:t xml:space="preserve">In the turbulent regime, the static model understates portfolio variance by 1.84% (chronological) and 2.07% (rolling). Although modest, these errors arise when the variance of the underlying assets has risen by 221% to 706% (Table 4). All regimes are identified ex post, so the figures measure the in-sample cost of ignoring regime dependence rather than the performance of a real-time risk-budgeting rule.</w:t>
+        <w:t xml:space="preserve">In the turbulent regime, the static model understates portfolio variance by 1.84% (chronological) and 2.07% (rolling). Although modest, these errors arise when the variance of VN30 returns has risen by 221% to 706% (Table 4). All regimes are identified ex post, so the figures measure the in-sample cost of ignoring regime dependence rather than the performance of a real-time risk-budgeting rule.</w:t>
       </w:r>
     </w:p>
     <w:p>
@@ -16842,7 +16752,7 @@
         <w:rPr>
           <w:rFonts w:hint="cs"/>
         </w:rPr>
-        <w:t xml:space="preserve">Table 5 presents the scaling slopes of the DCCA coefficients at the M30 frequency over the full and reliable scale ranges, with block-bootstrap intervals, to quantify the sensitivity of cross-asset co-movement to the investment horizon.</w:t>
+        <w:t xml:space="preserve">Table 5 reports the scaling slopes of the DCCA coefficients at the M30 frequency over the full and reliable scale ranges, with block-bootstrap intervals.</w:t>
       </w:r>
     </w:p>
     <w:p>
@@ -18042,7 +17952,7 @@
         <w:rPr>
           <w:rFonts w:hint="cs"/>
         </w:rPr>
-        <w:t xml:space="preserve">The resampling results separate three patterns:</w:t>
+        <w:t xml:space="preserve">The resampling results show three patterns.</w:t>
       </w:r>
     </w:p>
     <w:p>
@@ -18053,7 +17963,7 @@
         <w:rPr>
           <w:rFonts w:hint="cs"/>
         </w:rPr>
-        <w:t xml:space="preserve">First, for the fully nested pair VN30–VN100, the slope is essentially zero in both ranges: because VN30 constituents dominate VN100 capitalization, their mechanical co-movement is invariant to the timescale.</w:t>
+        <w:t xml:space="preserve">First, for the nested pair VN30–VN100, the slope is close to zero in both ranges: because VN30 constituents dominate VN100 capitalization, their mechanical co-movement is invariant to the timescale.</w:t>
       </w:r>
     </w:p>
     <w:p>
@@ -18093,30 +18003,13 @@
     </w:p>
     <w:p>
       <w:pPr>
-        <w:spacing w:line="300" w:lineRule="auto"/>
         <w:jc w:val="both"/>
-        <w:rPr>
-          <w:b/>
-          <w:bCs/>
-          <w:lang w:val="vi-VN"/>
-        </w:rPr>
-      </w:pPr>
-      <w:r>
-        <w:rPr>
-          <w:rFonts w:hint="cs"/>
-          <w:b/>
-          <w:bCs/>
-        </w:rPr>
-        <w:t>Economic Mechanisms and Identification Boundaries</w:t>
-      </w:r>
-      <w:r>
-        <w:rPr>
-          <w:rFonts w:hint="cs"/>
-          <w:b/>
-          <w:bCs/>
-          <w:lang w:val="vi-VN"/>
-        </w:rPr>
-        <w:t>:</w:t>
+      </w:pPr>
+      <w:r>
+        <w:rPr>
+          <w:rFonts w:hint="cs"/>
+        </w:rPr>
+        <w:t xml:space="preserve">The horizon dependence of the broad-market pairs is consistent with two complementary mechanisms. Under the Epps (1979) effect, non-synchronous trading in less liquid constituents dampens correlations over the shortest intervals, roughly the first ten bars, and temporal aggregation removes this dampening. Beyond that range, gradual information diffusion (Hong and Stein 1999) can sustain a further rise if prices of different constituents adjust to common news at different speeds. That the purged mid-cap series shows no significant rise suggests that these effects are weaker than index-level sampling noise once the overlap is removed.</w:t>
       </w:r>
     </w:p>
     <w:p>
@@ -18124,18 +18017,7 @@
         <w:jc w:val="both"/>
       </w:pPr>
       <w:r>
-        <w:rPr>
-          <w:rFonts w:hint="cs"/>
-        </w:rPr>
-        <w:t xml:space="preserve">The horizon dependence of the broad-market pairs is consistent with two complementary mechanisms. Under the Epps (1979) effect, non-synchronous trading in less liquid constituents dampens correlations over the shortest intervals, roughly the first ten bars, and temporal aggregation removes this dampening. Beyond that range, gradual information diffusion (Hong and Stein 1999) can sustain a further rise if prices of different constituents adjust to common news at different speeds. That the purged mid-cap series shows no significant rise suggests that these effects are weaker than index-level sampling noise once the overlap is removed.</w:t>
-      </w:r>
-    </w:p>
-    <w:p>
-      <w:pPr>
-        <w:jc w:val="both"/>
-      </w:pPr>
-      <w:r>
-        <w:t xml:space="preserve">A critical identification boundary arises here: microstructure frictions and gradual information diffusion are observationally equivalent in index-level closing data. Disentangling them would require tick-by-tick order-book data and firm-level news timestamps, which lie beyond the scope of this study.</w:t>
+        <w:t xml:space="preserve">Index-level closing data cannot distinguish microstructure frictions from gradual information diffusion; separating the two would require tick-by-tick order-book data and firm-level news timestamps.</w:t>
       </w:r>
     </w:p>
     <w:bookmarkEnd w:id="105"/>
@@ -20512,7 +20394,7 @@
         <w:rPr>
           <w:rFonts w:hint="cs"/>
         </w:rPr>
-        <w:t xml:space="preserve"> correlation remains at least 0.052 below the 0.977 average of the nested daily pairs, and the raw crisis tightening (0.053–0.106) remains modest relative to the accompanying volatility expansion.</w:t>
+        <w:t xml:space="preserve"> correlation remains at least 0.05 below the 0.977 average of the nested daily pairs, and the raw crisis tightening (0.053–0.106) remains modest relative to the accompanying volatility expansion.</w:t>
       </w:r>
     </w:p>
     <w:p>
@@ -20570,7 +20452,7 @@
         <w:rPr>
           <w:rFonts w:hint="cs"/>
         </w:rPr>
-        <w:t xml:space="preserve">This study econometrically examines multiscale cross-correlation dynamics and constituent overlap distortion among nested equity benchmarks in Vietnam. By deploying detrended cross-correlation analysis and its multifractal extension across intraday and daily trading horizons, the mechanical influence of shared capitalization is disentangled from genuine economic co-movement.</w:t>
+        <w:t xml:space="preserve">We examine multiscale cross-correlations and constituent overlap among nested equity benchmarks in Vietnam. Using DCCA and MF-DCCA on intraday and daily data, we separate the effect of shared capitalization from economic co-movement.</w:t>
       </w:r>
     </w:p>
     <w:p>
@@ -20581,7 +20463,7 @@
         <w:rPr>
           <w:rFonts w:hint="cs"/>
         </w:rPr>
-        <w:t xml:space="preserve">The empirical analysis provides three core insights:</w:t>
+        <w:t xml:space="preserve">Three findings stand out.</w:t>
       </w:r>
     </w:p>
     <w:p>
@@ -20597,7 +20479,7 @@
         <w:rPr>
           <w:rFonts w:hint="cs"/>
         </w:rPr>
-        <w:t xml:space="preserve">First, index pairs that embed large-cap constituents within broader benchmarks exhibit cross-correlations inflated by index engineering. Purging shared constituent capitalization through a market-weighted proxy lowers the correlation by about 0.09, a robust gap, although the purged co-movement remains high. Horizon dependence is confined to broad-market pairs at the shortest intraday frequencies; the purged mid-cap correlation is statistically flat across horizons.</w:t>
+        <w:t xml:space="preserve">First, index pairs that embed large-cap constituents within broader benchmarks exhibit cross-correlations inflated by index engineering. Purging shared constituent capitalization through a market-weighted proxy lowers the correlation by about 0.09, a gap whose bootstrap intervals exclude zero, although the purged co-movement remains high. Horizon dependence is confined to broad-market pairs at the shortest intraday frequencies; the purged mid-cap correlation is statistically flat across horizons.</w:t>
       </w:r>
     </w:p>
     <w:p>
@@ -20629,7 +20511,7 @@
         <w:rPr>
           <w:rFonts w:hint="cs"/>
         </w:rPr>
-        <w:t xml:space="preserve">Third, cash portfolios composed of nested parent–child indices experience negligible variance misstatement, whereas static correlations materially misstate the risk of mid-cap factor exposures: in-sample, they overstate variance by 2.2–9.4% in calm regimes and understate it by about 2% during crises.</w:t>
+        <w:t xml:space="preserve">Third, cash portfolios composed of nested parent–child indices experience negligible variance misstatement, whereas static correlations misstate the risk of mid-cap factor exposures: in-sample, they overstate variance by 2.2–9.4% in calm regimes and understate it by about 2% during crises.</w:t>
       </w:r>
     </w:p>
     <w:p>
@@ -20689,7 +20571,7 @@
         <w:rPr>
           <w:rFonts w:hint="cs"/>
         </w:rPr>
-        <w:t xml:space="preserve">For institutional portfolio management, allocators investing in Vietnam should recognize that blending large-cap and broad-market parent-child indices offers negligible diversification benefits. When constructing multi-capitalization strategies, risk managers should replace static correlation assumptions with volatility-regime-conditioned covariance frameworks that recognize both overstated risk in tranquil periods and elevated co-movement during market distress.</w:t>
+        <w:t xml:space="preserve">For institutional portfolio management, allocators in Vietnam gain little diversification from blending large-cap and broad-market parent–child indices. When constructing multi-capitalization strategies, risk managers should replace static correlation assumptions with volatility-regime-conditioned covariance frameworks that recognize both overstated risk in tranquil periods and elevated co-movement during market distress.</w:t>
       </w:r>
     </w:p>
     <w:p>
@@ -20705,7 +20587,7 @@
         <w:rPr>
           <w:rFonts w:hint="cs"/>
         </w:rPr>
-        <w:t xml:space="preserve">Regarding index architecture and product innovation, stock exchanges and index providers across emerging Southeast Asian markets should prioritize the development and promotion of standalone, non-overlapping segment benchmarks. On the Ho Chi Minh City Stock Exchange, expanding exchange-traded funds that track standalone benchmarks such as VNMIDCAP (VN70) would provide transparent building blocks for institutional factor allocation, helping allocators avoid the hidden overlaps inherent in headline index blends.</w:t>
+        <w:t xml:space="preserve">For index design, the HOSE and index providers in Vietnam could promote standalone, non-overlapping segment benchmarks. Exchange-traded funds that track the VNMIDCAP (VN70) index would give institutional investors a mid-cap building block without the hidden overlap of headline index blends.</w:t>
       </w:r>
     </w:p>
     <w:p>
@@ -20721,7 +20603,7 @@
         <w:rPr>
           <w:rFonts w:hint="cs"/>
         </w:rPr>
-        <w:t xml:space="preserve">Finally, for market development and risk mitigation, expanding derivative product suites beyond large-cap index futures to include mid-cap and sector contracts could enhance market completeness. Providing tradeable hedging instruments across multiple capitalization tiers enables institutional investors to manage cross-tier exposure without destabilizing underlying cash equity positions during periods of market stress.</w:t>
+        <w:t xml:space="preserve">Finally, futures on mid-cap and sector indices, in addition to the existing VN30 futures, would let institutional investors hedge cross-tier exposure without selling cash positions during market stress.</w:t>
       </w:r>
     </w:p>
     <w:p>
@@ -20815,7 +20697,7 @@
         <w:rPr>
           <w:rFonts w:hint="cs"/>
         </w:rPr>
-        <w:t xml:space="preserve">Nested equity indices on the HOSE overstate the co-movement between large caps and the rest of the market because they share constituents. A capitalization-weighted decomposition removes about 0.09 of correlation, the remaining cross-tier dependence shows no structural increase in crises once volatility is accounted for, and static correlations misstate the risk of mid-cap exposures by amounts that depend on the volatility regime. Independent mid-cap benchmarks and volatility-regime-conditioned risk budgets are the natural responses.</w:t>
+        <w:t xml:space="preserve">Nested equity indices on the HOSE overstate the co-movement between large caps and the rest of the market because they share constituents. A capitalization-weighted decomposition removes about 0.09 of correlation, the remaining cross-tier dependence shows no structural increase in crises once volatility is accounted for, and static correlations misstate the risk of mid-cap exposures by amounts that depend on the volatility regime. These results favor independent mid-cap benchmarks and risk budgets that condition on the volatility regime.</w:t>
       </w:r>
     </w:p>
     <w:p>

</xml_diff>